<commit_message>
Applicant PDF-only and upload root hardening
This change enforces PDF-only downloads for applicants while keeping admin DOCX/PDF access, and consolidates upload paths under a single app.upload.dir root. It also folds the supervisor evaluation into position document 1, preserves late office fields after applicant signing, adds startup storage checks for missing signed/doc files, and updates deploy backup logic to protect uploads and the current jar before release.
</commit_message>
<xml_diff>
--- a/HRCP-KKU-Academic/src/main/resources/templates/docx/Phase2/p2doc_1.docx
+++ b/HRCP-KKU-Academic/src/main/resources/templates/docx/Phase2/p2doc_1.docx
@@ -3134,6 +3134,3048 @@
         </w:rPr>
         <w:t xml:space="preserve">     วันที่ {{sign_date}}</w:t>
       </w:r>
+    </w:p>
+    <w:p>
+      <w:pPr>
+        <w:rPr>
+          <w:rFonts w:ascii="TH Sarabun New" w:hAnsi="TH Sarabun New" w:cs="TH Sarabun New"/>
+          <w:sz w:val="32"/>
+          <w:szCs w:val="32"/>
+          <w:cs/>
+        </w:rPr>
+      </w:pPr>
+      <w:r>
+        <w:rPr>
+          <w:rFonts w:ascii="TH Sarabun New" w:hAnsi="TH Sarabun New" w:cs="TH Sarabun New"/>
+          <w:sz w:val="32"/>
+          <w:szCs w:val="32"/>
+          <w:cs/>
+        </w:rPr>
+        <w:br w:type="page"/>
+      </w:r>
+    </w:p>
+    <w:p>
+      <w:pPr>
+        <w:spacing w:after="0" w:line="240" w:lineRule="auto"/>
+        <w:rPr>
+          <w:rFonts w:ascii="TH Sarabun New" w:hAnsi="TH Sarabun New" w:cs="TH Sarabun New"/>
+          <w:b/>
+          <w:bCs/>
+          <w:sz w:val="32"/>
+          <w:szCs w:val="32"/>
+        </w:rPr>
+      </w:pPr>
+      <w:r>
+        <w:rPr>
+          <w:rFonts w:ascii="TH Sarabun New" w:eastAsiaTheme="minorHAnsi" w:hAnsi="TH Sarabun New" w:cs="TH Sarabun New"/>
+          <w:b/>
+          <w:bCs/>
+          <w:sz w:val="32"/>
+          <w:szCs w:val="32"/>
+          <w:cs/>
+        </w:rPr>
+        <w:lastRenderedPageBreak/>
+        <w:t>ส่วนที่</w:t>
+      </w:r>
+      <w:r>
+        <w:rPr>
+          <w:rFonts w:ascii="TH Sarabun New" w:eastAsiaTheme="minorHAnsi" w:hAnsi="TH Sarabun New" w:cs="TH Sarabun New"/>
+          <w:b/>
+          <w:bCs/>
+          <w:sz w:val="32"/>
+          <w:szCs w:val="32"/>
+          <w:cs/>
+        </w:rPr>
+        <w:t xml:space="preserve"> </w:t>
+      </w:r>
+      <w:r>
+        <w:rPr>
+          <w:rFonts w:ascii="TH Sarabun New" w:eastAsiaTheme="minorHAnsi" w:hAnsi="TH Sarabun New" w:cs="TH Sarabun New"/>
+          <w:b/>
+          <w:bCs/>
+          <w:sz w:val="32"/>
+          <w:szCs w:val="32"/>
+          <w:cs/>
+        </w:rPr>
+        <w:t>๒</w:t>
+      </w:r>
+      <w:r>
+        <w:rPr>
+          <w:rFonts w:ascii="TH Sarabun New" w:eastAsiaTheme="minorHAnsi" w:hAnsi="TH Sarabun New" w:cs="TH Sarabun New"/>
+          <w:b/>
+          <w:bCs/>
+          <w:sz w:val="32"/>
+          <w:szCs w:val="32"/>
+          <w:cs/>
+        </w:rPr>
+        <w:tab/>
+        <w:t>แบบประเมินคุณสมบัติโดยผู้บังคับบัญชา</w:t>
+      </w:r>
+    </w:p>
+    <w:p>
+      <w:pPr>
+        <w:spacing w:after="0" w:line="240" w:lineRule="auto"/>
+        <w:rPr>
+          <w:rFonts w:ascii="TH Sarabun New" w:hAnsi="TH Sarabun New" w:cs="TH Sarabun New"/>
+          <w:sz w:val="32"/>
+          <w:szCs w:val="32"/>
+        </w:rPr>
+      </w:pPr>
+    </w:p>
+    <w:p>
+      <w:pPr>
+        <w:spacing w:after="0" w:line="240" w:lineRule="auto"/>
+        <w:jc w:val="center"/>
+        <w:rPr>
+          <w:rFonts w:ascii="TH Sarabun New" w:hAnsi="TH Sarabun New" w:cs="TH Sarabun New"/>
+          <w:sz w:val="32"/>
+          <w:szCs w:val="32"/>
+        </w:rPr>
+      </w:pPr>
+      <w:r>
+        <w:rPr>
+          <w:rFonts w:ascii="TH Sarabun New" w:eastAsiaTheme="minorHAnsi" w:hAnsi="TH Sarabun New" w:cs="TH Sarabun New"/>
+          <w:sz w:val="32"/>
+          <w:szCs w:val="32"/>
+          <w:cs/>
+        </w:rPr>
+        <w:t xml:space="preserve">แบบประเมินแต่งตั้งให้ดำรงตำแหน่ง {{target_position}}</w:t>
+      </w:r>
+    </w:p>
+    <w:p>
+      <w:pPr>
+        <w:spacing w:after="0" w:line="240" w:lineRule="auto"/>
+        <w:jc w:val="center"/>
+        <w:rPr>
+          <w:rFonts w:ascii="TH Sarabun New" w:hAnsi="TH Sarabun New" w:cs="TH Sarabun New"/>
+          <w:sz w:val="32"/>
+          <w:szCs w:val="32"/>
+        </w:rPr>
+      </w:pPr>
+      <w:r>
+        <w:rPr>
+          <w:rFonts w:ascii="TH Sarabun New" w:eastAsiaTheme="minorHAnsi" w:hAnsi="TH Sarabun New" w:cs="TH Sarabun New"/>
+          <w:sz w:val="32"/>
+          <w:szCs w:val="32"/>
+          <w:cs/>
+        </w:rPr>
+        <w:t xml:space="preserve">(โดยวิธี{{method}}) </w:t>
+      </w:r>
+    </w:p>
+    <w:p>
+      <w:pPr>
+        <w:spacing w:after="0" w:line="240" w:lineRule="auto"/>
+        <w:jc w:val="center"/>
+        <w:rPr>
+          <w:rFonts w:ascii="TH Sarabun New" w:hAnsi="TH Sarabun New" w:cs="TH Sarabun New"/>
+          <w:sz w:val="32"/>
+          <w:szCs w:val="32"/>
+        </w:rPr>
+      </w:pPr>
+      <w:r>
+        <w:rPr>
+          <w:rFonts w:ascii="TH Sarabun New" w:eastAsiaTheme="minorHAnsi" w:hAnsi="TH Sarabun New" w:cs="TH Sarabun New"/>
+          <w:sz w:val="32"/>
+          <w:szCs w:val="32"/>
+          <w:cs/>
+        </w:rPr>
+        <w:t xml:space="preserve">ในสาขาวิชา {{major}}  (รหัส {{major_code}}) </w:t>
+      </w:r>
+    </w:p>
+    <w:p>
+      <w:pPr>
+        <w:spacing w:after="0" w:line="240" w:lineRule="auto"/>
+        <w:jc w:val="center"/>
+        <w:rPr>
+          <w:rFonts w:ascii="TH Sarabun New" w:hAnsi="TH Sarabun New" w:cs="TH Sarabun New"/>
+          <w:sz w:val="32"/>
+          <w:szCs w:val="32"/>
+        </w:rPr>
+      </w:pPr>
+      <w:r>
+        <w:rPr>
+          <w:rFonts w:ascii="TH Sarabun New" w:eastAsiaTheme="minorHAnsi" w:hAnsi="TH Sarabun New" w:cs="TH Sarabun New"/>
+          <w:sz w:val="32"/>
+          <w:szCs w:val="32"/>
+          <w:cs/>
+        </w:rPr>
+        <w:t xml:space="preserve">อนุสาขาวิชา {{sub_major}}  (รหัส {{sub_major_code}}) </w:t>
+      </w:r>
+    </w:p>
+    <w:p>
+      <w:pPr>
+        <w:spacing w:after="0" w:line="240" w:lineRule="auto"/>
+        <w:jc w:val="center"/>
+        <w:rPr>
+          <w:rFonts w:ascii="TH Sarabun New" w:hAnsi="TH Sarabun New" w:cs="TH Sarabun New"/>
+          <w:sz w:val="32"/>
+          <w:szCs w:val="32"/>
+        </w:rPr>
+      </w:pPr>
+      <w:r>
+        <w:rPr>
+          <w:rFonts w:ascii="TH Sarabun New" w:eastAsiaTheme="minorHAnsi" w:hAnsi="TH Sarabun New" w:cs="TH Sarabun New"/>
+          <w:sz w:val="32"/>
+          <w:szCs w:val="32"/>
+          <w:cs/>
+        </w:rPr>
+        <w:t xml:space="preserve">ของ {{title}}{{applicant_name}}</w:t>
+      </w:r>
+    </w:p>
+    <w:p>
+      <w:pPr>
+        <w:spacing w:after="0" w:line="240" w:lineRule="auto"/>
+        <w:jc w:val="center"/>
+        <w:rPr>
+          <w:rFonts w:ascii="TH Sarabun New" w:hAnsi="TH Sarabun New" w:cs="TH Sarabun New"/>
+          <w:sz w:val="32"/>
+          <w:szCs w:val="32"/>
+        </w:rPr>
+      </w:pPr>
+      <w:r>
+        <w:rPr>
+          <w:rFonts w:ascii="TH Sarabun New" w:eastAsiaTheme="minorHAnsi" w:hAnsi="TH Sarabun New" w:cs="TH Sarabun New"/>
+          <w:sz w:val="32"/>
+          <w:szCs w:val="32"/>
+          <w:cs/>
+        </w:rPr>
+        <w:t xml:space="preserve">สังกัดภาค /สาขาวิชา {{department}}</w:t>
+      </w:r>
+    </w:p>
+    <w:p>
+      <w:pPr>
+        <w:spacing w:after="0" w:line="240" w:lineRule="auto"/>
+        <w:jc w:val="center"/>
+        <w:rPr>
+          <w:rFonts w:ascii="TH Sarabun New" w:hAnsi="TH Sarabun New" w:cs="TH Sarabun New"/>
+          <w:sz w:val="32"/>
+          <w:szCs w:val="32"/>
+        </w:rPr>
+      </w:pPr>
+      <w:r>
+        <w:rPr>
+          <w:rFonts w:ascii="TH Sarabun New" w:eastAsiaTheme="minorHAnsi" w:hAnsi="TH Sarabun New" w:cs="TH Sarabun New"/>
+          <w:sz w:val="32"/>
+          <w:szCs w:val="32"/>
+          <w:cs/>
+        </w:rPr>
+        <w:t xml:space="preserve">คณะ {{faculty}} มหาวิทยาลัย{{university}}</w:t>
+      </w:r>
+    </w:p>
+    <w:p>
+      <w:pPr>
+        <w:spacing w:after="0" w:line="240" w:lineRule="auto"/>
+        <w:jc w:val="center"/>
+        <w:rPr>
+          <w:rFonts w:ascii="TH Sarabun New" w:hAnsi="TH Sarabun New" w:cs="TH Sarabun New"/>
+          <w:sz w:val="32"/>
+          <w:szCs w:val="32"/>
+        </w:rPr>
+      </w:pPr>
+      <w:r>
+        <w:rPr>
+          <w:rFonts w:ascii="TH Sarabun New" w:eastAsiaTheme="minorHAnsi" w:hAnsi="TH Sarabun New" w:cs="TH Sarabun New"/>
+          <w:sz w:val="32"/>
+          <w:szCs w:val="32"/>
+          <w:cs/>
+        </w:rPr>
+        <w:t>--------------------------------</w:t>
+      </w:r>
+    </w:p>
+    <w:p>
+      <w:pPr>
+        <w:spacing w:after="0" w:line="240" w:lineRule="auto"/>
+        <w:rPr>
+          <w:rFonts w:ascii="TH Sarabun New" w:hAnsi="TH Sarabun New" w:cs="TH Sarabun New"/>
+          <w:sz w:val="32"/>
+          <w:szCs w:val="32"/>
+        </w:rPr>
+      </w:pPr>
+    </w:p>
+    <w:p>
+      <w:pPr>
+        <w:spacing w:after="0" w:line="240" w:lineRule="auto"/>
+        <w:ind w:firstLine="1418"/>
+        <w:jc w:val="thaiDistribute"/>
+        <w:rPr>
+          <w:rFonts w:ascii="TH Sarabun New" w:hAnsi="TH Sarabun New" w:cs="TH Sarabun New"/>
+          <w:sz w:val="32"/>
+          <w:szCs w:val="32"/>
+        </w:rPr>
+      </w:pPr>
+      <w:r>
+        <w:rPr>
+          <w:rFonts w:ascii="TH Sarabun New" w:eastAsiaTheme="minorHAnsi" w:hAnsi="TH Sarabun New" w:cs="TH Sarabun New"/>
+          <w:sz w:val="32"/>
+          <w:szCs w:val="32"/>
+          <w:cs/>
+        </w:rPr>
+        <w:t xml:space="preserve">ได้ตรวจสอบคุณสมบัติเฉพาะสำหรับตำแหน่ง {{target_position}} แล้วเห็นว่า {{title}}{{applicant_name}}</w:t>
+      </w:r>
+    </w:p>
+    <w:p>
+      <w:pPr>
+        <w:spacing w:after="0" w:line="240" w:lineRule="auto"/>
+        <w:jc w:val="thaiDistribute"/>
+        <w:rPr>
+          <w:rFonts w:ascii="TH Sarabun New" w:hAnsi="TH Sarabun New" w:cs="TH Sarabun New"/>
+          <w:sz w:val="32"/>
+          <w:szCs w:val="32"/>
+        </w:rPr>
+      </w:pPr>
+      <w:r>
+        <w:rPr>
+          <w:rFonts w:ascii="TH Sarabun New" w:eastAsiaTheme="minorHAnsi" w:hAnsi="TH Sarabun New" w:cs="TH Sarabun New"/>
+          <w:sz w:val="32"/>
+          <w:szCs w:val="32"/>
+          <w:cs/>
+        </w:rPr>
+        <w:t xml:space="preserve">เป็นผู้มีคุณสมบัติ {{qualification_status}} ตามหลักเกณฑ์ที่ มหาวิทยาลัยกำหนด</w:t>
+      </w:r>
+    </w:p>
+    <w:p>
+      <w:pPr>
+        <w:spacing w:after="0" w:line="240" w:lineRule="auto"/>
+        <w:rPr>
+          <w:rFonts w:ascii="TH Sarabun New" w:hAnsi="TH Sarabun New" w:cs="TH Sarabun New"/>
+          <w:sz w:val="32"/>
+          <w:szCs w:val="32"/>
+        </w:rPr>
+      </w:pPr>
+    </w:p>
+    <w:p>
+      <w:pPr>
+        <w:spacing w:after="0" w:line="240" w:lineRule="auto"/>
+        <w:jc w:val="center"/>
+        <w:rPr>
+          <w:rFonts w:ascii="TH Sarabun New" w:hAnsi="TH Sarabun New" w:cs="TH Sarabun New"/>
+          <w:sz w:val="32"/>
+          <w:szCs w:val="32"/>
+        </w:rPr>
+      </w:pPr>
+      <w:r>
+        <w:rPr>
+          <w:rFonts w:ascii="TH Sarabun New" w:eastAsiaTheme="minorHAnsi" w:hAnsi="TH Sarabun New" w:cs="TH Sarabun New"/>
+          <w:sz w:val="32"/>
+          <w:szCs w:val="32"/>
+          <w:cs/>
+        </w:rPr>
+        <w:t>ลงชื่อ...................................................</w:t>
+      </w:r>
+    </w:p>
+    <w:p>
+      <w:pPr>
+        <w:spacing w:after="0" w:line="240" w:lineRule="auto"/>
+        <w:jc w:val="center"/>
+        <w:rPr>
+          <w:rFonts w:ascii="TH Sarabun New" w:hAnsi="TH Sarabun New" w:cs="TH Sarabun New"/>
+          <w:sz w:val="32"/>
+          <w:szCs w:val="32"/>
+        </w:rPr>
+      </w:pPr>
+      <w:r>
+        <w:rPr>
+          <w:rFonts w:ascii="TH Sarabun New" w:eastAsiaTheme="minorHAnsi" w:hAnsi="TH Sarabun New" w:cs="TH Sarabun New"/>
+          <w:sz w:val="32"/>
+          <w:szCs w:val="32"/>
+          <w:cs/>
+        </w:rPr>
+        <w:t xml:space="preserve">({{department_head_name}})</w:t>
+      </w:r>
+    </w:p>
+    <w:p>
+      <w:pPr>
+        <w:spacing w:after="0" w:line="240" w:lineRule="auto"/>
+        <w:jc w:val="center"/>
+        <w:rPr>
+          <w:rFonts w:ascii="TH Sarabun New" w:hAnsi="TH Sarabun New" w:cs="TH Sarabun New"/>
+          <w:sz w:val="32"/>
+          <w:szCs w:val="32"/>
+        </w:rPr>
+      </w:pPr>
+      <w:r>
+        <w:rPr>
+          <w:rFonts w:ascii="TH Sarabun New" w:eastAsiaTheme="minorHAnsi" w:hAnsi="TH Sarabun New" w:cs="TH Sarabun New"/>
+          <w:sz w:val="32"/>
+          <w:szCs w:val="32"/>
+          <w:cs/>
+        </w:rPr>
+        <w:t>ตำแหน่ง..ผู้บังคับบัญชาระดับหัวหน้าภาควิชาหรือเทียบเท่า..</w:t>
+      </w:r>
+    </w:p>
+    <w:p>
+      <w:pPr>
+        <w:spacing w:after="0" w:line="240" w:lineRule="auto"/>
+        <w:jc w:val="center"/>
+        <w:rPr>
+          <w:rFonts w:ascii="TH Sarabun New" w:hAnsi="TH Sarabun New" w:cs="TH Sarabun New"/>
+          <w:sz w:val="32"/>
+          <w:szCs w:val="32"/>
+        </w:rPr>
+      </w:pPr>
+      <w:r>
+        <w:rPr>
+          <w:rFonts w:ascii="TH Sarabun New" w:eastAsiaTheme="minorHAnsi" w:hAnsi="TH Sarabun New" w:cs="TH Sarabun New"/>
+          <w:sz w:val="32"/>
+          <w:szCs w:val="32"/>
+          <w:cs/>
+        </w:rPr>
+        <w:t xml:space="preserve">วันที่ {{head_sign_date}}</w:t>
+      </w:r>
+    </w:p>
+    <w:p>
+      <w:pPr>
+        <w:spacing w:after="0" w:line="240" w:lineRule="auto"/>
+        <w:rPr>
+          <w:rFonts w:ascii="TH Sarabun New" w:hAnsi="TH Sarabun New" w:cs="TH Sarabun New"/>
+          <w:b/>
+          <w:bCs/>
+          <w:sz w:val="32"/>
+          <w:szCs w:val="32"/>
+          <w:u w:val="single"/>
+        </w:rPr>
+      </w:pPr>
+    </w:p>
+    <w:p>
+      <w:pPr>
+        <w:spacing w:after="0" w:line="240" w:lineRule="auto"/>
+        <w:rPr>
+          <w:rFonts w:ascii="TH Sarabun New" w:hAnsi="TH Sarabun New" w:cs="TH Sarabun New"/>
+          <w:b/>
+          <w:bCs/>
+          <w:sz w:val="32"/>
+          <w:szCs w:val="32"/>
+          <w:u w:val="single"/>
+        </w:rPr>
+      </w:pPr>
+      <w:r>
+        <w:rPr>
+          <w:rFonts w:ascii="TH Sarabun New" w:eastAsiaTheme="minorHAnsi" w:hAnsi="TH Sarabun New" w:cs="TH Sarabun New"/>
+          <w:b/>
+          <w:bCs/>
+          <w:sz w:val="32"/>
+          <w:szCs w:val="32"/>
+          <w:u w:val="single"/>
+          <w:cs/>
+        </w:rPr>
+        <w:t>ความเห็นผู้บังคับบัญชาระดับคณบดีหรือเทียบเท่า</w:t>
+      </w:r>
+    </w:p>
+    <w:p>
+      <w:pPr>
+        <w:spacing w:after="0" w:line="240" w:lineRule="auto"/>
+        <w:ind w:firstLine="720"/>
+        <w:jc w:val="thaiDistribute"/>
+        <w:rPr>
+          <w:rFonts w:ascii="TH Sarabun New" w:hAnsi="TH Sarabun New" w:cs="TH Sarabun New"/>
+          <w:sz w:val="32"/>
+          <w:szCs w:val="32"/>
+        </w:rPr>
+      </w:pPr>
+      <w:r>
+        <w:rPr>
+          <w:rFonts w:ascii="TH Sarabun New" w:eastAsiaTheme="minorHAnsi" w:hAnsi="TH Sarabun New" w:cs="TH Sarabun New"/>
+          <w:sz w:val="32"/>
+          <w:szCs w:val="32"/>
+          <w:cs/>
+        </w:rPr>
+        <w:t xml:space="preserve">ได้พิจารณาแล้วเห็นว่า {{title}}{{applicant_name}}</w:t>
+      </w:r>
+    </w:p>
+    <w:p>
+      <w:pPr>
+        <w:spacing w:after="0" w:line="240" w:lineRule="auto"/>
+        <w:jc w:val="thaiDistribute"/>
+        <w:rPr>
+          <w:rFonts w:ascii="TH Sarabun New" w:hAnsi="TH Sarabun New" w:cs="TH Sarabun New"/>
+          <w:sz w:val="32"/>
+          <w:szCs w:val="32"/>
+        </w:rPr>
+      </w:pPr>
+      <w:r>
+        <w:rPr>
+          <w:rFonts w:ascii="TH Sarabun New" w:eastAsiaTheme="minorHAnsi" w:hAnsi="TH Sarabun New" w:cs="TH Sarabun New"/>
+          <w:sz w:val="32"/>
+          <w:szCs w:val="32"/>
+          <w:cs/>
+        </w:rPr>
+        <w:t xml:space="preserve">เป็นผู้มีคุณสมบัติ {{dean_qualification_status}} ที่จะได้รับการแต่งตั้งให้ดำรงตำแหน่ง {{target_position}}</w:t>
+      </w:r>
+    </w:p>
+    <w:p>
+      <w:pPr>
+        <w:spacing w:after="0" w:line="240" w:lineRule="auto"/>
+        <w:jc w:val="thaiDistribute"/>
+        <w:rPr>
+          <w:rFonts w:ascii="TH Sarabun New" w:hAnsi="TH Sarabun New" w:cs="TH Sarabun New"/>
+          <w:sz w:val="32"/>
+          <w:szCs w:val="32"/>
+        </w:rPr>
+      </w:pPr>
+    </w:p>
+    <w:p>
+      <w:pPr>
+        <w:spacing w:after="0" w:line="240" w:lineRule="auto"/>
+        <w:rPr>
+          <w:rFonts w:ascii="TH Sarabun New" w:hAnsi="TH Sarabun New" w:cs="TH Sarabun New"/>
+          <w:sz w:val="32"/>
+          <w:szCs w:val="32"/>
+        </w:rPr>
+      </w:pPr>
+    </w:p>
+    <w:p>
+      <w:pPr>
+        <w:spacing w:after="0" w:line="240" w:lineRule="auto"/>
+        <w:jc w:val="center"/>
+        <w:rPr>
+          <w:rFonts w:ascii="TH Sarabun New" w:hAnsi="TH Sarabun New" w:cs="TH Sarabun New"/>
+          <w:sz w:val="32"/>
+          <w:szCs w:val="32"/>
+        </w:rPr>
+      </w:pPr>
+      <w:r>
+        <w:rPr>
+          <w:rFonts w:ascii="TH Sarabun New" w:eastAsiaTheme="minorHAnsi" w:hAnsi="TH Sarabun New" w:cs="TH Sarabun New"/>
+          <w:sz w:val="32"/>
+          <w:szCs w:val="32"/>
+          <w:cs/>
+        </w:rPr>
+        <w:t>ลงชื่อ...................................................</w:t>
+      </w:r>
+    </w:p>
+    <w:p>
+      <w:pPr>
+        <w:spacing w:after="0" w:line="240" w:lineRule="auto"/>
+        <w:jc w:val="center"/>
+        <w:rPr>
+          <w:rFonts w:ascii="TH Sarabun New" w:hAnsi="TH Sarabun New" w:cs="TH Sarabun New"/>
+          <w:sz w:val="32"/>
+          <w:szCs w:val="32"/>
+        </w:rPr>
+      </w:pPr>
+      <w:r>
+        <w:rPr>
+          <w:rFonts w:ascii="TH Sarabun New" w:eastAsiaTheme="minorHAnsi" w:hAnsi="TH Sarabun New" w:cs="TH Sarabun New"/>
+          <w:sz w:val="32"/>
+          <w:szCs w:val="32"/>
+          <w:cs/>
+        </w:rPr>
+        <w:t xml:space="preserve">({{dean_name}})</w:t>
+      </w:r>
+    </w:p>
+    <w:p>
+      <w:pPr>
+        <w:spacing w:after="0" w:line="240" w:lineRule="auto"/>
+        <w:jc w:val="center"/>
+        <w:rPr>
+          <w:rFonts w:ascii="TH Sarabun New" w:hAnsi="TH Sarabun New" w:cs="TH Sarabun New"/>
+          <w:sz w:val="32"/>
+          <w:szCs w:val="32"/>
+        </w:rPr>
+      </w:pPr>
+      <w:r>
+        <w:rPr>
+          <w:rFonts w:ascii="TH Sarabun New" w:eastAsiaTheme="minorHAnsi" w:hAnsi="TH Sarabun New" w:cs="TH Sarabun New"/>
+          <w:sz w:val="32"/>
+          <w:szCs w:val="32"/>
+          <w:cs/>
+        </w:rPr>
+        <w:t>ตำแหน่ง..................................................</w:t>
+      </w:r>
+    </w:p>
+    <w:p>
+      <w:pPr>
+        <w:spacing w:after="0" w:line="240" w:lineRule="auto"/>
+        <w:jc w:val="center"/>
+        <w:rPr>
+          <w:rFonts w:ascii="TH Sarabun New" w:hAnsi="TH Sarabun New" w:cs="TH Sarabun New"/>
+          <w:sz w:val="32"/>
+          <w:szCs w:val="32"/>
+        </w:rPr>
+      </w:pPr>
+      <w:r>
+        <w:rPr>
+          <w:rFonts w:ascii="TH Sarabun New" w:eastAsiaTheme="minorHAnsi" w:hAnsi="TH Sarabun New" w:cs="TH Sarabun New"/>
+          <w:sz w:val="32"/>
+          <w:szCs w:val="32"/>
+          <w:cs/>
+        </w:rPr>
+        <w:t xml:space="preserve">วันที่ {{dean_sign_date}}</w:t>
+      </w:r>
+    </w:p>
+    <w:p>
+      <w:pPr>
+        <w:spacing w:after="0" w:line="240" w:lineRule="auto"/>
+        <w:rPr>
+          <w:rFonts w:ascii="TH Sarabun New" w:hAnsi="TH Sarabun New" w:cs="TH Sarabun New"/>
+          <w:sz w:val="32"/>
+          <w:szCs w:val="32"/>
+        </w:rPr>
+      </w:pPr>
+    </w:p>
+    <w:p>
+      <w:pPr>
+        <w:spacing w:after="0" w:line="240" w:lineRule="auto"/>
+        <w:rPr>
+          <w:rFonts w:ascii="TH Sarabun New" w:hAnsi="TH Sarabun New" w:cs="TH Sarabun New"/>
+          <w:b/>
+          <w:bCs/>
+          <w:sz w:val="32"/>
+          <w:szCs w:val="32"/>
+        </w:rPr>
+      </w:pPr>
+      <w:r>
+        <w:rPr>
+          <w:rFonts w:ascii="TH Sarabun New" w:eastAsiaTheme="minorHAnsi" w:hAnsi="TH Sarabun New" w:cs="TH Sarabun New"/>
+          <w:b/>
+          <w:bCs/>
+          <w:sz w:val="32"/>
+          <w:szCs w:val="32"/>
+          <w:cs/>
+        </w:rPr>
+        <w:lastRenderedPageBreak/>
+        <w:t>ส่วนที่</w:t>
+      </w:r>
+      <w:r>
+        <w:rPr>
+          <w:rFonts w:ascii="TH Sarabun New" w:eastAsiaTheme="minorHAnsi" w:hAnsi="TH Sarabun New" w:cs="TH Sarabun New"/>
+          <w:b/>
+          <w:bCs/>
+          <w:sz w:val="32"/>
+          <w:szCs w:val="32"/>
+          <w:cs/>
+        </w:rPr>
+        <w:t xml:space="preserve"> </w:t>
+      </w:r>
+      <w:r>
+        <w:rPr>
+          <w:rFonts w:ascii="TH Sarabun New" w:eastAsiaTheme="minorHAnsi" w:hAnsi="TH Sarabun New" w:cs="TH Sarabun New"/>
+          <w:b/>
+          <w:bCs/>
+          <w:sz w:val="32"/>
+          <w:szCs w:val="32"/>
+          <w:cs/>
+        </w:rPr>
+        <w:t>๓</w:t>
+      </w:r>
+      <w:r>
+        <w:rPr>
+          <w:rFonts w:ascii="TH Sarabun New" w:eastAsiaTheme="minorHAnsi" w:hAnsi="TH Sarabun New" w:cs="TH Sarabun New"/>
+          <w:b/>
+          <w:bCs/>
+          <w:sz w:val="32"/>
+          <w:szCs w:val="32"/>
+          <w:cs/>
+        </w:rPr>
+        <w:tab/>
+        <w:t xml:space="preserve"> แบบประเมินผลการสอน</w:t>
+      </w:r>
+    </w:p>
+    <w:p>
+      <w:pPr>
+        <w:spacing w:after="0" w:line="240" w:lineRule="auto"/>
+        <w:jc w:val="thaiDistribute"/>
+        <w:rPr>
+          <w:rFonts w:ascii="TH Sarabun New" w:hAnsi="TH Sarabun New" w:cs="TH Sarabun New"/>
+          <w:sz w:val="32"/>
+          <w:szCs w:val="32"/>
+        </w:rPr>
+      </w:pPr>
+      <w:r>
+        <w:rPr>
+          <w:rFonts w:ascii="TH Sarabun New" w:eastAsiaTheme="minorHAnsi" w:hAnsi="TH Sarabun New" w:cs="TH Sarabun New"/>
+          <w:sz w:val="32"/>
+          <w:szCs w:val="32"/>
+          <w:cs/>
+        </w:rPr>
+        <w:t xml:space="preserve">คณะอนุกรรมการเพื่อประเมินผลการสอน ในการประชุมครั้งที่ {{s3_meeting_no}} เมื่อวันที่ {{s3_meeting_date}} ซึ่งได้รับมอบอำนาจจากคณะกรรมการพิจารณาตำแหน่งทางวิชาการ {{s3_university}} ได้ประเมินผลการสอนรหัสวิชา {{s3_course_code}} รายวิชา {{s3_course_name}} ของ {{title}}{{applicant_name}} แล้วเห็นว่า บุคคลดังกล่าวเป็นผู้มีความ{{s3_level}} ในการสอนมีคุณภาพ{{s3_quality}}ในหลักเกณฑ์และวิธีการตามที่มหาวิทยาลัยกำหนด</w:t>
+      </w:r>
+    </w:p>
+    <w:p>
+      <w:pPr>
+        <w:spacing w:after="0" w:line="240" w:lineRule="auto"/>
+        <w:rPr>
+          <w:rFonts w:ascii="TH Sarabun New" w:hAnsi="TH Sarabun New" w:cs="TH Sarabun New"/>
+          <w:sz w:val="32"/>
+          <w:szCs w:val="32"/>
+        </w:rPr>
+      </w:pPr>
+    </w:p>
+    <w:p>
+      <w:pPr>
+        <w:spacing w:after="0" w:line="240" w:lineRule="auto"/>
+        <w:rPr>
+          <w:rFonts w:ascii="TH Sarabun New" w:hAnsi="TH Sarabun New" w:cs="TH Sarabun New"/>
+          <w:sz w:val="32"/>
+          <w:szCs w:val="32"/>
+        </w:rPr>
+      </w:pPr>
+    </w:p>
+    <w:p>
+      <w:pPr>
+        <w:spacing w:after="0" w:line="240" w:lineRule="auto"/>
+        <w:rPr>
+          <w:rFonts w:ascii="TH Sarabun New" w:hAnsi="TH Sarabun New" w:cs="TH Sarabun New"/>
+          <w:sz w:val="32"/>
+          <w:szCs w:val="32"/>
+        </w:rPr>
+      </w:pPr>
+    </w:p>
+    <w:p>
+      <w:pPr>
+        <w:spacing w:after="0" w:line="240" w:lineRule="auto"/>
+        <w:jc w:val="center"/>
+        <w:rPr>
+          <w:rFonts w:ascii="TH Sarabun New" w:hAnsi="TH Sarabun New" w:cs="TH Sarabun New"/>
+          <w:sz w:val="32"/>
+          <w:szCs w:val="32"/>
+        </w:rPr>
+      </w:pPr>
+      <w:r>
+        <w:rPr>
+          <w:rFonts w:ascii="TH Sarabun New" w:eastAsiaTheme="minorHAnsi" w:hAnsi="TH Sarabun New" w:cs="TH Sarabun New"/>
+          <w:sz w:val="32"/>
+          <w:szCs w:val="32"/>
+          <w:cs/>
+        </w:rPr>
+        <w:t>ลงชื่อ........................................................</w:t>
+      </w:r>
+    </w:p>
+    <w:p>
+      <w:pPr>
+        <w:spacing w:after="0" w:line="240" w:lineRule="auto"/>
+        <w:jc w:val="center"/>
+        <w:rPr>
+          <w:rFonts w:ascii="TH Sarabun New" w:hAnsi="TH Sarabun New" w:cs="TH Sarabun New"/>
+          <w:sz w:val="32"/>
+          <w:szCs w:val="32"/>
+        </w:rPr>
+      </w:pPr>
+      <w:r>
+        <w:rPr>
+          <w:rFonts w:ascii="TH Sarabun New" w:eastAsiaTheme="minorHAnsi" w:hAnsi="TH Sarabun New" w:cs="TH Sarabun New"/>
+          <w:sz w:val="32"/>
+          <w:szCs w:val="32"/>
+          <w:cs/>
+        </w:rPr>
+        <w:t xml:space="preserve"> ({{s3_chair_name}})</w:t>
+      </w:r>
+    </w:p>
+    <w:p>
+      <w:pPr>
+        <w:spacing w:after="0" w:line="240" w:lineRule="auto"/>
+        <w:jc w:val="center"/>
+        <w:rPr>
+          <w:rFonts w:ascii="TH Sarabun New" w:hAnsi="TH Sarabun New" w:cs="TH Sarabun New"/>
+          <w:sz w:val="32"/>
+          <w:szCs w:val="32"/>
+        </w:rPr>
+      </w:pPr>
+      <w:r>
+        <w:rPr>
+          <w:rFonts w:ascii="TH Sarabun New" w:eastAsiaTheme="minorHAnsi" w:hAnsi="TH Sarabun New" w:cs="TH Sarabun New"/>
+          <w:sz w:val="32"/>
+          <w:szCs w:val="32"/>
+          <w:cs/>
+        </w:rPr>
+        <w:t>ตำแหน่ง</w:t>
+      </w:r>
+      <w:r>
+        <w:rPr>
+          <w:rFonts w:ascii="TH Sarabun New" w:eastAsiaTheme="minorHAnsi" w:hAnsi="TH Sarabun New" w:cs="TH Sarabun New"/>
+          <w:sz w:val="32"/>
+          <w:szCs w:val="32"/>
+          <w:cs/>
+        </w:rPr>
+        <w:t xml:space="preserve"> </w:t>
+      </w:r>
+      <w:r>
+        <w:rPr>
+          <w:rFonts w:ascii="TH Sarabun New" w:eastAsiaTheme="minorHAnsi" w:hAnsi="TH Sarabun New" w:cs="TH Sarabun New"/>
+          <w:sz w:val="32"/>
+          <w:szCs w:val="32"/>
+          <w:cs/>
+        </w:rPr>
+        <w:t>ประธานคณะอนุกรรมการเพื่อประเมินผลการสอน</w:t>
+      </w:r>
+    </w:p>
+    <w:p>
+      <w:pPr>
+        <w:spacing w:after="0" w:line="240" w:lineRule="auto"/>
+        <w:jc w:val="center"/>
+        <w:rPr>
+          <w:rFonts w:ascii="TH Sarabun New" w:hAnsi="TH Sarabun New" w:cs="TH Sarabun New"/>
+          <w:sz w:val="32"/>
+          <w:szCs w:val="32"/>
+        </w:rPr>
+      </w:pPr>
+      <w:r>
+        <w:rPr>
+          <w:rFonts w:ascii="TH Sarabun New" w:eastAsiaTheme="minorHAnsi" w:hAnsi="TH Sarabun New" w:cs="TH Sarabun New"/>
+          <w:sz w:val="32"/>
+          <w:szCs w:val="32"/>
+          <w:cs/>
+        </w:rPr>
+        <w:t xml:space="preserve">วันที่ {{s3_sign_date}}</w:t>
+      </w:r>
+    </w:p>
+    <w:p>
+      <w:pPr>
+        <w:spacing w:after="0" w:line="240" w:lineRule="auto"/>
+        <w:rPr>
+          <w:rFonts w:ascii="TH Sarabun New" w:hAnsi="TH Sarabun New" w:cs="TH Sarabun New"/>
+          <w:sz w:val="32"/>
+          <w:szCs w:val="32"/>
+        </w:rPr>
+      </w:pPr>
+    </w:p>
+    <w:p>
+      <w:pPr>
+        <w:spacing w:after="0" w:line="240" w:lineRule="auto"/>
+        <w:jc w:val="center"/>
+        <w:rPr>
+          <w:rFonts w:ascii="TH Sarabun New" w:hAnsi="TH Sarabun New" w:cs="TH Sarabun New"/>
+          <w:sz w:val="32"/>
+          <w:szCs w:val="32"/>
+        </w:rPr>
+      </w:pPr>
+    </w:p>
+    <w:p>
+      <w:pPr>
+        <w:spacing w:after="0" w:line="240" w:lineRule="auto"/>
+        <w:jc w:val="center"/>
+        <w:rPr>
+          <w:rFonts w:ascii="TH Sarabun New" w:hAnsi="TH Sarabun New" w:cs="TH Sarabun New"/>
+          <w:sz w:val="32"/>
+          <w:szCs w:val="32"/>
+        </w:rPr>
+      </w:pPr>
+    </w:p>
+    <w:p>
+      <w:pPr>
+        <w:spacing w:after="0" w:line="240" w:lineRule="auto"/>
+        <w:jc w:val="center"/>
+        <w:rPr>
+          <w:rFonts w:ascii="TH Sarabun New" w:hAnsi="TH Sarabun New" w:cs="TH Sarabun New"/>
+          <w:sz w:val="32"/>
+          <w:szCs w:val="32"/>
+        </w:rPr>
+      </w:pPr>
+    </w:p>
+    <w:p>
+      <w:pPr>
+        <w:spacing w:after="0" w:line="240" w:lineRule="auto"/>
+        <w:jc w:val="center"/>
+        <w:rPr>
+          <w:rFonts w:ascii="TH Sarabun New" w:hAnsi="TH Sarabun New" w:cs="TH Sarabun New"/>
+          <w:sz w:val="32"/>
+          <w:szCs w:val="32"/>
+        </w:rPr>
+      </w:pPr>
+    </w:p>
+    <w:p>
+      <w:pPr>
+        <w:spacing w:after="0" w:line="240" w:lineRule="auto"/>
+        <w:jc w:val="center"/>
+        <w:rPr>
+          <w:rFonts w:ascii="TH Sarabun New" w:hAnsi="TH Sarabun New" w:cs="TH Sarabun New"/>
+          <w:sz w:val="32"/>
+          <w:szCs w:val="32"/>
+        </w:rPr>
+      </w:pPr>
+    </w:p>
+    <w:p>
+      <w:pPr>
+        <w:spacing w:after="0" w:line="240" w:lineRule="auto"/>
+        <w:jc w:val="center"/>
+        <w:rPr>
+          <w:rFonts w:ascii="TH Sarabun New" w:hAnsi="TH Sarabun New" w:cs="TH Sarabun New"/>
+          <w:sz w:val="32"/>
+          <w:szCs w:val="32"/>
+        </w:rPr>
+      </w:pPr>
+    </w:p>
+    <w:p>
+      <w:pPr>
+        <w:spacing w:after="0" w:line="240" w:lineRule="auto"/>
+        <w:jc w:val="center"/>
+        <w:rPr>
+          <w:rFonts w:ascii="TH Sarabun New" w:hAnsi="TH Sarabun New" w:cs="TH Sarabun New"/>
+          <w:sz w:val="32"/>
+          <w:szCs w:val="32"/>
+        </w:rPr>
+      </w:pPr>
+    </w:p>
+    <w:p>
+      <w:pPr>
+        <w:spacing w:after="0" w:line="240" w:lineRule="auto"/>
+        <w:jc w:val="center"/>
+        <w:rPr>
+          <w:rFonts w:ascii="TH Sarabun New" w:hAnsi="TH Sarabun New" w:cs="TH Sarabun New"/>
+          <w:sz w:val="32"/>
+          <w:szCs w:val="32"/>
+        </w:rPr>
+      </w:pPr>
+    </w:p>
+    <w:p>
+      <w:pPr>
+        <w:spacing w:after="0" w:line="240" w:lineRule="auto"/>
+        <w:jc w:val="center"/>
+        <w:rPr>
+          <w:rFonts w:ascii="TH Sarabun New" w:hAnsi="TH Sarabun New" w:cs="TH Sarabun New"/>
+          <w:sz w:val="32"/>
+          <w:szCs w:val="32"/>
+        </w:rPr>
+      </w:pPr>
+    </w:p>
+    <w:p>
+      <w:pPr>
+        <w:spacing w:after="0" w:line="240" w:lineRule="auto"/>
+        <w:jc w:val="center"/>
+        <w:rPr>
+          <w:rFonts w:ascii="TH Sarabun New" w:hAnsi="TH Sarabun New" w:cs="TH Sarabun New"/>
+          <w:sz w:val="32"/>
+          <w:szCs w:val="32"/>
+        </w:rPr>
+      </w:pPr>
+    </w:p>
+    <w:p>
+      <w:pPr>
+        <w:rPr>
+          <w:rFonts w:ascii="TH Sarabun New" w:hAnsi="TH Sarabun New" w:cs="TH Sarabun New"/>
+          <w:sz w:val="32"/>
+          <w:szCs w:val="32"/>
+          <w:cs/>
+        </w:rPr>
+      </w:pPr>
+      <w:r>
+        <w:rPr>
+          <w:rFonts w:ascii="TH Sarabun New" w:hAnsi="TH Sarabun New" w:cs="TH Sarabun New"/>
+          <w:sz w:val="32"/>
+          <w:szCs w:val="32"/>
+          <w:cs/>
+        </w:rPr>
+        <w:br w:type="page"/>
+      </w:r>
+    </w:p>
+    <w:p>
+      <w:pPr>
+        <w:spacing w:after="0" w:line="240" w:lineRule="auto"/>
+        <w:rPr>
+          <w:rFonts w:ascii="TH Sarabun New" w:hAnsi="TH Sarabun New" w:cs="TH Sarabun New"/>
+          <w:sz w:val="32"/>
+          <w:szCs w:val="32"/>
+        </w:rPr>
+      </w:pPr>
+      <w:r>
+        <w:rPr>
+          <w:rFonts w:ascii="TH Sarabun New" w:eastAsiaTheme="minorHAnsi" w:hAnsi="TH Sarabun New" w:cs="TH Sarabun New"/>
+          <w:b/>
+          <w:bCs/>
+          <w:sz w:val="32"/>
+          <w:szCs w:val="32"/>
+          <w:cs/>
+        </w:rPr>
+        <w:lastRenderedPageBreak/>
+        <w:t>ส่วนที่</w:t>
+      </w:r>
+      <w:r>
+        <w:rPr>
+          <w:rFonts w:ascii="TH Sarabun New" w:eastAsiaTheme="minorHAnsi" w:hAnsi="TH Sarabun New" w:cs="TH Sarabun New"/>
+          <w:b/>
+          <w:bCs/>
+          <w:sz w:val="32"/>
+          <w:szCs w:val="32"/>
+          <w:cs/>
+        </w:rPr>
+        <w:t xml:space="preserve"> </w:t>
+      </w:r>
+      <w:r>
+        <w:rPr>
+          <w:rFonts w:ascii="TH Sarabun New" w:eastAsiaTheme="minorHAnsi" w:hAnsi="TH Sarabun New" w:cs="TH Sarabun New"/>
+          <w:b/>
+          <w:bCs/>
+          <w:sz w:val="32"/>
+          <w:szCs w:val="32"/>
+          <w:cs/>
+        </w:rPr>
+        <w:t>๔</w:t>
+      </w:r>
+      <w:r>
+        <w:rPr>
+          <w:rFonts w:ascii="TH Sarabun New" w:eastAsiaTheme="minorHAnsi" w:hAnsi="TH Sarabun New" w:cs="TH Sarabun New" w:hint="cs"/>
+          <w:b/>
+          <w:bCs/>
+          <w:sz w:val="32"/>
+          <w:szCs w:val="32"/>
+          <w:cs/>
+        </w:rPr>
+        <w:t xml:space="preserve">  </w:t>
+      </w:r>
+      <w:r>
+        <w:rPr>
+          <w:rFonts w:ascii="TH Sarabun New" w:eastAsiaTheme="minorHAnsi" w:hAnsi="TH Sarabun New" w:cs="TH Sarabun New"/>
+          <w:b/>
+          <w:bCs/>
+          <w:sz w:val="32"/>
+          <w:szCs w:val="32"/>
+          <w:cs/>
+        </w:rPr>
+        <w:t>แบบสรุปผลการประเมินผลงานทางวิชาการ</w:t>
+      </w:r>
+    </w:p>
+    <w:p>
+      <w:pPr>
+        <w:spacing w:after="0" w:line="240" w:lineRule="auto"/>
+        <w:rPr>
+          <w:rFonts w:ascii="TH Sarabun New" w:hAnsi="TH Sarabun New" w:cs="TH Sarabun New"/>
+          <w:sz w:val="32"/>
+          <w:szCs w:val="32"/>
+        </w:rPr>
+      </w:pPr>
+    </w:p>
+    <w:p>
+      <w:pPr>
+        <w:spacing w:after="0" w:line="240" w:lineRule="auto"/>
+        <w:ind w:left="2160" w:hanging="1440"/>
+        <w:rPr>
+          <w:rFonts w:ascii="TH Sarabun New" w:hAnsi="TH Sarabun New" w:cs="TH Sarabun New"/>
+          <w:b/>
+          <w:bCs/>
+          <w:sz w:val="32"/>
+          <w:szCs w:val="32"/>
+        </w:rPr>
+      </w:pPr>
+      <w:r>
+        <w:rPr>
+          <w:rFonts w:ascii="TH Sarabun New" w:eastAsiaTheme="minorHAnsi" w:hAnsi="TH Sarabun New" w:cs="TH Sarabun New"/>
+          <w:b/>
+          <w:bCs/>
+          <w:sz w:val="32"/>
+          <w:szCs w:val="32"/>
+          <w:cs/>
+        </w:rPr>
+        <w:t>ตอนที่</w:t>
+      </w:r>
+      <w:r>
+        <w:rPr>
+          <w:rFonts w:ascii="TH Sarabun New" w:eastAsiaTheme="minorHAnsi" w:hAnsi="TH Sarabun New" w:cs="TH Sarabun New"/>
+          <w:b/>
+          <w:bCs/>
+          <w:sz w:val="32"/>
+          <w:szCs w:val="32"/>
+          <w:cs/>
+        </w:rPr>
+        <w:t xml:space="preserve"> </w:t>
+      </w:r>
+      <w:r>
+        <w:rPr>
+          <w:rFonts w:ascii="TH Sarabun New" w:eastAsiaTheme="minorHAnsi" w:hAnsi="TH Sarabun New" w:cs="TH Sarabun New"/>
+          <w:b/>
+          <w:bCs/>
+          <w:sz w:val="32"/>
+          <w:szCs w:val="32"/>
+          <w:cs/>
+        </w:rPr>
+        <w:t>๑</w:t>
+      </w:r>
+      <w:r>
+        <w:rPr>
+          <w:rFonts w:ascii="TH Sarabun New" w:eastAsiaTheme="minorHAnsi" w:hAnsi="TH Sarabun New" w:cs="TH Sarabun New"/>
+          <w:b/>
+          <w:bCs/>
+          <w:sz w:val="32"/>
+          <w:szCs w:val="32"/>
+          <w:cs/>
+        </w:rPr>
+        <w:tab/>
+        <w:t>การพิจารณาข</w:t>
+      </w:r>
+      <w:r>
+        <w:rPr>
+          <w:rFonts w:ascii="TH Sarabun New" w:eastAsiaTheme="minorHAnsi" w:hAnsi="TH Sarabun New" w:cs="TH Sarabun New"/>
+          <w:b/>
+          <w:bCs/>
+          <w:sz w:val="32"/>
+          <w:szCs w:val="32"/>
+          <w:cs/>
+        </w:rPr>
+        <w:t>องคณะกรรมการผู้ทรงคุณวุฒิเพื่อทำ</w:t>
+      </w:r>
+      <w:r>
+        <w:rPr>
+          <w:rFonts w:ascii="TH Sarabun New" w:eastAsiaTheme="minorHAnsi" w:hAnsi="TH Sarabun New" w:cs="TH Sarabun New"/>
+          <w:b/>
+          <w:bCs/>
+          <w:sz w:val="32"/>
+          <w:szCs w:val="32"/>
+          <w:cs/>
+        </w:rPr>
+        <w:t>หน้าที่ประเมินผลงานทางวิชาการและจริยธรรมและจรรยาบรรณทางวิชาการ</w:t>
+      </w:r>
+    </w:p>
+    <w:p>
+      <w:pPr>
+        <w:spacing w:after="0" w:line="240" w:lineRule="auto"/>
+        <w:rPr>
+          <w:rFonts w:ascii="TH Sarabun New" w:hAnsi="TH Sarabun New" w:cs="TH Sarabun New"/>
+          <w:sz w:val="32"/>
+          <w:szCs w:val="32"/>
+        </w:rPr>
+      </w:pPr>
+    </w:p>
+    <w:p>
+      <w:pPr>
+        <w:spacing w:after="0" w:line="240" w:lineRule="auto"/>
+        <w:ind w:firstLine="1276"/>
+        <w:rPr>
+          <w:rFonts w:ascii="TH Sarabun New" w:hAnsi="TH Sarabun New" w:cs="TH Sarabun New"/>
+          <w:sz w:val="32"/>
+          <w:szCs w:val="32"/>
+        </w:rPr>
+      </w:pPr>
+      <w:r>
+        <w:rPr>
+          <w:rFonts w:ascii="TH Sarabun New" w:eastAsiaTheme="minorHAnsi" w:hAnsi="TH Sarabun New" w:cs="TH Sarabun New"/>
+          <w:sz w:val="32"/>
+          <w:szCs w:val="32"/>
+          <w:cs/>
+        </w:rPr>
+        <w:t>คณะกรรมการผู้ทรงคุณวุฒิเพื่อทำหน้าที่ประเมินผลงานทางวิชาการและจริยธรรมและ</w:t>
+      </w:r>
+    </w:p>
+    <w:p>
+      <w:pPr>
+        <w:spacing w:after="0" w:line="240" w:lineRule="auto"/>
+        <w:rPr>
+          <w:rFonts w:ascii="TH Sarabun New" w:hAnsi="TH Sarabun New" w:cs="TH Sarabun New"/>
+          <w:sz w:val="32"/>
+          <w:szCs w:val="32"/>
+        </w:rPr>
+      </w:pPr>
+      <w:r>
+        <w:rPr>
+          <w:rFonts w:ascii="TH Sarabun New" w:eastAsiaTheme="minorHAnsi" w:hAnsi="TH Sarabun New" w:cs="TH Sarabun New"/>
+          <w:sz w:val="32"/>
+          <w:szCs w:val="32"/>
+          <w:cs/>
+        </w:rPr>
+        <w:t>จรรยาบรรณทางวิชาการ ในสาขาวิชา...........................................................ในการประชุมครั้งที่............/............. เมื่อวันที่.............................รวม..........ครั้ง ประเมินผลงานทางวิชาการของ นาย/นาง/นางสาว.............................. ซึ่งขอกำหนดตำแหน่งเป็น..(ผู้ช่วยศาสตราจารย์ /รองศาสตราจารย์ /ศาสตราจารย์)...ในสาขาวิชา....................... แล้วเห็นว่า</w:t>
+      </w:r>
+    </w:p>
+    <w:p>
+      <w:pPr>
+        <w:spacing w:after="0" w:line="240" w:lineRule="auto"/>
+        <w:ind w:left="720" w:firstLine="720"/>
+        <w:rPr>
+          <w:rFonts w:ascii="TH Sarabun New" w:hAnsi="TH Sarabun New" w:cs="TH Sarabun New"/>
+          <w:sz w:val="32"/>
+          <w:szCs w:val="32"/>
+        </w:rPr>
+      </w:pPr>
+      <w:r>
+        <w:rPr>
+          <w:rFonts w:ascii="TH Sarabun New" w:eastAsiaTheme="minorHAnsi" w:hAnsi="TH Sarabun New" w:cs="TH Sarabun New"/>
+          <w:sz w:val="32"/>
+          <w:szCs w:val="32"/>
+          <w:cs/>
+        </w:rPr>
+        <w:t>๑) งานวิจัย............เรื่อง  คุณภาพ..(อยู่/ไม่อยู่)..ในเกณฑ์ที่</w:t>
+      </w:r>
+      <w:r>
+        <w:rPr>
+          <w:rFonts w:ascii="TH Sarabun New" w:eastAsiaTheme="minorHAnsi" w:hAnsi="TH Sarabun New" w:cs="TH Sarabun New"/>
+          <w:sz w:val="32"/>
+          <w:szCs w:val="32"/>
+          <w:cs/>
+        </w:rPr>
+        <w:t xml:space="preserve"> </w:t>
+      </w:r>
+      <w:r>
+        <w:rPr>
+          <w:rFonts w:ascii="TH Sarabun New" w:eastAsiaTheme="minorHAnsi" w:hAnsi="TH Sarabun New" w:cs="TH Sarabun New"/>
+          <w:sz w:val="32"/>
+          <w:szCs w:val="32"/>
+          <w:cs/>
+        </w:rPr>
+        <w:t>มหาวิทยาลัย</w:t>
+      </w:r>
+      <w:r>
+        <w:rPr>
+          <w:rFonts w:ascii="TH Sarabun New" w:eastAsiaTheme="minorHAnsi" w:hAnsi="TH Sarabun New" w:cs="TH Sarabun New"/>
+          <w:sz w:val="32"/>
+          <w:szCs w:val="32"/>
+          <w:cs/>
+        </w:rPr>
+        <w:t>กำหนด.........เรื่อง</w:t>
+      </w:r>
+      <w:r>
+        <w:rPr>
+          <w:rFonts w:ascii="TH Sarabun New" w:eastAsiaTheme="minorHAnsi" w:hAnsi="TH Sarabun New" w:cs="TH Sarabun New"/>
+          <w:sz w:val="32"/>
+          <w:szCs w:val="32"/>
+          <w:cs/>
+        </w:rPr>
+        <w:t xml:space="preserve"> </w:t>
+      </w:r>
+      <w:r>
+        <w:rPr>
+          <w:rFonts w:ascii="TH Sarabun New" w:eastAsiaTheme="minorHAnsi" w:hAnsi="TH Sarabun New" w:cs="TH Sarabun New"/>
+          <w:sz w:val="32"/>
+          <w:szCs w:val="32"/>
+          <w:cs/>
+        </w:rPr>
+        <w:t xml:space="preserve">ได้แก่ </w:t>
+      </w:r>
+    </w:p>
+    <w:p>
+      <w:pPr>
+        <w:spacing w:after="0" w:line="240" w:lineRule="auto"/>
+        <w:ind w:left="1440" w:firstLine="720"/>
+        <w:rPr>
+          <w:rFonts w:ascii="TH Sarabun New" w:hAnsi="TH Sarabun New" w:cs="TH Sarabun New"/>
+          <w:sz w:val="32"/>
+          <w:szCs w:val="32"/>
+        </w:rPr>
+      </w:pPr>
+      <w:r>
+        <w:rPr>
+          <w:rFonts w:ascii="TH Sarabun New" w:eastAsiaTheme="minorHAnsi" w:hAnsi="TH Sarabun New" w:cs="TH Sarabun New"/>
+          <w:sz w:val="32"/>
+          <w:szCs w:val="32"/>
+          <w:cs/>
+        </w:rPr>
+        <w:t xml:space="preserve">๑.๑).............................................................. คุณภาพอยู่ในระดับ............... </w:t>
+      </w:r>
+    </w:p>
+    <w:p>
+      <w:pPr>
+        <w:spacing w:after="0" w:line="240" w:lineRule="auto"/>
+        <w:ind w:left="1440" w:firstLine="720"/>
+        <w:rPr>
+          <w:rFonts w:ascii="TH Sarabun New" w:hAnsi="TH Sarabun New" w:cs="TH Sarabun New"/>
+          <w:sz w:val="32"/>
+          <w:szCs w:val="32"/>
+        </w:rPr>
+      </w:pPr>
+      <w:r>
+        <w:rPr>
+          <w:rFonts w:ascii="TH Sarabun New" w:eastAsiaTheme="minorHAnsi" w:hAnsi="TH Sarabun New" w:cs="TH Sarabun New"/>
+          <w:sz w:val="32"/>
+          <w:szCs w:val="32"/>
+          <w:cs/>
+        </w:rPr>
+        <w:t>๑.๒).............................................................. คุณภาพอยู่ในระดับ...............</w:t>
+      </w:r>
+    </w:p>
+    <w:p>
+      <w:pPr>
+        <w:spacing w:after="0" w:line="240" w:lineRule="auto"/>
+        <w:ind w:firstLine="1418"/>
+        <w:jc w:val="thaiDistribute"/>
+        <w:rPr>
+          <w:rFonts w:ascii="TH Sarabun New" w:hAnsi="TH Sarabun New" w:cs="TH Sarabun New"/>
+          <w:sz w:val="32"/>
+          <w:szCs w:val="32"/>
+        </w:rPr>
+      </w:pPr>
+      <w:r>
+        <w:rPr>
+          <w:rFonts w:ascii="TH Sarabun New" w:eastAsiaTheme="minorHAnsi" w:hAnsi="TH Sarabun New" w:cs="TH Sarabun New"/>
+          <w:sz w:val="32"/>
+          <w:szCs w:val="32"/>
+          <w:cs/>
+        </w:rPr>
+        <w:t>๒) ผลงานทางวิชาการในลักษณะอื่น</w:t>
+      </w:r>
+      <w:r>
+        <w:rPr>
+          <w:rFonts w:ascii="TH Sarabun New" w:eastAsiaTheme="minorHAnsi" w:hAnsi="TH Sarabun New" w:cs="TH Sarabun New"/>
+          <w:sz w:val="32"/>
+          <w:szCs w:val="32"/>
+          <w:cs/>
+        </w:rPr>
+        <w:t xml:space="preserve"> </w:t>
+      </w:r>
+      <w:r>
+        <w:rPr>
+          <w:rFonts w:ascii="TH Sarabun New" w:eastAsiaTheme="minorHAnsi" w:hAnsi="TH Sarabun New" w:cs="TH Sarabun New"/>
+          <w:sz w:val="32"/>
+          <w:szCs w:val="32"/>
+          <w:cs/>
+        </w:rPr>
+        <w:t>(ผลงานวิชาการเพื่ออุตสาหกรรม/ผลงานวิชาการเพื่อพัฒนาการเรียนการสอนและการเรียนรู้/ ผลงานวิชาการเพื่อพัฒนานโยบายสาธารณะ/ กรณีศึกษา</w:t>
+      </w:r>
+      <w:r>
+        <w:rPr>
+          <w:rFonts w:ascii="TH Sarabun New" w:eastAsiaTheme="minorHAnsi" w:hAnsi="TH Sarabun New" w:cs="TH Sarabun New"/>
+          <w:sz w:val="32"/>
+          <w:szCs w:val="32"/>
+          <w:cs/>
+        </w:rPr>
+        <w:t xml:space="preserve"> </w:t>
+      </w:r>
+      <w:r>
+        <w:rPr>
+          <w:rFonts w:ascii="TH Sarabun New" w:eastAsiaTheme="minorHAnsi" w:hAnsi="TH Sarabun New" w:cs="TH Sarabun New"/>
+          <w:sz w:val="32"/>
+          <w:szCs w:val="32"/>
+          <w:cs/>
+        </w:rPr>
+        <w:t>(</w:t>
+      </w:r>
+      <w:r>
+        <w:rPr>
+          <w:rFonts w:ascii="TH Sarabun New" w:eastAsiaTheme="minorHAnsi" w:hAnsi="TH Sarabun New" w:cs="TH Sarabun New"/>
+          <w:sz w:val="32"/>
+          <w:szCs w:val="32"/>
+        </w:rPr>
+        <w:t xml:space="preserve">case study)/ </w:t>
+      </w:r>
+      <w:r>
+        <w:rPr>
+          <w:rFonts w:ascii="TH Sarabun New" w:eastAsiaTheme="minorHAnsi" w:hAnsi="TH Sarabun New" w:cs="TH Sarabun New"/>
+          <w:sz w:val="32"/>
+          <w:szCs w:val="32"/>
+          <w:cs/>
+        </w:rPr>
+        <w:t>งานแปล/ พจนานุกรม สารานุกรม นามานุกรม และงานวิชาการในลักษณะเดียวกัน/ ผลงาน สร้างสรรค์ด้านวิทยาศาสตร์และเทคโนโลยี/ผลงานสร้างสรรค์ด้านสุนทรียะ ศิลปะ/ สิทธิบัตร/ ซอฟต์แวร์/ผลงานรับใช้ท้องถิ่นและสังคม/ ผลงานนวัตกรรม) ............รายการ</w:t>
+      </w:r>
+      <w:r>
+        <w:rPr>
+          <w:rFonts w:ascii="TH Sarabun New" w:eastAsiaTheme="minorHAnsi" w:hAnsi="TH Sarabun New" w:cs="TH Sarabun New"/>
+          <w:sz w:val="32"/>
+          <w:szCs w:val="32"/>
+          <w:cs/>
+        </w:rPr>
+        <w:t xml:space="preserve"> </w:t>
+      </w:r>
+      <w:r>
+        <w:rPr>
+          <w:rFonts w:ascii="TH Sarabun New" w:eastAsiaTheme="minorHAnsi" w:hAnsi="TH Sarabun New" w:cs="TH Sarabun New"/>
+          <w:sz w:val="32"/>
+          <w:szCs w:val="32"/>
+          <w:cs/>
+        </w:rPr>
+        <w:t>คุณภาพ..(อยู่/ไม่อยู่)..ในเกณฑ์ที่</w:t>
+      </w:r>
+      <w:r>
+        <w:rPr>
+          <w:rFonts w:ascii="TH Sarabun New" w:eastAsiaTheme="minorHAnsi" w:hAnsi="TH Sarabun New" w:cs="TH Sarabun New"/>
+          <w:sz w:val="32"/>
+          <w:szCs w:val="32"/>
+          <w:cs/>
+        </w:rPr>
+        <w:t xml:space="preserve"> </w:t>
+      </w:r>
+      <w:r>
+        <w:rPr>
+          <w:rFonts w:ascii="TH Sarabun New" w:eastAsiaTheme="minorHAnsi" w:hAnsi="TH Sarabun New" w:cs="TH Sarabun New"/>
+          <w:sz w:val="32"/>
+          <w:szCs w:val="32"/>
+          <w:cs/>
+        </w:rPr>
+        <w:t>มหาวิทยาลัย</w:t>
+      </w:r>
+      <w:r>
+        <w:rPr>
+          <w:rFonts w:ascii="TH Sarabun New" w:eastAsiaTheme="minorHAnsi" w:hAnsi="TH Sarabun New" w:cs="TH Sarabun New"/>
+          <w:sz w:val="32"/>
+          <w:szCs w:val="32"/>
+          <w:cs/>
+        </w:rPr>
+        <w:t>กำหนด.....</w:t>
+      </w:r>
+      <w:r>
+        <w:rPr>
+          <w:rFonts w:ascii="TH Sarabun New" w:eastAsiaTheme="minorHAnsi" w:hAnsi="TH Sarabun New" w:cs="TH Sarabun New"/>
+          <w:sz w:val="32"/>
+          <w:szCs w:val="32"/>
+          <w:cs/>
+        </w:rPr>
+        <w:t xml:space="preserve"> </w:t>
+      </w:r>
+      <w:r>
+        <w:rPr>
+          <w:rFonts w:ascii="TH Sarabun New" w:eastAsiaTheme="minorHAnsi" w:hAnsi="TH Sarabun New" w:cs="TH Sarabun New"/>
+          <w:sz w:val="32"/>
+          <w:szCs w:val="32"/>
+          <w:cs/>
+        </w:rPr>
+        <w:t>รายการ ได้แก่</w:t>
+      </w:r>
+    </w:p>
+    <w:p>
+      <w:pPr>
+        <w:spacing w:after="0" w:line="240" w:lineRule="auto"/>
+        <w:ind w:left="1440" w:firstLine="720"/>
+        <w:rPr>
+          <w:rFonts w:ascii="TH Sarabun New" w:hAnsi="TH Sarabun New" w:cs="TH Sarabun New"/>
+          <w:sz w:val="32"/>
+          <w:szCs w:val="32"/>
+        </w:rPr>
+      </w:pPr>
+      <w:r>
+        <w:rPr>
+          <w:rFonts w:ascii="TH Sarabun New" w:eastAsiaTheme="minorHAnsi" w:hAnsi="TH Sarabun New" w:cs="TH Sarabun New"/>
+          <w:sz w:val="32"/>
+          <w:szCs w:val="32"/>
+          <w:cs/>
+        </w:rPr>
+        <w:t>๒.๑).............................................................. คุณภาพอยู่ในระดับ...............</w:t>
+      </w:r>
+    </w:p>
+    <w:p>
+      <w:pPr>
+        <w:spacing w:after="0" w:line="240" w:lineRule="auto"/>
+        <w:ind w:left="1440" w:firstLine="720"/>
+        <w:rPr>
+          <w:rFonts w:ascii="TH Sarabun New" w:hAnsi="TH Sarabun New" w:cs="TH Sarabun New"/>
+          <w:sz w:val="32"/>
+          <w:szCs w:val="32"/>
+        </w:rPr>
+      </w:pPr>
+      <w:r>
+        <w:rPr>
+          <w:rFonts w:ascii="TH Sarabun New" w:eastAsiaTheme="minorHAnsi" w:hAnsi="TH Sarabun New" w:cs="TH Sarabun New"/>
+          <w:sz w:val="32"/>
+          <w:szCs w:val="32"/>
+          <w:cs/>
+        </w:rPr>
+        <w:t>๒.๒).............................................................. คุณภาพอยู่ในระดับ...............</w:t>
+      </w:r>
+    </w:p>
+    <w:p>
+      <w:pPr>
+        <w:spacing w:after="0" w:line="240" w:lineRule="auto"/>
+        <w:ind w:firstLine="1418"/>
+        <w:rPr>
+          <w:rFonts w:ascii="TH Sarabun New" w:hAnsi="TH Sarabun New" w:cs="TH Sarabun New"/>
+          <w:sz w:val="32"/>
+          <w:szCs w:val="32"/>
+        </w:rPr>
+      </w:pPr>
+      <w:r>
+        <w:rPr>
+          <w:rFonts w:ascii="TH Sarabun New" w:eastAsiaTheme="minorHAnsi" w:hAnsi="TH Sarabun New" w:cs="TH Sarabun New"/>
+          <w:sz w:val="32"/>
+          <w:szCs w:val="32"/>
+          <w:cs/>
+        </w:rPr>
+        <w:t>๓) ตำรา/หนังสือ............เล่ม คุณภาพ..(อยู่/ไม่อยู่)..ในเกณฑ์ที่</w:t>
+      </w:r>
+      <w:r>
+        <w:rPr>
+          <w:rFonts w:ascii="TH Sarabun New" w:eastAsiaTheme="minorHAnsi" w:hAnsi="TH Sarabun New" w:cs="TH Sarabun New"/>
+          <w:sz w:val="32"/>
+          <w:szCs w:val="32"/>
+          <w:cs/>
+        </w:rPr>
+        <w:t xml:space="preserve"> </w:t>
+      </w:r>
+      <w:r>
+        <w:rPr>
+          <w:rFonts w:ascii="TH Sarabun New" w:eastAsiaTheme="minorHAnsi" w:hAnsi="TH Sarabun New" w:cs="TH Sarabun New"/>
+          <w:sz w:val="32"/>
+          <w:szCs w:val="32"/>
+          <w:cs/>
+        </w:rPr>
+        <w:t>มหาวิทยาลัย</w:t>
+      </w:r>
+      <w:r>
+        <w:rPr>
+          <w:rFonts w:ascii="TH Sarabun New" w:eastAsiaTheme="minorHAnsi" w:hAnsi="TH Sarabun New" w:cs="TH Sarabun New"/>
+          <w:sz w:val="32"/>
+          <w:szCs w:val="32"/>
+          <w:cs/>
+        </w:rPr>
+        <w:t>กำหนด..........เล่ม</w:t>
+      </w:r>
+    </w:p>
+    <w:p>
+      <w:pPr>
+        <w:spacing w:after="0" w:line="240" w:lineRule="auto"/>
+        <w:rPr>
+          <w:rFonts w:ascii="TH Sarabun New" w:hAnsi="TH Sarabun New" w:cs="TH Sarabun New"/>
+          <w:sz w:val="32"/>
+          <w:szCs w:val="32"/>
+        </w:rPr>
+      </w:pPr>
+      <w:r>
+        <w:rPr>
+          <w:rFonts w:ascii="TH Sarabun New" w:eastAsiaTheme="minorHAnsi" w:hAnsi="TH Sarabun New" w:cs="TH Sarabun New"/>
+          <w:sz w:val="32"/>
+          <w:szCs w:val="32"/>
+          <w:cs/>
+        </w:rPr>
+        <w:t>ได้แก่</w:t>
+      </w:r>
+    </w:p>
+    <w:p>
+      <w:pPr>
+        <w:spacing w:after="0" w:line="240" w:lineRule="auto"/>
+        <w:ind w:left="1440" w:firstLine="720"/>
+        <w:rPr>
+          <w:rFonts w:ascii="TH Sarabun New" w:hAnsi="TH Sarabun New" w:cs="TH Sarabun New"/>
+          <w:sz w:val="32"/>
+          <w:szCs w:val="32"/>
+        </w:rPr>
+      </w:pPr>
+      <w:r>
+        <w:rPr>
+          <w:rFonts w:ascii="TH Sarabun New" w:eastAsiaTheme="minorHAnsi" w:hAnsi="TH Sarabun New" w:cs="TH Sarabun New"/>
+          <w:sz w:val="32"/>
+          <w:szCs w:val="32"/>
+          <w:cs/>
+        </w:rPr>
+        <w:t>๓.๑).............................................................. คุณภาพอยู่ในระดับ...............</w:t>
+      </w:r>
+    </w:p>
+    <w:p>
+      <w:pPr>
+        <w:spacing w:after="0" w:line="240" w:lineRule="auto"/>
+        <w:ind w:left="1440" w:firstLine="720"/>
+        <w:rPr>
+          <w:rFonts w:ascii="TH Sarabun New" w:hAnsi="TH Sarabun New" w:cs="TH Sarabun New"/>
+          <w:sz w:val="32"/>
+          <w:szCs w:val="32"/>
+        </w:rPr>
+      </w:pPr>
+      <w:r>
+        <w:rPr>
+          <w:rFonts w:ascii="TH Sarabun New" w:eastAsiaTheme="minorHAnsi" w:hAnsi="TH Sarabun New" w:cs="TH Sarabun New"/>
+          <w:sz w:val="32"/>
+          <w:szCs w:val="32"/>
+          <w:cs/>
+        </w:rPr>
+        <w:t>๓.๒).............................................................. คุณภาพอยู่ในระดับ...............</w:t>
+      </w:r>
+    </w:p>
+    <w:p>
+      <w:pPr>
+        <w:spacing w:after="0" w:line="240" w:lineRule="auto"/>
+        <w:ind w:firstLine="1440"/>
+        <w:rPr>
+          <w:rFonts w:ascii="TH Sarabun New" w:hAnsi="TH Sarabun New" w:cs="TH Sarabun New"/>
+          <w:sz w:val="32"/>
+          <w:szCs w:val="32"/>
+        </w:rPr>
+      </w:pPr>
+      <w:r>
+        <w:rPr>
+          <w:rFonts w:ascii="TH Sarabun New" w:eastAsiaTheme="minorHAnsi" w:hAnsi="TH Sarabun New" w:cs="TH Sarabun New"/>
+          <w:sz w:val="32"/>
+          <w:szCs w:val="32"/>
+          <w:cs/>
+        </w:rPr>
+        <w:t>๔) บทความทางวิชาการ............เรื่อง คุณภาพ..(อยู่/ไม่อยู่)..ในเกณฑ์ที่กำหนด........เรื่อง ได้แก่</w:t>
+      </w:r>
+    </w:p>
+    <w:p>
+      <w:pPr>
+        <w:tabs>
+          <w:tab w:val="left" w:pos="765"/>
+          <w:tab w:val="left" w:pos="2010"/>
+        </w:tabs>
+        <w:spacing w:after="0" w:line="240" w:lineRule="auto"/>
+        <w:rPr>
+          <w:rFonts w:ascii="TH Sarabun New" w:hAnsi="TH Sarabun New" w:cs="TH Sarabun New"/>
+          <w:sz w:val="32"/>
+          <w:szCs w:val="32"/>
+        </w:rPr>
+      </w:pPr>
+      <w:r>
+        <w:rPr>
+          <w:rFonts w:ascii="TH Sarabun New" w:eastAsiaTheme="minorHAnsi" w:hAnsi="TH Sarabun New" w:cs="TH Sarabun New"/>
+          <w:sz w:val="32"/>
+          <w:szCs w:val="32"/>
+          <w:cs/>
+        </w:rPr>
+        <w:tab/>
+      </w:r>
+      <w:r>
+        <w:rPr>
+          <w:rFonts w:ascii="TH Sarabun New" w:eastAsiaTheme="minorHAnsi" w:hAnsi="TH Sarabun New" w:cs="TH Sarabun New"/>
+          <w:sz w:val="32"/>
+          <w:szCs w:val="32"/>
+          <w:cs/>
+        </w:rPr>
+        <w:tab/>
+        <w:t>๔.๑).............................................................. คุณภาพอยู่ในระดับ...............</w:t>
+      </w:r>
+    </w:p>
+    <w:p>
+      <w:pPr>
+        <w:spacing w:after="0" w:line="240" w:lineRule="auto"/>
+        <w:ind w:left="1440" w:firstLine="545"/>
+        <w:rPr>
+          <w:rFonts w:ascii="TH Sarabun New" w:hAnsi="TH Sarabun New" w:cs="TH Sarabun New"/>
+          <w:sz w:val="32"/>
+          <w:szCs w:val="32"/>
+        </w:rPr>
+      </w:pPr>
+      <w:r>
+        <w:rPr>
+          <w:rFonts w:ascii="TH Sarabun New" w:eastAsiaTheme="minorHAnsi" w:hAnsi="TH Sarabun New" w:cs="TH Sarabun New"/>
+          <w:sz w:val="32"/>
+          <w:szCs w:val="32"/>
+          <w:cs/>
+        </w:rPr>
+        <w:t>๔.๒).............................................................. คุณภาพอยู่ในระดับ...............</w:t>
+      </w:r>
+    </w:p>
+    <w:p>
+      <w:pPr>
+        <w:spacing w:after="0" w:line="240" w:lineRule="auto"/>
+        <w:jc w:val="thaiDistribute"/>
+        <w:rPr>
+          <w:rFonts w:ascii="TH Sarabun New" w:hAnsi="TH Sarabun New" w:cs="TH Sarabun New"/>
+          <w:sz w:val="32"/>
+          <w:szCs w:val="32"/>
+        </w:rPr>
+      </w:pPr>
+      <w:r>
+        <w:rPr>
+          <w:rFonts w:ascii="TH Sarabun New" w:eastAsiaTheme="minorHAnsi" w:hAnsi="TH Sarabun New" w:cs="TH Sarabun New"/>
+          <w:sz w:val="32"/>
+          <w:szCs w:val="32"/>
+          <w:cs/>
+        </w:rPr>
+        <w:tab/>
+        <w:t>ผลงานทางวิชาการทุกประเภท</w:t>
+      </w:r>
+      <w:r>
+        <w:rPr>
+          <w:rFonts w:ascii="TH Sarabun New" w:eastAsiaTheme="minorHAnsi" w:hAnsi="TH Sarabun New" w:cs="TH Sarabun New"/>
+          <w:sz w:val="32"/>
+          <w:szCs w:val="32"/>
+          <w:cs/>
+        </w:rPr>
+        <w:t xml:space="preserve"> </w:t>
+      </w:r>
+      <w:r>
+        <w:rPr>
+          <w:rFonts w:ascii="TH Sarabun New" w:eastAsiaTheme="minorHAnsi" w:hAnsi="TH Sarabun New" w:cs="TH Sarabun New"/>
+          <w:sz w:val="32"/>
+          <w:szCs w:val="32"/>
+          <w:cs/>
+        </w:rPr>
+        <w:t xml:space="preserve">ให้เสนอโดยเขียนตามหลักของการเขียนเอกสารอ้างอิง อันประกอบด้วยชื่อผู้แต่ง ปี พ.ศ. ชื่อเรื่อง แหล่งพิมพ์ จำนวนหน้า เป็นต้น และกรณีที่เผยแพร่ในวารสารทางวิชาการให้ระบุว่าอยู่ในฐานข้อมูลใดตามประกาศ </w:t>
+      </w:r>
+      <w:proofErr w:type="spellStart"/>
+      <w:r>
+        <w:rPr>
+          <w:rFonts w:ascii="TH Sarabun New" w:eastAsiaTheme="minorHAnsi" w:hAnsi="TH Sarabun New" w:cs="TH Sarabun New"/>
+          <w:sz w:val="32"/>
+          <w:szCs w:val="32"/>
+          <w:cs/>
+        </w:rPr>
+        <w:t>ก.พ.อ</w:t>
+      </w:r>
+      <w:proofErr w:type="spellEnd"/>
+      <w:r>
+        <w:rPr>
+          <w:rFonts w:ascii="TH Sarabun New" w:eastAsiaTheme="minorHAnsi" w:hAnsi="TH Sarabun New" w:cs="TH Sarabun New"/>
+          <w:sz w:val="32"/>
+          <w:szCs w:val="32"/>
+          <w:cs/>
+        </w:rPr>
+        <w:t>. พร้อมทั้งระบุบทบาทหน้าที่ของผลงานแต่ละประเภท ตามลักษณะการมีส่วนร่วมในผลงานทางวิชาการตาม</w:t>
+      </w:r>
+      <w:r>
+        <w:rPr>
+          <w:rFonts w:ascii="TH Sarabun New" w:eastAsiaTheme="minorHAnsi" w:hAnsi="TH Sarabun New" w:cs="TH Sarabun New"/>
+          <w:sz w:val="32"/>
+          <w:szCs w:val="32"/>
+          <w:cs/>
+        </w:rPr>
+        <w:t>เอกสารแนบท้ายมหาวิทยาลัย</w:t>
+      </w:r>
+    </w:p>
+    <w:p>
+      <w:pPr>
+        <w:tabs>
+          <w:tab w:val="left" w:pos="1575"/>
+        </w:tabs>
+        <w:spacing w:after="0" w:line="240" w:lineRule="auto"/>
+        <w:jc w:val="thaiDistribute"/>
+        <w:rPr>
+          <w:rFonts w:ascii="TH Sarabun New" w:hAnsi="TH Sarabun New" w:cs="TH Sarabun New"/>
+          <w:b/>
+          <w:bCs/>
+          <w:sz w:val="32"/>
+          <w:szCs w:val="32"/>
+        </w:rPr>
+      </w:pPr>
+      <w:r>
+        <w:rPr>
+          <w:rFonts w:ascii="TH Sarabun New" w:eastAsiaTheme="minorHAnsi" w:hAnsi="TH Sarabun New" w:cs="TH Sarabun New"/>
+          <w:b/>
+          <w:bCs/>
+          <w:sz w:val="32"/>
+          <w:szCs w:val="32"/>
+          <w:cs/>
+        </w:rPr>
+        <w:lastRenderedPageBreak/>
+        <w:t>สรุปผลการประเมินผลงานทางวิชาการ (ประกอบด้วย: ผลงานมีเนื้อหาเกี่ยวกับเรื่องอะไร ผลที่ได้รับการนำไปใช้ประโยชน์ และแสดงให้เห็นถึงความเชี่ยวชาญอย่างไร</w:t>
+      </w:r>
+      <w:r>
+        <w:rPr>
+          <w:rFonts w:ascii="TH Sarabun New" w:eastAsiaTheme="minorHAnsi" w:hAnsi="TH Sarabun New" w:cs="TH Sarabun New"/>
+          <w:b/>
+          <w:bCs/>
+          <w:sz w:val="32"/>
+          <w:szCs w:val="32"/>
+          <w:cs/>
+        </w:rPr>
+        <w:t>)</w:t>
+      </w:r>
+    </w:p>
+    <w:p>
+      <w:pPr>
+        <w:spacing w:after="0" w:line="240" w:lineRule="auto"/>
+        <w:rPr>
+          <w:rFonts w:ascii="TH Sarabun New" w:hAnsi="TH Sarabun New" w:cs="TH Sarabun New"/>
+          <w:sz w:val="32"/>
+          <w:szCs w:val="32"/>
+        </w:rPr>
+      </w:pPr>
+      <w:r>
+        <w:rPr>
+          <w:rFonts w:ascii="TH Sarabun New" w:eastAsiaTheme="minorHAnsi" w:hAnsi="TH Sarabun New" w:cs="TH Sarabun New"/>
+          <w:sz w:val="32"/>
+          <w:szCs w:val="32"/>
+          <w:cs/>
+        </w:rPr>
+        <w:t>.................................................................................................................................................................</w:t>
+      </w:r>
+      <w:r>
+        <w:rPr>
+          <w:rFonts w:ascii="TH Sarabun New" w:eastAsiaTheme="minorHAnsi" w:hAnsi="TH Sarabun New" w:cs="TH Sarabun New"/>
+          <w:sz w:val="32"/>
+          <w:szCs w:val="32"/>
+          <w:cs/>
+        </w:rPr>
+        <w:t>..................</w:t>
+      </w:r>
+    </w:p>
+    <w:p>
+      <w:pPr>
+        <w:spacing w:after="0" w:line="240" w:lineRule="auto"/>
+        <w:rPr>
+          <w:rFonts w:ascii="TH Sarabun New" w:hAnsi="TH Sarabun New" w:cs="TH Sarabun New"/>
+          <w:sz w:val="32"/>
+          <w:szCs w:val="32"/>
+        </w:rPr>
+      </w:pPr>
+      <w:r>
+        <w:rPr>
+          <w:rFonts w:ascii="TH Sarabun New" w:eastAsiaTheme="minorHAnsi" w:hAnsi="TH Sarabun New" w:cs="TH Sarabun New"/>
+          <w:sz w:val="32"/>
+          <w:szCs w:val="32"/>
+          <w:cs/>
+        </w:rPr>
+        <w:t>................................................................................................................................................................................... ................................................................................................................................................................................... ...................................................................................................................................................................................</w:t>
+      </w:r>
+    </w:p>
+    <w:p>
+      <w:pPr>
+        <w:spacing w:after="0" w:line="240" w:lineRule="auto"/>
+        <w:rPr>
+          <w:rFonts w:ascii="TH Sarabun New" w:hAnsi="TH Sarabun New" w:cs="TH Sarabun New"/>
+          <w:sz w:val="32"/>
+          <w:szCs w:val="32"/>
+        </w:rPr>
+      </w:pPr>
+    </w:p>
+    <w:p>
+      <w:pPr>
+        <w:spacing w:after="0" w:line="240" w:lineRule="auto"/>
+        <w:rPr>
+          <w:rFonts w:ascii="TH Sarabun New" w:hAnsi="TH Sarabun New" w:cs="TH Sarabun New"/>
+          <w:sz w:val="32"/>
+          <w:szCs w:val="32"/>
+        </w:rPr>
+      </w:pPr>
+    </w:p>
+    <w:p>
+      <w:pPr>
+        <w:spacing w:after="0" w:line="240" w:lineRule="auto"/>
+        <w:jc w:val="center"/>
+        <w:rPr>
+          <w:rFonts w:ascii="TH Sarabun New" w:hAnsi="TH Sarabun New" w:cs="TH Sarabun New"/>
+          <w:sz w:val="32"/>
+          <w:szCs w:val="32"/>
+        </w:rPr>
+      </w:pPr>
+      <w:r>
+        <w:rPr>
+          <w:rFonts w:ascii="TH Sarabun New" w:eastAsiaTheme="minorHAnsi" w:hAnsi="TH Sarabun New" w:cs="TH Sarabun New"/>
+          <w:sz w:val="32"/>
+          <w:szCs w:val="32"/>
+          <w:cs/>
+        </w:rPr>
+        <w:t>ลงชื่อ.......................................................</w:t>
+      </w:r>
+    </w:p>
+    <w:p>
+      <w:pPr>
+        <w:spacing w:after="0" w:line="240" w:lineRule="auto"/>
+        <w:jc w:val="center"/>
+        <w:rPr>
+          <w:rFonts w:ascii="TH Sarabun New" w:hAnsi="TH Sarabun New" w:cs="TH Sarabun New"/>
+          <w:sz w:val="32"/>
+          <w:szCs w:val="32"/>
+        </w:rPr>
+      </w:pPr>
+      <w:r>
+        <w:rPr>
+          <w:rFonts w:ascii="TH Sarabun New" w:eastAsiaTheme="minorHAnsi" w:hAnsi="TH Sarabun New" w:cs="TH Sarabun New"/>
+          <w:sz w:val="32"/>
+          <w:szCs w:val="32"/>
+          <w:cs/>
+        </w:rPr>
+        <w:t>(.......................................................)</w:t>
+      </w:r>
+    </w:p>
+    <w:p>
+      <w:pPr>
+        <w:spacing w:after="0" w:line="240" w:lineRule="auto"/>
+        <w:jc w:val="center"/>
+        <w:rPr>
+          <w:rFonts w:ascii="TH Sarabun New" w:hAnsi="TH Sarabun New" w:cs="TH Sarabun New"/>
+          <w:sz w:val="32"/>
+          <w:szCs w:val="32"/>
+        </w:rPr>
+      </w:pPr>
+      <w:r>
+        <w:rPr>
+          <w:rFonts w:ascii="TH Sarabun New" w:eastAsiaTheme="minorHAnsi" w:hAnsi="TH Sarabun New" w:cs="TH Sarabun New"/>
+          <w:sz w:val="32"/>
+          <w:szCs w:val="32"/>
+          <w:cs/>
+        </w:rPr>
+        <w:t>ตำแหน่ง</w:t>
+      </w:r>
+      <w:r>
+        <w:rPr>
+          <w:rFonts w:ascii="TH Sarabun New" w:eastAsiaTheme="minorHAnsi" w:hAnsi="TH Sarabun New" w:cs="TH Sarabun New"/>
+          <w:sz w:val="32"/>
+          <w:szCs w:val="32"/>
+          <w:cs/>
+        </w:rPr>
+        <w:t xml:space="preserve"> </w:t>
+      </w:r>
+      <w:r>
+        <w:rPr>
+          <w:rFonts w:ascii="TH Sarabun New" w:eastAsiaTheme="minorHAnsi" w:hAnsi="TH Sarabun New" w:cs="TH Sarabun New"/>
+          <w:sz w:val="32"/>
+          <w:szCs w:val="32"/>
+          <w:cs/>
+        </w:rPr>
+        <w:t>ประธานคณะกรรมการผู้ทรงคุณวุฒิ</w:t>
+      </w:r>
+    </w:p>
+    <w:p>
+      <w:pPr>
+        <w:spacing w:after="0" w:line="240" w:lineRule="auto"/>
+        <w:jc w:val="center"/>
+        <w:rPr>
+          <w:rFonts w:ascii="TH Sarabun New" w:hAnsi="TH Sarabun New" w:cs="TH Sarabun New"/>
+          <w:sz w:val="32"/>
+          <w:szCs w:val="32"/>
+        </w:rPr>
+      </w:pPr>
+      <w:r>
+        <w:rPr>
+          <w:rFonts w:ascii="TH Sarabun New" w:eastAsiaTheme="minorHAnsi" w:hAnsi="TH Sarabun New" w:cs="TH Sarabun New"/>
+          <w:sz w:val="32"/>
+          <w:szCs w:val="32"/>
+          <w:cs/>
+        </w:rPr>
+        <w:t>เพื่อทำหน้าที่ประเมินผลงานทางวิชาการ</w:t>
+      </w:r>
+    </w:p>
+    <w:p>
+      <w:pPr>
+        <w:spacing w:after="0" w:line="240" w:lineRule="auto"/>
+        <w:jc w:val="center"/>
+        <w:rPr>
+          <w:rFonts w:ascii="TH Sarabun New" w:hAnsi="TH Sarabun New" w:cs="TH Sarabun New"/>
+          <w:sz w:val="32"/>
+          <w:szCs w:val="32"/>
+        </w:rPr>
+      </w:pPr>
+      <w:r>
+        <w:rPr>
+          <w:rFonts w:ascii="TH Sarabun New" w:eastAsiaTheme="minorHAnsi" w:hAnsi="TH Sarabun New" w:cs="TH Sarabun New"/>
+          <w:sz w:val="32"/>
+          <w:szCs w:val="32"/>
+          <w:cs/>
+        </w:rPr>
+        <w:t>และจริยธรรมและจรรยาบรรณทางวิชาการ</w:t>
+      </w:r>
+    </w:p>
+    <w:p>
+      <w:pPr>
+        <w:spacing w:after="0" w:line="240" w:lineRule="auto"/>
+        <w:jc w:val="center"/>
+        <w:rPr>
+          <w:rFonts w:ascii="TH Sarabun New" w:hAnsi="TH Sarabun New" w:cs="TH Sarabun New"/>
+          <w:sz w:val="32"/>
+          <w:szCs w:val="32"/>
+        </w:rPr>
+      </w:pPr>
+      <w:r>
+        <w:rPr>
+          <w:rFonts w:ascii="TH Sarabun New" w:eastAsiaTheme="minorHAnsi" w:hAnsi="TH Sarabun New" w:cs="TH Sarabun New"/>
+          <w:sz w:val="32"/>
+          <w:szCs w:val="32"/>
+          <w:cs/>
+        </w:rPr>
+        <w:t>วันที่......เดือน...................พ.ศ.........</w:t>
+      </w:r>
+    </w:p>
+    <w:p>
+      <w:pPr>
+        <w:spacing w:after="0" w:line="240" w:lineRule="auto"/>
+        <w:jc w:val="center"/>
+        <w:rPr>
+          <w:rFonts w:ascii="TH Sarabun New" w:hAnsi="TH Sarabun New" w:cs="TH Sarabun New"/>
+          <w:sz w:val="32"/>
+          <w:szCs w:val="32"/>
+        </w:rPr>
+      </w:pPr>
+    </w:p>
+    <w:p>
+      <w:pPr>
+        <w:spacing w:after="0" w:line="240" w:lineRule="auto"/>
+        <w:jc w:val="center"/>
+        <w:rPr>
+          <w:rFonts w:ascii="TH Sarabun New" w:hAnsi="TH Sarabun New" w:cs="TH Sarabun New"/>
+          <w:sz w:val="32"/>
+          <w:szCs w:val="32"/>
+        </w:rPr>
+      </w:pPr>
+    </w:p>
+    <w:p>
+      <w:pPr>
+        <w:spacing w:after="0" w:line="240" w:lineRule="auto"/>
+        <w:jc w:val="center"/>
+        <w:rPr>
+          <w:rFonts w:ascii="TH Sarabun New" w:hAnsi="TH Sarabun New" w:cs="TH Sarabun New"/>
+          <w:sz w:val="32"/>
+          <w:szCs w:val="32"/>
+        </w:rPr>
+      </w:pPr>
+    </w:p>
+    <w:p>
+      <w:pPr>
+        <w:spacing w:after="0" w:line="240" w:lineRule="auto"/>
+        <w:jc w:val="center"/>
+        <w:rPr>
+          <w:rFonts w:ascii="TH Sarabun New" w:hAnsi="TH Sarabun New" w:cs="TH Sarabun New"/>
+          <w:sz w:val="32"/>
+          <w:szCs w:val="32"/>
+        </w:rPr>
+      </w:pPr>
+    </w:p>
+    <w:p>
+      <w:pPr>
+        <w:spacing w:after="0" w:line="240" w:lineRule="auto"/>
+        <w:jc w:val="center"/>
+        <w:rPr>
+          <w:rFonts w:ascii="TH Sarabun New" w:hAnsi="TH Sarabun New" w:cs="TH Sarabun New"/>
+          <w:sz w:val="32"/>
+          <w:szCs w:val="32"/>
+        </w:rPr>
+      </w:pPr>
+    </w:p>
+    <w:p>
+      <w:pPr>
+        <w:spacing w:after="0" w:line="240" w:lineRule="auto"/>
+        <w:jc w:val="center"/>
+        <w:rPr>
+          <w:rFonts w:ascii="TH Sarabun New" w:hAnsi="TH Sarabun New" w:cs="TH Sarabun New"/>
+          <w:sz w:val="32"/>
+          <w:szCs w:val="32"/>
+        </w:rPr>
+      </w:pPr>
+    </w:p>
+    <w:p>
+      <w:pPr>
+        <w:spacing w:after="0" w:line="240" w:lineRule="auto"/>
+        <w:jc w:val="center"/>
+        <w:rPr>
+          <w:rFonts w:ascii="TH Sarabun New" w:hAnsi="TH Sarabun New" w:cs="TH Sarabun New"/>
+          <w:sz w:val="32"/>
+          <w:szCs w:val="32"/>
+        </w:rPr>
+      </w:pPr>
+    </w:p>
+    <w:p>
+      <w:pPr>
+        <w:spacing w:after="0" w:line="240" w:lineRule="auto"/>
+        <w:jc w:val="center"/>
+        <w:rPr>
+          <w:rFonts w:ascii="TH Sarabun New" w:hAnsi="TH Sarabun New" w:cs="TH Sarabun New"/>
+          <w:sz w:val="32"/>
+          <w:szCs w:val="32"/>
+        </w:rPr>
+      </w:pPr>
+    </w:p>
+    <w:p>
+      <w:pPr>
+        <w:spacing w:after="0" w:line="240" w:lineRule="auto"/>
+        <w:rPr>
+          <w:rFonts w:ascii="TH Sarabun New" w:hAnsi="TH Sarabun New" w:cs="TH Sarabun New"/>
+          <w:sz w:val="32"/>
+          <w:szCs w:val="32"/>
+        </w:rPr>
+      </w:pPr>
+    </w:p>
+    <w:p>
+      <w:pPr>
+        <w:spacing w:after="0" w:line="240" w:lineRule="auto"/>
+        <w:rPr>
+          <w:rFonts w:ascii="TH Sarabun New" w:hAnsi="TH Sarabun New" w:cs="TH Sarabun New"/>
+          <w:sz w:val="32"/>
+          <w:szCs w:val="32"/>
+        </w:rPr>
+      </w:pPr>
+    </w:p>
+    <w:p>
+      <w:pPr>
+        <w:spacing w:after="0" w:line="240" w:lineRule="auto"/>
+        <w:rPr>
+          <w:rFonts w:ascii="TH Sarabun New" w:hAnsi="TH Sarabun New" w:cs="TH Sarabun New"/>
+          <w:sz w:val="32"/>
+          <w:szCs w:val="32"/>
+        </w:rPr>
+      </w:pPr>
+    </w:p>
+    <w:p>
+      <w:pPr>
+        <w:spacing w:after="0" w:line="240" w:lineRule="auto"/>
+        <w:rPr>
+          <w:rFonts w:ascii="TH Sarabun New" w:hAnsi="TH Sarabun New" w:cs="TH Sarabun New"/>
+          <w:sz w:val="32"/>
+          <w:szCs w:val="32"/>
+        </w:rPr>
+      </w:pPr>
+    </w:p>
+    <w:p>
+      <w:pPr>
+        <w:spacing w:after="0" w:line="240" w:lineRule="auto"/>
+        <w:rPr>
+          <w:rFonts w:ascii="TH Sarabun New" w:hAnsi="TH Sarabun New" w:cs="TH Sarabun New"/>
+          <w:sz w:val="32"/>
+          <w:szCs w:val="32"/>
+        </w:rPr>
+      </w:pPr>
+    </w:p>
+    <w:p>
+      <w:pPr>
+        <w:spacing w:after="0" w:line="240" w:lineRule="auto"/>
+        <w:rPr>
+          <w:rFonts w:ascii="TH Sarabun New" w:hAnsi="TH Sarabun New" w:cs="TH Sarabun New"/>
+          <w:sz w:val="32"/>
+          <w:szCs w:val="32"/>
+        </w:rPr>
+      </w:pPr>
+    </w:p>
+    <w:p>
+      <w:pPr>
+        <w:spacing w:after="0" w:line="240" w:lineRule="auto"/>
+        <w:rPr>
+          <w:rFonts w:ascii="TH Sarabun New" w:hAnsi="TH Sarabun New" w:cs="TH Sarabun New"/>
+          <w:sz w:val="32"/>
+          <w:szCs w:val="32"/>
+        </w:rPr>
+      </w:pPr>
+    </w:p>
+    <w:p>
+      <w:pPr>
+        <w:spacing w:after="0" w:line="240" w:lineRule="auto"/>
+        <w:rPr>
+          <w:rFonts w:ascii="TH Sarabun New" w:hAnsi="TH Sarabun New" w:cs="TH Sarabun New"/>
+          <w:sz w:val="32"/>
+          <w:szCs w:val="32"/>
+        </w:rPr>
+      </w:pPr>
+    </w:p>
+    <w:p>
+      <w:pPr>
+        <w:spacing w:after="0" w:line="240" w:lineRule="auto"/>
+        <w:rPr>
+          <w:rFonts w:ascii="TH Sarabun New" w:hAnsi="TH Sarabun New" w:cs="TH Sarabun New"/>
+          <w:sz w:val="32"/>
+          <w:szCs w:val="32"/>
+        </w:rPr>
+      </w:pPr>
+    </w:p>
+    <w:p>
+      <w:pPr>
+        <w:spacing w:after="0" w:line="240" w:lineRule="auto"/>
+        <w:rPr>
+          <w:rFonts w:ascii="TH Sarabun New" w:hAnsi="TH Sarabun New" w:cs="TH Sarabun New"/>
+          <w:sz w:val="32"/>
+          <w:szCs w:val="32"/>
+        </w:rPr>
+      </w:pPr>
+    </w:p>
+    <w:p>
+      <w:pPr>
+        <w:spacing w:after="0" w:line="240" w:lineRule="auto"/>
+        <w:rPr>
+          <w:rFonts w:ascii="TH Sarabun New" w:hAnsi="TH Sarabun New" w:cs="TH Sarabun New"/>
+          <w:b/>
+          <w:bCs/>
+          <w:sz w:val="32"/>
+          <w:szCs w:val="32"/>
+        </w:rPr>
+      </w:pPr>
+      <w:r>
+        <w:rPr>
+          <w:rFonts w:ascii="TH Sarabun New" w:eastAsiaTheme="minorHAnsi" w:hAnsi="TH Sarabun New" w:cs="TH Sarabun New"/>
+          <w:b/>
+          <w:bCs/>
+          <w:sz w:val="32"/>
+          <w:szCs w:val="32"/>
+          <w:cs/>
+        </w:rPr>
+        <w:lastRenderedPageBreak/>
+        <w:t>ตอนที่</w:t>
+      </w:r>
+      <w:r>
+        <w:rPr>
+          <w:rFonts w:ascii="TH Sarabun New" w:eastAsiaTheme="minorHAnsi" w:hAnsi="TH Sarabun New" w:cs="TH Sarabun New"/>
+          <w:b/>
+          <w:bCs/>
+          <w:sz w:val="32"/>
+          <w:szCs w:val="32"/>
+          <w:cs/>
+        </w:rPr>
+        <w:t xml:space="preserve"> </w:t>
+      </w:r>
+      <w:r>
+        <w:rPr>
+          <w:rFonts w:ascii="TH Sarabun New" w:eastAsiaTheme="minorHAnsi" w:hAnsi="TH Sarabun New" w:cs="TH Sarabun New"/>
+          <w:b/>
+          <w:bCs/>
+          <w:sz w:val="32"/>
+          <w:szCs w:val="32"/>
+          <w:cs/>
+        </w:rPr>
+        <w:t>๒</w:t>
+      </w:r>
+      <w:r>
+        <w:rPr>
+          <w:rFonts w:ascii="TH Sarabun New" w:eastAsiaTheme="minorHAnsi" w:hAnsi="TH Sarabun New" w:cs="TH Sarabun New"/>
+          <w:b/>
+          <w:bCs/>
+          <w:sz w:val="32"/>
+          <w:szCs w:val="32"/>
+          <w:cs/>
+        </w:rPr>
+        <w:tab/>
+        <w:t>การพิจารณาของคณะกรรมการพิจารณาตำแหน่งทางวิชาการ</w:t>
+      </w:r>
+    </w:p>
+    <w:p>
+      <w:pPr>
+        <w:spacing w:after="0" w:line="240" w:lineRule="auto"/>
+        <w:rPr>
+          <w:rFonts w:ascii="TH Sarabun New" w:hAnsi="TH Sarabun New" w:cs="TH Sarabun New"/>
+          <w:sz w:val="16"/>
+          <w:szCs w:val="16"/>
+        </w:rPr>
+      </w:pPr>
+    </w:p>
+    <w:p>
+      <w:pPr>
+        <w:spacing w:after="0" w:line="240" w:lineRule="auto"/>
+        <w:ind w:left="720" w:firstLine="720"/>
+        <w:jc w:val="thaiDistribute"/>
+        <w:rPr>
+          <w:rFonts w:ascii="TH Sarabun New" w:hAnsi="TH Sarabun New" w:cs="TH Sarabun New"/>
+          <w:sz w:val="32"/>
+          <w:szCs w:val="32"/>
+        </w:rPr>
+      </w:pPr>
+      <w:r>
+        <w:rPr>
+          <w:rFonts w:ascii="TH Sarabun New" w:eastAsiaTheme="minorHAnsi" w:hAnsi="TH Sarabun New" w:cs="TH Sarabun New"/>
+          <w:sz w:val="32"/>
+          <w:szCs w:val="32"/>
+          <w:cs/>
+        </w:rPr>
+        <w:t>กรณีที่คณะกรรมการพิจารณาตำแหน่งทางวิชาการ...(มหาวิทยาลัย/สถาบัน)...</w:t>
+      </w:r>
+    </w:p>
+    <w:p>
+      <w:pPr>
+        <w:spacing w:after="0" w:line="240" w:lineRule="auto"/>
+        <w:jc w:val="thaiDistribute"/>
+        <w:rPr>
+          <w:rFonts w:ascii="TH Sarabun New" w:hAnsi="TH Sarabun New" w:cs="TH Sarabun New"/>
+          <w:sz w:val="32"/>
+          <w:szCs w:val="32"/>
+        </w:rPr>
+      </w:pPr>
+      <w:r>
+        <w:rPr>
+          <w:rFonts w:ascii="TH Sarabun New" w:eastAsiaTheme="minorHAnsi" w:hAnsi="TH Sarabun New" w:cs="TH Sarabun New"/>
+          <w:sz w:val="32"/>
+          <w:szCs w:val="32"/>
+          <w:cs/>
+        </w:rPr>
+        <w:t>ในการประชุมครั้งที่.....เมื่อวันที่...............พิจารณาผลการประเมินผลงานทางวิชาการของ</w:t>
+      </w:r>
+      <w:r>
+        <w:rPr>
+          <w:rFonts w:ascii="TH Sarabun New" w:eastAsiaTheme="minorHAnsi" w:hAnsi="TH Sarabun New" w:cs="TH Sarabun New"/>
+          <w:sz w:val="32"/>
+          <w:szCs w:val="32"/>
+          <w:cs/>
+        </w:rPr>
+        <w:t xml:space="preserve"> </w:t>
+      </w:r>
+      <w:r>
+        <w:rPr>
+          <w:rFonts w:ascii="TH Sarabun New" w:eastAsiaTheme="minorHAnsi" w:hAnsi="TH Sarabun New" w:cs="TH Sarabun New"/>
+          <w:sz w:val="32"/>
+          <w:szCs w:val="32"/>
+          <w:cs/>
+        </w:rPr>
+        <w:t>นาย/นาง/นางสาว................... ตามที่คณะกรรมการผู้ทรงคุณวุฒิเพื่อทำหน้าที่ประเมินผลงานทางวิชาการและจริยธรรมและจรรยาบรรณทางวิชาการเสนอ แล้วเห็นว่า..(งานวิจัย/ผลงานทางวิชาการในลักษณะอื่น/ตำรา/หนังสือ/บทความทางวิชาการ)...คุณภาพ...(อยู่/ ไม่อยู่)...ในเกณฑ์ที่</w:t>
+      </w:r>
+      <w:r>
+        <w:rPr>
+          <w:rFonts w:ascii="TH Sarabun New" w:eastAsiaTheme="minorHAnsi" w:hAnsi="TH Sarabun New" w:cs="TH Sarabun New"/>
+          <w:sz w:val="32"/>
+          <w:szCs w:val="32"/>
+          <w:cs/>
+        </w:rPr>
+        <w:t>มหาวิทยาลัย</w:t>
+      </w:r>
+      <w:r>
+        <w:rPr>
+          <w:rFonts w:ascii="TH Sarabun New" w:eastAsiaTheme="minorHAnsi" w:hAnsi="TH Sarabun New" w:cs="TH Sarabun New"/>
+          <w:sz w:val="32"/>
+          <w:szCs w:val="32"/>
+          <w:cs/>
+        </w:rPr>
+        <w:t>กำหนด และเป็นผู้มีจริยธรรมและจรรยาบรรณทางวิชาการตามเกณฑ์ที่</w:t>
+      </w:r>
+      <w:r>
+        <w:rPr>
+          <w:rFonts w:ascii="TH Sarabun New" w:eastAsiaTheme="minorHAnsi" w:hAnsi="TH Sarabun New" w:cs="TH Sarabun New"/>
+          <w:sz w:val="32"/>
+          <w:szCs w:val="32"/>
+          <w:cs/>
+        </w:rPr>
+        <w:t>มหาวิทยาลัย</w:t>
+      </w:r>
+      <w:r>
+        <w:rPr>
+          <w:rFonts w:ascii="TH Sarabun New" w:eastAsiaTheme="minorHAnsi" w:hAnsi="TH Sarabun New" w:cs="TH Sarabun New"/>
+          <w:sz w:val="32"/>
+          <w:szCs w:val="32"/>
+          <w:cs/>
+        </w:rPr>
+        <w:t>กำหนด</w:t>
+      </w:r>
+    </w:p>
+    <w:p>
+      <w:pPr>
+        <w:spacing w:after="0" w:line="240" w:lineRule="auto"/>
+        <w:jc w:val="thaiDistribute"/>
+        <w:rPr>
+          <w:rFonts w:ascii="TH Sarabun New" w:hAnsi="TH Sarabun New" w:cs="TH Sarabun New"/>
+          <w:sz w:val="32"/>
+          <w:szCs w:val="32"/>
+        </w:rPr>
+      </w:pPr>
+    </w:p>
+    <w:p>
+      <w:pPr>
+        <w:spacing w:after="0" w:line="240" w:lineRule="auto"/>
+        <w:ind w:firstLine="1418"/>
+        <w:jc w:val="thaiDistribute"/>
+        <w:rPr>
+          <w:rFonts w:ascii="TH Sarabun New" w:hAnsi="TH Sarabun New" w:cs="TH Sarabun New"/>
+          <w:sz w:val="32"/>
+          <w:szCs w:val="32"/>
+        </w:rPr>
+      </w:pPr>
+      <w:r>
+        <w:rPr>
+          <w:rFonts w:ascii="TH Sarabun New" w:eastAsiaTheme="minorHAnsi" w:hAnsi="TH Sarabun New" w:cs="TH Sarabun New"/>
+          <w:sz w:val="32"/>
+          <w:szCs w:val="32"/>
+          <w:cs/>
+        </w:rPr>
+        <w:t>จึงเห็น...(สมควร/ไม่สมควร)...ให้กำหนดตำแหน่ง นาย/นาง/นางสาว....................................... เป็นตำแหน่ง...</w:t>
+      </w:r>
+      <w:r>
+        <w:rPr>
+          <w:rFonts w:ascii="TH Sarabun New" w:eastAsiaTheme="minorHAnsi" w:hAnsi="TH Sarabun New" w:cs="TH Sarabun New"/>
+          <w:sz w:val="32"/>
+          <w:szCs w:val="32"/>
+        </w:rPr>
+        <w:t>...</w:t>
+      </w:r>
+      <w:r>
+        <w:rPr>
+          <w:rFonts w:ascii="TH Sarabun New" w:eastAsiaTheme="minorHAnsi" w:hAnsi="TH Sarabun New" w:cs="TH Sarabun New"/>
+          <w:sz w:val="32"/>
+          <w:szCs w:val="32"/>
+          <w:cs/>
+        </w:rPr>
+        <w:t>.....(ผู้ช่วยศาสตราจารย์/รองศาสตราจารย์/ศาสตราจารย์)... ในสาขาวิชา....................................... ได้ตั้งแต่วันที่.................................... ซึ่งเป็นวันที่สภา</w:t>
+      </w:r>
+      <w:r>
+        <w:rPr>
+          <w:rFonts w:ascii="TH Sarabun New" w:eastAsiaTheme="minorHAnsi" w:hAnsi="TH Sarabun New" w:cs="TH Sarabun New"/>
+          <w:sz w:val="32"/>
+          <w:szCs w:val="32"/>
+          <w:cs/>
+        </w:rPr>
+        <w:t xml:space="preserve">มหาวิทยาลัย </w:t>
+      </w:r>
+      <w:r>
+        <w:rPr>
+          <w:rFonts w:ascii="TH Sarabun New" w:eastAsiaTheme="minorHAnsi" w:hAnsi="TH Sarabun New" w:cs="TH Sarabun New"/>
+          <w:sz w:val="32"/>
+          <w:szCs w:val="32"/>
+          <w:cs/>
+        </w:rPr>
+        <w:t>ได้รับเรื่อง/ ได้รับผลงานฉบับปรับปรุงสมบูรณ์/ ได้รับผลงานฉบับตีพิมพ์เผยแพร่/ อื่นๆ ระบุ....)</w:t>
+      </w:r>
+      <w:r>
+        <w:rPr>
+          <w:rFonts w:ascii="TH Sarabun New" w:eastAsiaTheme="minorHAnsi" w:hAnsi="TH Sarabun New" w:cs="TH Sarabun New"/>
+          <w:sz w:val="32"/>
+          <w:szCs w:val="32"/>
+          <w:cs/>
+        </w:rPr>
+        <w:t xml:space="preserve"> </w:t>
+      </w:r>
+      <w:r>
+        <w:rPr>
+          <w:rFonts w:ascii="TH Sarabun New" w:eastAsiaTheme="minorHAnsi" w:hAnsi="TH Sarabun New" w:cs="TH Sarabun New"/>
+          <w:sz w:val="32"/>
+          <w:szCs w:val="32"/>
+          <w:cs/>
+        </w:rPr>
+        <w:t>และให้นำเสนอที่ประชุมสภ</w:t>
+      </w:r>
+      <w:r>
+        <w:rPr>
+          <w:rFonts w:ascii="TH Sarabun New" w:eastAsiaTheme="minorHAnsi" w:hAnsi="TH Sarabun New" w:cs="TH Sarabun New"/>
+          <w:sz w:val="32"/>
+          <w:szCs w:val="32"/>
+          <w:cs/>
+        </w:rPr>
+        <w:t>ามหาวิทยาลัย</w:t>
+      </w:r>
+      <w:r>
+        <w:rPr>
+          <w:rFonts w:ascii="TH Sarabun New" w:eastAsiaTheme="minorHAnsi" w:hAnsi="TH Sarabun New" w:cs="TH Sarabun New"/>
+          <w:sz w:val="32"/>
+          <w:szCs w:val="32"/>
+          <w:cs/>
+        </w:rPr>
+        <w:t xml:space="preserve"> พิจารณาให้ความเห็นชอบต่อไป</w:t>
+      </w:r>
+    </w:p>
+    <w:p>
+      <w:pPr>
+        <w:spacing w:after="0" w:line="240" w:lineRule="auto"/>
+        <w:rPr>
+          <w:rFonts w:ascii="TH Sarabun New" w:hAnsi="TH Sarabun New" w:cs="TH Sarabun New"/>
+          <w:sz w:val="32"/>
+          <w:szCs w:val="32"/>
+        </w:rPr>
+      </w:pPr>
+    </w:p>
+    <w:p>
+      <w:pPr>
+        <w:spacing w:after="0" w:line="240" w:lineRule="auto"/>
+        <w:rPr>
+          <w:rFonts w:ascii="TH Sarabun New" w:hAnsi="TH Sarabun New" w:cs="TH Sarabun New"/>
+          <w:sz w:val="32"/>
+          <w:szCs w:val="32"/>
+        </w:rPr>
+      </w:pPr>
+    </w:p>
+    <w:p>
+      <w:pPr>
+        <w:spacing w:after="0" w:line="240" w:lineRule="auto"/>
+        <w:jc w:val="center"/>
+        <w:rPr>
+          <w:rFonts w:ascii="TH Sarabun New" w:hAnsi="TH Sarabun New" w:cs="TH Sarabun New"/>
+          <w:sz w:val="32"/>
+          <w:szCs w:val="32"/>
+        </w:rPr>
+      </w:pPr>
+      <w:r>
+        <w:rPr>
+          <w:rFonts w:ascii="TH Sarabun New" w:eastAsiaTheme="minorHAnsi" w:hAnsi="TH Sarabun New" w:cs="TH Sarabun New"/>
+          <w:sz w:val="32"/>
+          <w:szCs w:val="32"/>
+          <w:cs/>
+        </w:rPr>
+        <w:t>ลงชื่อ....................................................</w:t>
+      </w:r>
+    </w:p>
+    <w:p>
+      <w:pPr>
+        <w:spacing w:after="0" w:line="240" w:lineRule="auto"/>
+        <w:jc w:val="center"/>
+        <w:rPr>
+          <w:rFonts w:ascii="TH Sarabun New" w:hAnsi="TH Sarabun New" w:cs="TH Sarabun New"/>
+          <w:sz w:val="32"/>
+          <w:szCs w:val="32"/>
+        </w:rPr>
+      </w:pPr>
+      <w:r>
+        <w:rPr>
+          <w:rFonts w:ascii="TH Sarabun New" w:eastAsiaTheme="minorHAnsi" w:hAnsi="TH Sarabun New" w:cs="TH Sarabun New"/>
+          <w:sz w:val="32"/>
+          <w:szCs w:val="32"/>
+          <w:cs/>
+        </w:rPr>
+        <w:t>(.......................................................)</w:t>
+      </w:r>
+    </w:p>
+    <w:p>
+      <w:pPr>
+        <w:spacing w:after="0" w:line="240" w:lineRule="auto"/>
+        <w:jc w:val="center"/>
+        <w:rPr>
+          <w:rFonts w:ascii="TH Sarabun New" w:hAnsi="TH Sarabun New" w:cs="TH Sarabun New"/>
+          <w:sz w:val="32"/>
+          <w:szCs w:val="32"/>
+        </w:rPr>
+      </w:pPr>
+      <w:r>
+        <w:rPr>
+          <w:rFonts w:ascii="TH Sarabun New" w:eastAsiaTheme="minorHAnsi" w:hAnsi="TH Sarabun New" w:cs="TH Sarabun New"/>
+          <w:sz w:val="32"/>
+          <w:szCs w:val="32"/>
+          <w:cs/>
+        </w:rPr>
+        <w:t>ตำแหน่ง ประธาน/ เลขานุการคณะกรรมการพิจารณาตำแหน่งทางวิชาการ</w:t>
+      </w:r>
+    </w:p>
+    <w:p>
+      <w:pPr>
+        <w:spacing w:after="0" w:line="240" w:lineRule="auto"/>
+        <w:jc w:val="center"/>
+        <w:rPr>
+          <w:rFonts w:ascii="TH Sarabun New" w:hAnsi="TH Sarabun New" w:cs="TH Sarabun New"/>
+          <w:sz w:val="32"/>
+          <w:szCs w:val="32"/>
+        </w:rPr>
+      </w:pPr>
+      <w:r>
+        <w:rPr>
+          <w:rFonts w:ascii="TH Sarabun New" w:eastAsiaTheme="minorHAnsi" w:hAnsi="TH Sarabun New" w:cs="TH Sarabun New"/>
+          <w:sz w:val="32"/>
+          <w:szCs w:val="32"/>
+          <w:cs/>
+        </w:rPr>
+        <w:t>วันที่......เดือน...................พ.ศ. ......</w:t>
+      </w:r>
+    </w:p>
+    <w:p>
+      <w:pPr>
+        <w:spacing w:after="0" w:line="240" w:lineRule="auto"/>
+        <w:rPr>
+          <w:rFonts w:ascii="TH Sarabun New" w:hAnsi="TH Sarabun New" w:cs="TH Sarabun New"/>
+          <w:sz w:val="32"/>
+          <w:szCs w:val="32"/>
+        </w:rPr>
+      </w:pPr>
+    </w:p>
+    <w:p>
+      <w:pPr>
+        <w:spacing w:after="0" w:line="240" w:lineRule="auto"/>
+        <w:rPr>
+          <w:rFonts w:ascii="TH Sarabun New" w:hAnsi="TH Sarabun New" w:cs="TH Sarabun New"/>
+          <w:sz w:val="32"/>
+          <w:szCs w:val="32"/>
+        </w:rPr>
+      </w:pPr>
+    </w:p>
+    <w:p>
+      <w:pPr>
+        <w:spacing w:after="0" w:line="240" w:lineRule="auto"/>
+        <w:rPr>
+          <w:rFonts w:ascii="TH Sarabun New" w:hAnsi="TH Sarabun New" w:cs="TH Sarabun New"/>
+          <w:sz w:val="32"/>
+          <w:szCs w:val="32"/>
+        </w:rPr>
+      </w:pPr>
+    </w:p>
+    <w:p>
+      <w:pPr>
+        <w:spacing w:after="0" w:line="240" w:lineRule="auto"/>
+        <w:rPr>
+          <w:rFonts w:ascii="TH Sarabun New" w:hAnsi="TH Sarabun New" w:cs="TH Sarabun New"/>
+          <w:sz w:val="32"/>
+          <w:szCs w:val="32"/>
+        </w:rPr>
+      </w:pPr>
+    </w:p>
+    <w:p>
+      <w:pPr>
+        <w:spacing w:after="0" w:line="240" w:lineRule="auto"/>
+        <w:rPr>
+          <w:rFonts w:ascii="TH Sarabun New" w:hAnsi="TH Sarabun New" w:cs="TH Sarabun New"/>
+          <w:sz w:val="32"/>
+          <w:szCs w:val="32"/>
+        </w:rPr>
+      </w:pPr>
+    </w:p>
+    <w:p>
+      <w:pPr>
+        <w:spacing w:after="0" w:line="240" w:lineRule="auto"/>
+        <w:rPr>
+          <w:rFonts w:ascii="TH Sarabun New" w:hAnsi="TH Sarabun New" w:cs="TH Sarabun New"/>
+          <w:sz w:val="32"/>
+          <w:szCs w:val="32"/>
+        </w:rPr>
+      </w:pPr>
+    </w:p>
+    <w:p>
+      <w:pPr>
+        <w:spacing w:after="0" w:line="240" w:lineRule="auto"/>
+        <w:rPr>
+          <w:rFonts w:ascii="TH Sarabun New" w:hAnsi="TH Sarabun New" w:cs="TH Sarabun New"/>
+          <w:sz w:val="32"/>
+          <w:szCs w:val="32"/>
+        </w:rPr>
+      </w:pPr>
+    </w:p>
+    <w:p>
+      <w:pPr>
+        <w:spacing w:after="0" w:line="240" w:lineRule="auto"/>
+        <w:rPr>
+          <w:rFonts w:ascii="TH Sarabun New" w:hAnsi="TH Sarabun New" w:cs="TH Sarabun New"/>
+          <w:sz w:val="32"/>
+          <w:szCs w:val="32"/>
+        </w:rPr>
+      </w:pPr>
+    </w:p>
+    <w:p>
+      <w:pPr>
+        <w:spacing w:after="0" w:line="240" w:lineRule="auto"/>
+        <w:rPr>
+          <w:rFonts w:ascii="TH Sarabun New" w:hAnsi="TH Sarabun New" w:cs="TH Sarabun New"/>
+          <w:sz w:val="32"/>
+          <w:szCs w:val="32"/>
+        </w:rPr>
+      </w:pPr>
+    </w:p>
+    <w:p>
+      <w:pPr>
+        <w:spacing w:after="0" w:line="240" w:lineRule="auto"/>
+        <w:rPr>
+          <w:rFonts w:ascii="TH Sarabun New" w:hAnsi="TH Sarabun New" w:cs="TH Sarabun New"/>
+          <w:sz w:val="32"/>
+          <w:szCs w:val="32"/>
+        </w:rPr>
+      </w:pPr>
+    </w:p>
+    <w:p>
+      <w:pPr>
+        <w:spacing w:after="0" w:line="240" w:lineRule="auto"/>
+        <w:rPr>
+          <w:rFonts w:ascii="TH Sarabun New" w:hAnsi="TH Sarabun New" w:cs="TH Sarabun New"/>
+          <w:sz w:val="32"/>
+          <w:szCs w:val="32"/>
+        </w:rPr>
+      </w:pPr>
+    </w:p>
+    <w:p>
+      <w:pPr>
+        <w:spacing w:after="0" w:line="240" w:lineRule="auto"/>
+        <w:rPr>
+          <w:rFonts w:ascii="TH Sarabun New" w:hAnsi="TH Sarabun New" w:cs="TH Sarabun New"/>
+          <w:sz w:val="32"/>
+          <w:szCs w:val="32"/>
+        </w:rPr>
+      </w:pPr>
+    </w:p>
+    <w:p>
+      <w:pPr>
+        <w:pStyle w:val="Heading1"/>
+        <w:rPr>
+          <w:rFonts w:ascii="TH Sarabun New" w:hAnsi="TH Sarabun New" w:cs="TH Sarabun New"/>
+          <w:sz w:val="32"/>
+          <w:szCs w:val="32"/>
+          <w:lang w:val="en-US" w:eastAsia="en-US"/>
+        </w:rPr>
+      </w:pPr>
+      <w:r>
+        <w:rPr>
+          <w:rFonts w:ascii="TH Sarabun New" w:hAnsi="TH Sarabun New" w:cs="TH Sarabun New"/>
+          <w:sz w:val="32"/>
+          <w:szCs w:val="32"/>
+          <w:cs/>
+          <w:lang w:val="en-US" w:eastAsia="en-US"/>
+        </w:rPr>
+        <w:lastRenderedPageBreak/>
+        <w:t xml:space="preserve">ส่วนที่  </w:t>
+      </w:r>
+      <w:r>
+        <w:rPr>
+          <w:rFonts w:ascii="TH Sarabun New" w:hAnsi="TH Sarabun New" w:cs="TH Sarabun New"/>
+          <w:sz w:val="32"/>
+          <w:szCs w:val="32"/>
+          <w:cs/>
+          <w:lang w:val="en-US" w:eastAsia="en-US"/>
+        </w:rPr>
+        <w:t>๕</w:t>
+      </w:r>
+      <w:r>
+        <w:rPr>
+          <w:rFonts w:ascii="TH Sarabun New" w:hAnsi="TH Sarabun New" w:cs="TH Sarabun New"/>
+          <w:sz w:val="32"/>
+          <w:szCs w:val="32"/>
+          <w:cs/>
+          <w:lang w:val="en-US" w:eastAsia="en-US"/>
+        </w:rPr>
+        <w:t xml:space="preserve"> มติสภามหาวิทยาลัยขอนแก่น</w:t>
+      </w:r>
+    </w:p>
+    <w:p>
+      <w:pPr>
+        <w:spacing w:after="160" w:line="259" w:lineRule="auto"/>
+        <w:jc w:val="thaiDistribute"/>
+        <w:rPr>
+          <w:rFonts w:ascii="TH Sarabun New" w:hAnsi="TH Sarabun New" w:cs="TH Sarabun New"/>
+          <w:sz w:val="32"/>
+          <w:szCs w:val="32"/>
+        </w:rPr>
+      </w:pPr>
+      <w:r>
+        <w:rPr>
+          <w:rFonts w:ascii="TH Sarabun New" w:eastAsiaTheme="minorHAnsi" w:hAnsi="TH Sarabun New" w:cs="TH Sarabun New"/>
+          <w:spacing w:val="-6"/>
+          <w:sz w:val="32"/>
+          <w:szCs w:val="32"/>
+        </w:rPr>
+        <w:tab/>
+      </w:r>
+      <w:r>
+        <w:rPr>
+          <w:rFonts w:ascii="TH Sarabun New" w:eastAsiaTheme="minorHAnsi" w:hAnsi="TH Sarabun New" w:cs="TH Sarabun New"/>
+          <w:spacing w:val="-6"/>
+          <w:sz w:val="32"/>
+          <w:szCs w:val="32"/>
+          <w:cs/>
+        </w:rPr>
+        <w:t>คณะกรรมการพิจารณาตำแหน่งทางวิชาการ มหาวิทยาลัยขอนแก่น ในการประชุม</w:t>
+      </w:r>
+      <w:r>
+        <w:rPr>
+          <w:rFonts w:ascii="TH Sarabun New" w:eastAsiaTheme="minorHAnsi" w:hAnsi="TH Sarabun New" w:cs="TH Sarabun New"/>
+          <w:spacing w:val="-6"/>
+          <w:sz w:val="32"/>
+          <w:szCs w:val="32"/>
+          <w:cs/>
+        </w:rPr>
+        <w:t xml:space="preserve"> </w:t>
+      </w:r>
+      <w:r>
+        <w:rPr>
+          <w:rFonts w:ascii="TH Sarabun New" w:eastAsiaTheme="minorHAnsi" w:hAnsi="TH Sarabun New" w:cs="TH Sarabun New"/>
+          <w:spacing w:val="-6"/>
+          <w:sz w:val="32"/>
+          <w:szCs w:val="32"/>
+          <w:cs/>
+        </w:rPr>
+        <w:t>ครั้งที่......../.......                เมื่อวันที่ ........เดือน........พ.ศ.......... พิจารณาเห็นว่านาย/นาง/นางสาว...................................................เป็นผู้มีคุณสมบัติ</w:t>
+      </w:r>
+      <w:r>
+        <w:rPr>
+          <w:rFonts w:ascii="TH Sarabun New" w:eastAsiaTheme="minorHAnsi" w:hAnsi="TH Sarabun New" w:cs="TH Sarabun New"/>
+          <w:spacing w:val="-6"/>
+          <w:sz w:val="32"/>
+          <w:szCs w:val="32"/>
+          <w:cs/>
+        </w:rPr>
+        <w:t>...(เข้าข่าย/ไม่เข้าข่าย)</w:t>
+      </w:r>
+      <w:r>
+        <w:rPr>
+          <w:rFonts w:ascii="TH Sarabun New" w:eastAsiaTheme="minorHAnsi" w:hAnsi="TH Sarabun New" w:cs="TH Sarabun New"/>
+          <w:spacing w:val="-6"/>
+          <w:sz w:val="32"/>
+          <w:szCs w:val="32"/>
+          <w:cs/>
+        </w:rPr>
+        <w:t xml:space="preserve"> </w:t>
+      </w:r>
+      <w:r>
+        <w:rPr>
+          <w:rFonts w:ascii="TH Sarabun New" w:eastAsiaTheme="minorHAnsi" w:hAnsi="TH Sarabun New" w:cs="TH Sarabun New"/>
+          <w:spacing w:val="-6"/>
+          <w:sz w:val="32"/>
+          <w:szCs w:val="32"/>
+          <w:cs/>
+        </w:rPr>
+        <w:t>ที่จะได้รับการ</w:t>
+      </w:r>
+      <w:r>
+        <w:rPr>
+          <w:rFonts w:ascii="TH Sarabun New" w:eastAsiaTheme="minorHAnsi" w:hAnsi="TH Sarabun New" w:cs="TH Sarabun New"/>
+          <w:sz w:val="32"/>
+          <w:szCs w:val="32"/>
+          <w:cs/>
+        </w:rPr>
+        <w:t>แต่งตั้งให้ดำรงตำแหน่ง</w:t>
+      </w:r>
+      <w:r>
+        <w:rPr>
+          <w:rFonts w:ascii="TH Sarabun New" w:eastAsiaTheme="minorHAnsi" w:hAnsi="TH Sarabun New" w:cs="TH Sarabun New"/>
+          <w:sz w:val="32"/>
+          <w:szCs w:val="32"/>
+          <w:cs/>
+        </w:rPr>
+        <w:t xml:space="preserve"> </w:t>
+      </w:r>
+      <w:r>
+        <w:rPr>
+          <w:rFonts w:ascii="TH Sarabun New" w:eastAsiaTheme="minorHAnsi" w:hAnsi="TH Sarabun New" w:cs="TH Sarabun New"/>
+          <w:sz w:val="32"/>
+          <w:szCs w:val="32"/>
+          <w:cs/>
+        </w:rPr>
+        <w:t>(ผู้ช่วยศาสตราจารย์/รองศาสตราจารย์/ ศาสตราจารย์)  ในสาขาวิชา....................................</w:t>
+      </w:r>
+    </w:p>
+    <w:p>
+      <w:pPr>
+        <w:spacing w:after="160" w:line="259" w:lineRule="auto"/>
+        <w:ind w:firstLine="720"/>
+        <w:jc w:val="thaiDistribute"/>
+        <w:rPr>
+          <w:rFonts w:ascii="TH Sarabun New" w:hAnsi="TH Sarabun New" w:cs="TH Sarabun New"/>
+          <w:sz w:val="32"/>
+          <w:szCs w:val="32"/>
+        </w:rPr>
+      </w:pPr>
+      <w:r>
+        <w:rPr>
+          <w:rFonts w:ascii="TH Sarabun New" w:eastAsiaTheme="minorHAnsi" w:hAnsi="TH Sarabun New" w:cs="TH Sarabun New"/>
+          <w:spacing w:val="-6"/>
+          <w:sz w:val="32"/>
+          <w:szCs w:val="32"/>
+          <w:cs/>
+        </w:rPr>
+        <w:t xml:space="preserve">สภามหาวิทยาลัยขอนแก่น ในการประชุมครั้งที่.............../.............. เมื่อวันที่ </w:t>
+      </w:r>
+      <w:r>
+        <w:rPr>
+          <w:rFonts w:ascii="TH Sarabun New" w:eastAsiaTheme="minorHAnsi" w:hAnsi="TH Sarabun New" w:cs="TH Sarabun New"/>
+          <w:spacing w:val="-6"/>
+          <w:sz w:val="32"/>
+          <w:szCs w:val="32"/>
+          <w:cs/>
+        </w:rPr>
+        <w:t>...........เด</w:t>
+      </w:r>
+      <w:r>
+        <w:rPr>
+          <w:rFonts w:ascii="TH Sarabun New" w:eastAsiaTheme="minorHAnsi" w:hAnsi="TH Sarabun New" w:cs="TH Sarabun New"/>
+          <w:spacing w:val="-6"/>
+          <w:sz w:val="32"/>
+          <w:szCs w:val="32"/>
+          <w:cs/>
+        </w:rPr>
+        <w:t>ื</w:t>
+      </w:r>
+      <w:r>
+        <w:rPr>
+          <w:rFonts w:ascii="TH Sarabun New" w:eastAsiaTheme="minorHAnsi" w:hAnsi="TH Sarabun New" w:cs="TH Sarabun New"/>
+          <w:spacing w:val="-6"/>
+          <w:sz w:val="32"/>
+          <w:szCs w:val="32"/>
+          <w:cs/>
+        </w:rPr>
+        <w:t>อน..............พ.ศ...............</w:t>
+      </w:r>
+      <w:r>
+        <w:rPr>
+          <w:rFonts w:ascii="TH Sarabun New" w:eastAsiaTheme="minorHAnsi" w:hAnsi="TH Sarabun New" w:cs="TH Sarabun New"/>
+          <w:spacing w:val="-6"/>
+          <w:sz w:val="32"/>
+          <w:szCs w:val="32"/>
+          <w:cs/>
+        </w:rPr>
+        <w:t xml:space="preserve"> พิจารณาแล้ว</w:t>
+      </w:r>
+      <w:r>
+        <w:rPr>
+          <w:rFonts w:ascii="TH Sarabun New" w:eastAsiaTheme="minorHAnsi" w:hAnsi="TH Sarabun New" w:cs="TH Sarabun New"/>
+          <w:sz w:val="32"/>
+          <w:szCs w:val="32"/>
+          <w:cs/>
+        </w:rPr>
+        <w:t>มีมติ</w:t>
+      </w:r>
+      <w:r>
+        <w:rPr>
+          <w:rFonts w:ascii="TH Sarabun New" w:eastAsiaTheme="minorHAnsi" w:hAnsi="TH Sarabun New" w:cs="TH Sarabun New"/>
+          <w:sz w:val="32"/>
+          <w:szCs w:val="32"/>
+          <w:cs/>
+        </w:rPr>
+        <w:t>.... (อนุมัติ/ไม่อนุมัติ)....</w:t>
+      </w:r>
+      <w:r>
+        <w:rPr>
+          <w:rFonts w:ascii="TH Sarabun New" w:eastAsiaTheme="minorHAnsi" w:hAnsi="TH Sarabun New" w:cs="TH Sarabun New"/>
+          <w:sz w:val="32"/>
+          <w:szCs w:val="32"/>
+          <w:cs/>
+        </w:rPr>
+        <w:t>ให้แต่งตั้ง</w:t>
+      </w:r>
+      <w:r>
+        <w:rPr>
+          <w:rFonts w:ascii="TH Sarabun New" w:eastAsiaTheme="minorHAnsi" w:hAnsi="TH Sarabun New" w:cs="TH Sarabun New"/>
+          <w:sz w:val="32"/>
+          <w:szCs w:val="32"/>
+          <w:cs/>
+        </w:rPr>
+        <w:t>นาย/นาง/นางสาว.............................................</w:t>
+      </w:r>
+      <w:r>
+        <w:rPr>
+          <w:rFonts w:ascii="TH Sarabun New" w:eastAsiaTheme="minorHAnsi" w:hAnsi="TH Sarabun New" w:cs="TH Sarabun New"/>
+          <w:sz w:val="32"/>
+          <w:szCs w:val="32"/>
+          <w:cs/>
+        </w:rPr>
+        <w:t>ดำรงตำแหน่ง</w:t>
+      </w:r>
+      <w:r>
+        <w:rPr>
+          <w:rFonts w:ascii="TH Sarabun New" w:eastAsiaTheme="minorHAnsi" w:hAnsi="TH Sarabun New" w:cs="TH Sarabun New"/>
+          <w:sz w:val="32"/>
+          <w:szCs w:val="32"/>
+          <w:cs/>
+        </w:rPr>
+        <w:t>(ผู้ช่วยศาสตราจารย์/ รองศาสตราจารย์/ ศาสตราจารย์) ในสาขาวิชา.............</w:t>
+      </w:r>
+      <w:r>
+        <w:rPr>
+          <w:rFonts w:ascii="TH Sarabun New" w:eastAsiaTheme="minorHAnsi" w:hAnsi="TH Sarabun New" w:cs="TH Sarabun New"/>
+          <w:sz w:val="32"/>
+          <w:szCs w:val="32"/>
+          <w:cs/>
+        </w:rPr>
+        <w:t>.......................</w:t>
+      </w:r>
+      <w:r>
+        <w:rPr>
+          <w:rFonts w:ascii="TH Sarabun New" w:eastAsiaTheme="minorHAnsi" w:hAnsi="TH Sarabun New" w:cs="TH Sarabun New"/>
+          <w:sz w:val="32"/>
+          <w:szCs w:val="32"/>
+          <w:cs/>
+        </w:rPr>
+        <w:t>ได้ตั้งแต่วันที่...........................ซึ่งเป็นวันที่สภา</w:t>
+      </w:r>
+      <w:r>
+        <w:rPr>
+          <w:rFonts w:ascii="TH Sarabun New" w:eastAsiaTheme="minorHAnsi" w:hAnsi="TH Sarabun New" w:cs="TH Sarabun New"/>
+          <w:sz w:val="32"/>
+          <w:szCs w:val="32"/>
+          <w:cs/>
+        </w:rPr>
+        <w:t>มหาวิทยาลั</w:t>
+      </w:r>
+      <w:r>
+        <w:rPr>
+          <w:rFonts w:ascii="TH Sarabun New" w:eastAsiaTheme="minorHAnsi" w:hAnsi="TH Sarabun New" w:cs="TH Sarabun New"/>
+          <w:sz w:val="32"/>
+          <w:szCs w:val="32"/>
+          <w:cs/>
+        </w:rPr>
+        <w:t>ย</w:t>
+      </w:r>
+      <w:r>
+        <w:rPr>
+          <w:rFonts w:ascii="TH Sarabun New" w:eastAsiaTheme="minorHAnsi" w:hAnsi="TH Sarabun New" w:cs="TH Sarabun New"/>
+          <w:sz w:val="32"/>
+          <w:szCs w:val="32"/>
+          <w:cs/>
+        </w:rPr>
+        <w:t>...(ได้รับเรื่อง/ ได้รับผลงานฉบับปรับปรุงสมบูรณ์/</w:t>
+      </w:r>
+      <w:r>
+        <w:rPr>
+          <w:rFonts w:ascii="TH Sarabun New" w:eastAsiaTheme="minorHAnsi" w:hAnsi="TH Sarabun New" w:cs="TH Sarabun New"/>
+          <w:sz w:val="32"/>
+          <w:szCs w:val="32"/>
+          <w:cs/>
+        </w:rPr>
+        <w:t>ได้รับผลงานฉบับตีพิมพ์เผยแพร่/อื่น ๆ ระบุ .....)</w:t>
+      </w:r>
+    </w:p>
+    <w:p>
+      <w:pPr>
+        <w:spacing w:after="0" w:line="240" w:lineRule="auto"/>
+        <w:rPr>
+          <w:rFonts w:ascii="TH Sarabun New" w:hAnsi="TH Sarabun New" w:cs="TH Sarabun New"/>
+          <w:sz w:val="32"/>
+          <w:szCs w:val="32"/>
+        </w:rPr>
+      </w:pPr>
+    </w:p>
+    <w:p>
+      <w:pPr>
+        <w:spacing w:after="0" w:line="240" w:lineRule="auto"/>
+        <w:rPr>
+          <w:rFonts w:ascii="TH Sarabun New" w:hAnsi="TH Sarabun New" w:cs="TH Sarabun New"/>
+          <w:sz w:val="32"/>
+          <w:szCs w:val="32"/>
+        </w:rPr>
+      </w:pPr>
+    </w:p>
+    <w:p>
+      <w:pPr>
+        <w:spacing w:after="0" w:line="240" w:lineRule="auto"/>
+        <w:jc w:val="center"/>
+        <w:rPr>
+          <w:rFonts w:ascii="TH Sarabun New" w:hAnsi="TH Sarabun New" w:cs="TH Sarabun New"/>
+          <w:sz w:val="32"/>
+          <w:szCs w:val="32"/>
+        </w:rPr>
+      </w:pPr>
+      <w:r>
+        <w:rPr>
+          <w:rFonts w:ascii="TH Sarabun New" w:eastAsiaTheme="minorHAnsi" w:hAnsi="TH Sarabun New" w:cs="TH Sarabun New"/>
+          <w:sz w:val="32"/>
+          <w:szCs w:val="32"/>
+          <w:cs/>
+        </w:rPr>
+        <w:t>ลงชื่อ......................................................</w:t>
+      </w:r>
+    </w:p>
+    <w:p>
+      <w:pPr>
+        <w:spacing w:after="0" w:line="240" w:lineRule="auto"/>
+        <w:jc w:val="center"/>
+        <w:rPr>
+          <w:rFonts w:ascii="TH Sarabun New" w:hAnsi="TH Sarabun New" w:cs="TH Sarabun New"/>
+          <w:sz w:val="32"/>
+          <w:szCs w:val="32"/>
+        </w:rPr>
+      </w:pPr>
+      <w:r>
+        <w:rPr>
+          <w:rFonts w:ascii="TH Sarabun New" w:eastAsiaTheme="minorHAnsi" w:hAnsi="TH Sarabun New" w:cs="TH Sarabun New"/>
+          <w:sz w:val="32"/>
+          <w:szCs w:val="32"/>
+          <w:cs/>
+        </w:rPr>
+        <w:t>(........................................................)</w:t>
+      </w:r>
+    </w:p>
+    <w:p>
+      <w:pPr>
+        <w:spacing w:after="0" w:line="240" w:lineRule="auto"/>
+        <w:jc w:val="center"/>
+        <w:rPr>
+          <w:rFonts w:ascii="TH Sarabun New" w:hAnsi="TH Sarabun New" w:cs="TH Sarabun New"/>
+          <w:sz w:val="32"/>
+          <w:szCs w:val="32"/>
+        </w:rPr>
+      </w:pPr>
+      <w:r>
+        <w:rPr>
+          <w:rFonts w:ascii="TH Sarabun New" w:eastAsiaTheme="minorHAnsi" w:hAnsi="TH Sarabun New" w:cs="TH Sarabun New"/>
+          <w:sz w:val="32"/>
+          <w:szCs w:val="32"/>
+          <w:cs/>
+        </w:rPr>
+        <w:t>ตำแหน่ง</w:t>
+      </w:r>
+      <w:r>
+        <w:rPr>
+          <w:rFonts w:ascii="TH Sarabun New" w:eastAsiaTheme="minorHAnsi" w:hAnsi="TH Sarabun New" w:cs="TH Sarabun New"/>
+          <w:sz w:val="32"/>
+          <w:szCs w:val="32"/>
+          <w:cs/>
+        </w:rPr>
+        <w:t xml:space="preserve"> </w:t>
+      </w:r>
+      <w:r>
+        <w:rPr>
+          <w:rFonts w:ascii="TH Sarabun New" w:eastAsiaTheme="minorHAnsi" w:hAnsi="TH Sarabun New" w:cs="TH Sarabun New"/>
+          <w:sz w:val="32"/>
+          <w:szCs w:val="32"/>
+          <w:cs/>
+        </w:rPr>
+        <w:t>เลขานุการสภามหาวิทยาลัยขอนแก่น</w:t>
+      </w:r>
+    </w:p>
+    <w:p>
+      <w:pPr>
+        <w:spacing w:after="0" w:line="240" w:lineRule="auto"/>
+        <w:jc w:val="center"/>
+        <w:rPr>
+          <w:rFonts w:ascii="TH Sarabun New" w:hAnsi="TH Sarabun New" w:cs="TH Sarabun New"/>
+          <w:sz w:val="32"/>
+          <w:szCs w:val="32"/>
+        </w:rPr>
+      </w:pPr>
+      <w:r>
+        <w:rPr>
+          <w:rFonts w:ascii="TH Sarabun New" w:eastAsiaTheme="minorHAnsi" w:hAnsi="TH Sarabun New" w:cs="TH Sarabun New"/>
+          <w:sz w:val="32"/>
+          <w:szCs w:val="32"/>
+          <w:cs/>
+        </w:rPr>
+        <w:t>วันที่......เดือน...................พ.ศ. ......</w:t>
+      </w:r>
+    </w:p>
+    <w:p>
+      <w:pPr>
+        <w:spacing w:after="0" w:line="240" w:lineRule="auto"/>
+        <w:rPr>
+          <w:rFonts w:ascii="TH Sarabun New" w:hAnsi="TH Sarabun New" w:cs="TH Sarabun New"/>
+          <w:sz w:val="32"/>
+          <w:szCs w:val="32"/>
+        </w:rPr>
+      </w:pPr>
+    </w:p>
+    <w:p>
+      <w:pPr>
+        <w:spacing w:after="0" w:line="240" w:lineRule="auto"/>
+        <w:rPr>
+          <w:rFonts w:ascii="TH Sarabun New" w:hAnsi="TH Sarabun New" w:cs="TH Sarabun New"/>
+          <w:sz w:val="32"/>
+          <w:szCs w:val="32"/>
+        </w:rPr>
+      </w:pPr>
+    </w:p>
+    <w:p>
+      <w:pPr>
+        <w:spacing w:after="0" w:line="240" w:lineRule="auto"/>
+        <w:rPr>
+          <w:rFonts w:ascii="TH Sarabun New" w:hAnsi="TH Sarabun New" w:cs="TH Sarabun New"/>
+          <w:sz w:val="32"/>
+          <w:szCs w:val="32"/>
+        </w:rPr>
+      </w:pPr>
     </w:p>
     <w:sectPr>
       <w:headerReference w:type="default" r:id="rId8"/>

</xml_diff>

<commit_message>
Update Phase 2 document template
Refresh the Phase 2 Word template for p2doc_1 to reflect the latest document layout and content requirements.
</commit_message>
<xml_diff>
--- a/HRCP-KKU-Academic/src/main/resources/templates/docx/Phase2/p2doc_1.docx
+++ b/HRCP-KKU-Academic/src/main/resources/templates/docx/Phase2/p2doc_1.docx
@@ -4,6 +4,235 @@
   <w:body>
     <w:p>
       <w:pPr>
+        <w:rPr>
+          <w:rFonts w:ascii="TH Sarabun New" w:eastAsiaTheme="minorHAnsi" w:hAnsi="TH Sarabun New" w:cs="TH Sarabun New"/>
+          <w:b/>
+          <w:bCs/>
+          <w:sz w:val="32"/>
+          <w:szCs w:val="32"/>
+          <w:cs/>
+        </w:rPr>
+      </w:pPr>
+      <w:r>
+        <w:rPr>
+          <w:rFonts w:ascii="TH Sarabun New" w:hAnsi="TH Sarabun New" w:cs="TH Sarabun New"/>
+          <w:b/>
+          <w:bCs/>
+          <w:noProof/>
+          <w:sz w:val="32"/>
+          <w:szCs w:val="32"/>
+          <w:lang w:val="th-TH"/>
+        </w:rPr>
+        <mc:AlternateContent>
+          <mc:Choice Requires="wps">
+            <w:drawing>
+              <wp:anchor distT="0" distB="0" distL="114300" distR="114300" simplePos="0" relativeHeight="251659264" behindDoc="0" locked="0" layoutInCell="1" allowOverlap="1" wp14:anchorId="22BA597F" wp14:editId="4854BCCF">
+                <wp:simplePos x="0" y="0"/>
+                <wp:positionH relativeFrom="margin">
+                  <wp:align>center</wp:align>
+                </wp:positionH>
+                <wp:positionV relativeFrom="paragraph">
+                  <wp:posOffset>3703320</wp:posOffset>
+                </wp:positionV>
+                <wp:extent cx="4524375" cy="1076325"/>
+                <wp:effectExtent l="0" t="0" r="9525" b="9525"/>
+                <wp:wrapNone/>
+                <wp:docPr id="608024153" name="Rectangle 1"/>
+                <wp:cNvGraphicFramePr/>
+                <a:graphic xmlns:a="http://schemas.openxmlformats.org/drawingml/2006/main">
+                  <a:graphicData uri="http://schemas.microsoft.com/office/word/2010/wordprocessingShape">
+                    <wps:wsp>
+                      <wps:cNvSpPr/>
+                      <wps:spPr>
+                        <a:xfrm>
+                          <a:off x="0" y="0"/>
+                          <a:ext cx="4524375" cy="1076325"/>
+                        </a:xfrm>
+                        <a:prstGeom prst="rect">
+                          <a:avLst/>
+                        </a:prstGeom>
+                        <a:ln>
+                          <a:noFill/>
+                        </a:ln>
+                      </wps:spPr>
+                      <wps:style>
+                        <a:lnRef idx="2">
+                          <a:schemeClr val="accent6"/>
+                        </a:lnRef>
+                        <a:fillRef idx="1">
+                          <a:schemeClr val="lt1"/>
+                        </a:fillRef>
+                        <a:effectRef idx="0">
+                          <a:schemeClr val="accent6"/>
+                        </a:effectRef>
+                        <a:fontRef idx="minor">
+                          <a:schemeClr val="dk1"/>
+                        </a:fontRef>
+                      </wps:style>
+                      <wps:txbx>
+                        <w:txbxContent>
+                          <w:p>
+                            <w:pPr>
+                              <w:spacing w:after="160" w:line="259" w:lineRule="auto"/>
+                              <w:jc w:val="center"/>
+                              <w:rPr>
+                                <w:rFonts w:ascii="TH Sarabun New" w:hAnsi="TH Sarabun New" w:cs="TH Sarabun New"/>
+                                <w:b/>
+                                <w:bCs/>
+                                <w:sz w:val="72"/>
+                                <w:szCs w:val="72"/>
+                                <w:cs/>
+                              </w:rPr>
+                            </w:pPr>
+                            <w:r>
+                              <w:rPr>
+                                <w:rFonts w:ascii="TH Sarabun New" w:eastAsiaTheme="minorHAnsi" w:hAnsi="TH Sarabun New" w:cs="TH Sarabun New"/>
+                                <w:b/>
+                                <w:bCs/>
+                                <w:sz w:val="72"/>
+                                <w:szCs w:val="72"/>
+                                <w:cs/>
+                              </w:rPr>
+                              <w:t>แบบ ก.พ.</w:t>
+                            </w:r>
+                            <w:r>
+                              <w:rPr>
+                                <w:rFonts w:ascii="TH Sarabun New" w:eastAsiaTheme="minorHAnsi" w:hAnsi="TH Sarabun New" w:cs="TH Sarabun New" w:hint="cs"/>
+                                <w:b/>
+                                <w:bCs/>
+                                <w:sz w:val="72"/>
+                                <w:szCs w:val="72"/>
+                                <w:cs/>
+                              </w:rPr>
+                              <w:t>ว</w:t>
+                            </w:r>
+                            <w:r>
+                              <w:rPr>
+                                <w:rFonts w:ascii="TH Sarabun New" w:eastAsiaTheme="minorHAnsi" w:hAnsi="TH Sarabun New" w:cs="TH Sarabun New"/>
+                                <w:b/>
+                                <w:bCs/>
+                                <w:sz w:val="72"/>
+                                <w:szCs w:val="72"/>
+                                <w:cs/>
+                              </w:rPr>
+                              <w:t xml:space="preserve">. </w:t>
+                            </w:r>
+                            <w:r>
+                              <w:rPr>
+                                <w:rFonts w:ascii="TH Sarabun New" w:eastAsiaTheme="minorHAnsi" w:hAnsi="TH Sarabun New" w:cs="TH Sarabun New" w:hint="cs"/>
+                                <w:b/>
+                                <w:bCs/>
+                                <w:sz w:val="72"/>
+                                <w:szCs w:val="72"/>
+                                <w:cs/>
+                              </w:rPr>
+                              <w:t>มข.๐๓</w:t>
+                            </w:r>
+                          </w:p>
+                        </w:txbxContent>
+                      </wps:txbx>
+                      <wps:bodyPr rot="0" spcFirstLastPara="0" vertOverflow="overflow" horzOverflow="overflow" vert="horz" wrap="square" lIns="91440" tIns="45720" rIns="91440" bIns="45720" numCol="1" spcCol="0" rtlCol="0" fromWordArt="0" anchor="ctr" anchorCtr="0" forceAA="0" compatLnSpc="1">
+                        <a:prstTxWarp prst="textNoShape">
+                          <a:avLst/>
+                        </a:prstTxWarp>
+                      </wps:bodyPr>
+                    </wps:wsp>
+                  </a:graphicData>
+                </a:graphic>
+                <wp14:sizeRelH relativeFrom="margin">
+                  <wp14:pctWidth>0</wp14:pctWidth>
+                </wp14:sizeRelH>
+                <wp14:sizeRelV relativeFrom="margin">
+                  <wp14:pctHeight>0</wp14:pctHeight>
+                </wp14:sizeRelV>
+              </wp:anchor>
+            </w:drawing>
+          </mc:Choice>
+          <mc:Fallback>
+            <w:pict>
+              <v:rect w14:anchorId="22BA597F" id="Rectangle 1" o:spid="_x0000_s1026" style="position:absolute;margin-left:0;margin-top:291.6pt;width:356.25pt;height:84.75pt;z-index:251659264;visibility:visible;mso-wrap-style:square;mso-width-percent:0;mso-height-percent:0;mso-wrap-distance-left:9pt;mso-wrap-distance-top:0;mso-wrap-distance-right:9pt;mso-wrap-distance-bottom:0;mso-position-horizontal:center;mso-position-horizontal-relative:margin;mso-position-vertical:absolute;mso-position-vertical-relative:text;mso-width-percent:0;mso-height-percent:0;mso-width-relative:margin;mso-height-relative:margin;v-text-anchor:middle" o:gfxdata="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" fillcolor="white [3201]" stroked="f" strokeweight="2pt">
+                <v:textbox>
+                  <w:txbxContent>
+                    <w:p>
+                      <w:pPr>
+                        <w:spacing w:after="160" w:line="259" w:lineRule="auto"/>
+                        <w:jc w:val="center"/>
+                        <w:rPr>
+                          <w:rFonts w:ascii="TH Sarabun New" w:hAnsi="TH Sarabun New" w:cs="TH Sarabun New"/>
+                          <w:b/>
+                          <w:bCs/>
+                          <w:sz w:val="72"/>
+                          <w:szCs w:val="72"/>
+                          <w:cs/>
+                        </w:rPr>
+                      </w:pPr>
+                      <w:r>
+                        <w:rPr>
+                          <w:rFonts w:ascii="TH Sarabun New" w:eastAsiaTheme="minorHAnsi" w:hAnsi="TH Sarabun New" w:cs="TH Sarabun New"/>
+                          <w:b/>
+                          <w:bCs/>
+                          <w:sz w:val="72"/>
+                          <w:szCs w:val="72"/>
+                          <w:cs/>
+                        </w:rPr>
+                        <w:t>แบบ ก.พ.</w:t>
+                      </w:r>
+                      <w:r>
+                        <w:rPr>
+                          <w:rFonts w:ascii="TH Sarabun New" w:eastAsiaTheme="minorHAnsi" w:hAnsi="TH Sarabun New" w:cs="TH Sarabun New" w:hint="cs"/>
+                          <w:b/>
+                          <w:bCs/>
+                          <w:sz w:val="72"/>
+                          <w:szCs w:val="72"/>
+                          <w:cs/>
+                        </w:rPr>
+                        <w:t>ว</w:t>
+                      </w:r>
+                      <w:r>
+                        <w:rPr>
+                          <w:rFonts w:ascii="TH Sarabun New" w:eastAsiaTheme="minorHAnsi" w:hAnsi="TH Sarabun New" w:cs="TH Sarabun New"/>
+                          <w:b/>
+                          <w:bCs/>
+                          <w:sz w:val="72"/>
+                          <w:szCs w:val="72"/>
+                          <w:cs/>
+                        </w:rPr>
+                        <w:t xml:space="preserve">. </w:t>
+                      </w:r>
+                      <w:r>
+                        <w:rPr>
+                          <w:rFonts w:ascii="TH Sarabun New" w:eastAsiaTheme="minorHAnsi" w:hAnsi="TH Sarabun New" w:cs="TH Sarabun New" w:hint="cs"/>
+                          <w:b/>
+                          <w:bCs/>
+                          <w:sz w:val="72"/>
+                          <w:szCs w:val="72"/>
+                          <w:cs/>
+                        </w:rPr>
+                        <w:t>มข.๐๓</w:t>
+                      </w:r>
+                    </w:p>
+                  </w:txbxContent>
+                </v:textbox>
+                <w10:wrap anchorx="margin"/>
+              </v:rect>
+            </w:pict>
+          </mc:Fallback>
+        </mc:AlternateContent>
+      </w:r>
+      <w:r>
+        <w:rPr>
+          <w:rFonts w:ascii="TH Sarabun New" w:eastAsiaTheme="minorHAnsi" w:hAnsi="TH Sarabun New" w:cs="TH Sarabun New"/>
+          <w:b/>
+          <w:bCs/>
+          <w:sz w:val="32"/>
+          <w:szCs w:val="32"/>
+          <w:cs/>
+        </w:rPr>
+        <w:br w:type="page"/>
+      </w:r>
+    </w:p>
+    <w:p>
+      <w:pPr>
         <w:spacing w:after="160" w:line="259" w:lineRule="auto"/>
         <w:jc w:val="right"/>
         <w:rPr>
@@ -23,6 +252,7 @@
           <w:szCs w:val="32"/>
           <w:cs/>
         </w:rPr>
+        <w:lastRenderedPageBreak/>
         <w:t xml:space="preserve">     </w:t>
       </w:r>
       <w:r>
@@ -34,8 +264,7 @@
           <w:szCs w:val="32"/>
           <w:cs/>
         </w:rPr>
-        <w:lastRenderedPageBreak/>
-        <w:t xml:space="preserve">ก.พ.ว. มข. ๐๓</w:t>
+        <w:t>ก.พ.ว. มข. ๐๓</w:t>
       </w:r>
     </w:p>
     <w:p>
@@ -216,7 +445,7 @@
           <w:u w:val="single"/>
           <w:cs/>
         </w:rPr>
-        <w:t xml:space="preserve">๑. แบบคำขอรับการพิจารณากำหนดตำแหน่งทางวิชาการทั่วไป</w:t>
+        <w:t>๑. แบบคำขอรับการพิจารณากำหนดตำแหน่งทางวิชาการทั่วไป</w:t>
       </w:r>
     </w:p>
     <w:p>
@@ -250,7 +479,7 @@
           <w:szCs w:val="32"/>
           <w:cs/>
         </w:rPr>
-        <w:t xml:space="preserve">ส่วนที่ ๑  : แบบประวัติส่วนตัวและผลงานทางวิชาการ</w:t>
+        <w:t>ส่วนที่ ๑  : แบบประวัติส่วนตัวและผลงานทางวิชาการ</w:t>
       </w:r>
     </w:p>
     <w:p>
@@ -301,7 +530,7 @@
           <w:szCs w:val="32"/>
           <w:cs/>
         </w:rPr>
-        <w:t xml:space="preserve">เพื่อขอดำรงตำแหน่ง {{target_position}}</w:t>
+        <w:t>เพื่อขอดำรงตำแหน่ง {{target_position}}</w:t>
       </w:r>
     </w:p>
     <w:p>
@@ -381,7 +610,7 @@
           <w:szCs w:val="32"/>
           <w:cs/>
         </w:rPr>
-        <w:t xml:space="preserve">ของ {{title}}{{applicant_name}}</w:t>
+        <w:t>ของ {{title}}{{applicant_name}}</w:t>
       </w:r>
     </w:p>
     <w:p>
@@ -401,7 +630,7 @@
           <w:szCs w:val="32"/>
           <w:cs/>
         </w:rPr>
-        <w:t xml:space="preserve">สังกัดภาค /สาขาวิชา {{department}}</w:t>
+        <w:t>สังกัดภาค /สาขาวิชา {{department}}</w:t>
       </w:r>
     </w:p>
     <w:p>
@@ -421,7 +650,7 @@
           <w:szCs w:val="32"/>
           <w:cs/>
         </w:rPr>
-        <w:t xml:space="preserve">คณะ {{faculty}} มหาวิทยาลัย{{university}}</w:t>
+        <w:t>คณะ {{faculty}} มหาวิทยาลัย{{university}}</w:t>
       </w:r>
     </w:p>
     <w:p>
@@ -472,7 +701,7 @@
           <w:szCs w:val="32"/>
           <w:cs/>
         </w:rPr>
-        <w:t xml:space="preserve">๑. ประวัติส่วนตัว</w:t>
+        <w:t>๑. ประวัติส่วนตัว</w:t>
       </w:r>
     </w:p>
     <w:p>
@@ -493,8 +722,16 @@
         </w:rPr>
         <w:tab/>
         <w:t>๑.๑</w:t>
+      </w:r>
+      <w:r>
+        <w:rPr>
+          <w:rFonts w:ascii="TH Sarabun New" w:eastAsiaTheme="minorHAnsi" w:hAnsi="TH Sarabun New" w:cs="TH Sarabun New"/>
+          <w:sz w:val="32"/>
+          <w:szCs w:val="32"/>
+          <w:cs/>
+        </w:rPr>
         <w:tab/>
-        <w:t xml:space="preserve">วัน เดือน ปีเกิด {{birth_date}}</w:t>
+        <w:t>วัน เดือน ปีเกิด {{birth_date}}</w:t>
       </w:r>
     </w:p>
     <w:p>
@@ -515,8 +752,16 @@
         </w:rPr>
         <w:tab/>
         <w:t xml:space="preserve">๑.๒ </w:t>
+      </w:r>
+      <w:r>
+        <w:rPr>
+          <w:rFonts w:ascii="TH Sarabun New" w:eastAsiaTheme="minorHAnsi" w:hAnsi="TH Sarabun New" w:cs="TH Sarabun New"/>
+          <w:sz w:val="32"/>
+          <w:szCs w:val="32"/>
+          <w:cs/>
+        </w:rPr>
         <w:tab/>
-        <w:t xml:space="preserve">อายุ {{age}} ปี</w:t>
+        <w:t>อายุ {{age}} ปี</w:t>
       </w:r>
     </w:p>
     <w:p>
@@ -537,7 +782,7 @@
           <w:cs/>
         </w:rPr>
         <w:tab/>
-        <w:t xml:space="preserve">๑.๓ การศึกษาระดับอุดมศึกษา (โปรดระบุชื่อคุณวุฒิเต็มพร้อมสาขาวิชา โดยเรียงจากคุณวุฒิสูงสุด ตามลำดับและกรณีสำเร็จการศึกษาจากต่างประเทศให้ระบุเป็นภาษาอังกฤษ)</w:t>
+        <w:t>๑.๓ การศึกษาระดับอุดมศึกษา (โปรดระบุชื่อคุณวุฒิเต็มพร้อมสาขาวิชา โดยเรียงจากคุณวุฒิสูงสุด ตามลำดับและกรณีสำเร็จการศึกษาจากต่างประเทศให้ระบุเป็นภาษาอังกฤษ)</w:t>
       </w:r>
     </w:p>
     <w:tbl>
@@ -557,7 +802,7 @@
           <w:left w:w="0" w:type="dxa"/>
           <w:right w:w="113" w:type="dxa"/>
         </w:tblCellMar>
-        <w:tblLook w:val="0000"/>
+        <w:tblLook w:val="0000" w:firstRow="0" w:lastRow="0" w:firstColumn="0" w:lastColumn="0" w:noHBand="0" w:noVBand="0"/>
       </w:tblPr>
       <w:tblGrid>
         <w:gridCol w:w="1100"/>
@@ -573,7 +818,6 @@
           <w:p>
             <w:pPr>
               <w:spacing w:after="0" w:line="240" w:lineRule="auto"/>
-              <w:jc w:val="left"/>
               <w:rPr>
                 <w:rFonts w:ascii="TH Sarabun New" w:eastAsiaTheme="minorHAnsi" w:hAnsi="TH Sarabun New" w:cs="TH Sarabun New"/>
                 <w:sz w:val="32"/>
@@ -590,7 +834,6 @@
           <w:p>
             <w:pPr>
               <w:spacing w:after="0" w:line="240" w:lineRule="auto"/>
-              <w:jc w:val="left"/>
               <w:rPr>
                 <w:rFonts w:ascii="TH Sarabun New" w:eastAsiaTheme="minorHAnsi" w:hAnsi="TH Sarabun New" w:cs="TH Sarabun New"/>
                 <w:sz w:val="32"/>
@@ -606,7 +849,7 @@
                 <w:u w:val="single"/>
                 <w:cs/>
               </w:rPr>
-              <w:t xml:space="preserve">คุณวุฒิ</w:t>
+              <w:t>คุณวุฒิ</w:t>
             </w:r>
           </w:p>
         </w:tc>
@@ -617,7 +860,6 @@
           <w:p>
             <w:pPr>
               <w:spacing w:after="0" w:line="240" w:lineRule="auto"/>
-              <w:jc w:val="left"/>
               <w:rPr>
                 <w:rFonts w:ascii="TH Sarabun New" w:eastAsiaTheme="minorHAnsi" w:hAnsi="TH Sarabun New" w:cs="TH Sarabun New"/>
                 <w:sz w:val="32"/>
@@ -633,7 +875,7 @@
                 <w:u w:val="single"/>
                 <w:cs/>
               </w:rPr>
-              <w:t xml:space="preserve">ปี พ.ศ. ที่จบ</w:t>
+              <w:t>ปี พ.ศ. ที่จบ</w:t>
             </w:r>
           </w:p>
         </w:tc>
@@ -644,7 +886,6 @@
           <w:p>
             <w:pPr>
               <w:spacing w:after="0" w:line="240" w:lineRule="auto"/>
-              <w:jc w:val="left"/>
               <w:rPr>
                 <w:rFonts w:ascii="TH Sarabun New" w:eastAsiaTheme="minorHAnsi" w:hAnsi="TH Sarabun New" w:cs="TH Sarabun New"/>
                 <w:sz w:val="32"/>
@@ -660,7 +901,7 @@
                 <w:u w:val="single"/>
                 <w:cs/>
               </w:rPr>
-              <w:t xml:space="preserve">ชื่อสถานศึกษาและประเทศ</w:t>
+              <w:t>ชื่อสถานศึกษาและประเทศ</w:t>
             </w:r>
           </w:p>
         </w:tc>
@@ -673,7 +914,6 @@
           <w:p>
             <w:pPr>
               <w:spacing w:after="0" w:line="240" w:lineRule="auto"/>
-              <w:jc w:val="left"/>
               <w:rPr>
                 <w:rFonts w:ascii="TH Sarabun New" w:eastAsiaTheme="minorHAnsi" w:hAnsi="TH Sarabun New" w:cs="TH Sarabun New"/>
                 <w:sz w:val="32"/>
@@ -688,7 +928,7 @@
                 <w:szCs w:val="32"/>
                 <w:cs/>
               </w:rPr>
-              <w:t xml:space="preserve">{{education_no_1}}</w:t>
+              <w:t>{{education_no_1}}</w:t>
             </w:r>
           </w:p>
         </w:tc>
@@ -699,7 +939,6 @@
           <w:p>
             <w:pPr>
               <w:spacing w:after="0" w:line="240" w:lineRule="auto"/>
-              <w:jc w:val="left"/>
               <w:rPr>
                 <w:rFonts w:ascii="TH Sarabun New" w:eastAsiaTheme="minorHAnsi" w:hAnsi="TH Sarabun New" w:cs="TH Sarabun New"/>
                 <w:sz w:val="32"/>
@@ -714,7 +953,7 @@
                 <w:szCs w:val="32"/>
                 <w:cs/>
               </w:rPr>
-              <w:t xml:space="preserve">{{education_degree_1}} {{education_major_1}}</w:t>
+              <w:t>{{education_degree_1}} {{education_major_1}}</w:t>
             </w:r>
           </w:p>
         </w:tc>
@@ -725,7 +964,6 @@
           <w:p>
             <w:pPr>
               <w:spacing w:after="0" w:line="240" w:lineRule="auto"/>
-              <w:jc w:val="left"/>
               <w:rPr>
                 <w:rFonts w:ascii="TH Sarabun New" w:eastAsiaTheme="minorHAnsi" w:hAnsi="TH Sarabun New" w:cs="TH Sarabun New"/>
                 <w:sz w:val="32"/>
@@ -740,7 +978,7 @@
                 <w:szCs w:val="32"/>
                 <w:cs/>
               </w:rPr>
-              <w:t xml:space="preserve">{{education_year_1}}</w:t>
+              <w:t>{{education_year_1}}</w:t>
             </w:r>
           </w:p>
         </w:tc>
@@ -751,7 +989,6 @@
           <w:p>
             <w:pPr>
               <w:spacing w:after="0" w:line="240" w:lineRule="auto"/>
-              <w:jc w:val="left"/>
               <w:rPr>
                 <w:rFonts w:ascii="TH Sarabun New" w:eastAsiaTheme="minorHAnsi" w:hAnsi="TH Sarabun New" w:cs="TH Sarabun New"/>
                 <w:sz w:val="32"/>
@@ -766,7 +1003,7 @@
                 <w:szCs w:val="32"/>
                 <w:cs/>
               </w:rPr>
-              <w:t xml:space="preserve">{{education_institution_1}} {{education_country_1}}</w:t>
+              <w:t>{{education_institution_1}} {{education_country_1}}</w:t>
             </w:r>
           </w:p>
         </w:tc>
@@ -790,48 +1027,88 @@
           <w:szCs w:val="32"/>
           <w:cs/>
         </w:rPr>
+        <w:tab/>
+        <w:t>(ในกรณีที่สำเร็จการศึกษาระดับปริญญาโทและปริญญาเอกและปริญญาบัตรใด ๆ  ให้ระบุหัวข้อเรื่อง</w:t>
+      </w:r>
+    </w:p>
+    <w:p>
+      <w:pPr>
+        <w:spacing w:after="0" w:line="240" w:lineRule="auto"/>
+        <w:jc w:val="thaiDistribute"/>
+        <w:rPr>
+          <w:rFonts w:ascii="TH Sarabun New" w:hAnsi="TH Sarabun New" w:cs="TH Sarabun New"/>
+          <w:sz w:val="32"/>
+          <w:szCs w:val="32"/>
+        </w:rPr>
+      </w:pPr>
+      <w:r>
+        <w:rPr>
+          <w:rFonts w:ascii="TH Sarabun New" w:eastAsiaTheme="minorHAnsi" w:hAnsi="TH Sarabun New" w:cs="TH Sarabun New"/>
+          <w:sz w:val="32"/>
+          <w:szCs w:val="32"/>
+          <w:cs/>
+        </w:rPr>
+        <w:t>วิทยานิพนธ์และงานวิจัยที่ทำเป็นส่วนของการศึกษาเพื่อรับปริญญาหรือประกาศนียบัตรนั้น ๆ ด้วย)</w:t>
+      </w:r>
+    </w:p>
+    <w:p>
+      <w:pPr>
+        <w:spacing w:after="0" w:line="240" w:lineRule="auto"/>
+        <w:rPr>
+          <w:rFonts w:ascii="TH Sarabun New" w:hAnsi="TH Sarabun New" w:cs="TH Sarabun New"/>
+          <w:sz w:val="32"/>
+          <w:szCs w:val="32"/>
+        </w:rPr>
+      </w:pPr>
+      <w:r>
+        <w:rPr>
+          <w:rFonts w:ascii="TH Sarabun New" w:eastAsiaTheme="minorHAnsi" w:hAnsi="TH Sarabun New" w:cs="TH Sarabun New"/>
+          <w:sz w:val="32"/>
+          <w:szCs w:val="32"/>
+          <w:cs/>
+        </w:rPr>
+        <w:t>๒. ประวัติการรับราชการ</w:t>
+      </w:r>
+    </w:p>
+    <w:p>
+      <w:pPr>
+        <w:spacing w:after="0" w:line="240" w:lineRule="auto"/>
+        <w:rPr>
+          <w:rFonts w:ascii="TH Sarabun New" w:hAnsi="TH Sarabun New" w:cs="TH Sarabun New"/>
+          <w:sz w:val="32"/>
+          <w:szCs w:val="32"/>
+        </w:rPr>
+      </w:pPr>
+      <w:r>
+        <w:rPr>
+          <w:rFonts w:ascii="TH Sarabun New" w:eastAsiaTheme="minorHAnsi" w:hAnsi="TH Sarabun New" w:cs="TH Sarabun New"/>
+          <w:sz w:val="32"/>
+          <w:szCs w:val="32"/>
+          <w:cs/>
+        </w:rPr>
+        <w:tab/>
+        <w:t>๒.๑ ปัจจุบันดำรงตำแหน่ง {{current_position}} รับเงินเดือน {{current_salary}} บาท</w:t>
+      </w:r>
+    </w:p>
+    <w:p>
+      <w:pPr>
+        <w:spacing w:after="0" w:line="240" w:lineRule="auto"/>
+        <w:rPr>
+          <w:rFonts w:ascii="TH Sarabun New" w:hAnsi="TH Sarabun New" w:cs="TH Sarabun New"/>
+          <w:sz w:val="32"/>
+          <w:szCs w:val="32"/>
+        </w:rPr>
+      </w:pPr>
+      <w:r>
+        <w:rPr>
+          <w:rFonts w:ascii="TH Sarabun New" w:eastAsiaTheme="minorHAnsi" w:hAnsi="TH Sarabun New" w:cs="TH Sarabun New"/>
+          <w:sz w:val="32"/>
+          <w:szCs w:val="32"/>
+          <w:cs/>
+        </w:rPr>
         <w:lastRenderedPageBreak/>
         <w:tab/>
-        <w:t xml:space="preserve">(ในกรณีที่สำเร็จการศึกษาระดับปริญญาโทและปริญญาเอกและปริญญาบัตรใด ๆ  ให้ระบุหัวข้อเรื่อง</w:t>
-      </w:r>
-    </w:p>
-    <w:p>
-      <w:pPr>
-        <w:spacing w:after="0" w:line="240" w:lineRule="auto"/>
-        <w:jc w:val="thaiDistribute"/>
-        <w:rPr>
-          <w:rFonts w:ascii="TH Sarabun New" w:hAnsi="TH Sarabun New" w:cs="TH Sarabun New"/>
-          <w:sz w:val="32"/>
-          <w:szCs w:val="32"/>
-        </w:rPr>
-      </w:pPr>
-      <w:r>
-        <w:rPr>
-          <w:rFonts w:ascii="TH Sarabun New" w:eastAsiaTheme="minorHAnsi" w:hAnsi="TH Sarabun New" w:cs="TH Sarabun New"/>
-          <w:sz w:val="32"/>
-          <w:szCs w:val="32"/>
-          <w:cs/>
-        </w:rPr>
-        <w:t xml:space="preserve">วิทยานิพนธ์และงานวิจัยที่ทำเป็นส่วนของการศึกษาเพื่อรับปริญญาหรือประกาศนียบัตรนั้น ๆ ด้วย)</w:t>
-      </w:r>
-    </w:p>
-    <w:p>
-      <w:pPr>
-        <w:spacing w:after="0" w:line="240" w:lineRule="auto"/>
-        <w:rPr>
-          <w:rFonts w:ascii="TH Sarabun New" w:hAnsi="TH Sarabun New" w:cs="TH Sarabun New"/>
-          <w:sz w:val="32"/>
-          <w:szCs w:val="32"/>
-        </w:rPr>
-      </w:pPr>
-      <w:r>
-        <w:rPr>
-          <w:rFonts w:ascii="TH Sarabun New" w:eastAsiaTheme="minorHAnsi" w:hAnsi="TH Sarabun New" w:cs="TH Sarabun New"/>
-          <w:sz w:val="32"/>
-          <w:szCs w:val="32"/>
-          <w:cs/>
-        </w:rPr>
-        <w:t>๒. ประวัติการรับราชการ</w:t>
+        <w:t>๒.๒ ได้รับแต่งตั้งให้ดำรงตำแหน่งอาจารย์ เมื่อ {{lecturer_appointment_date}}</w:t>
       </w:r>
     </w:p>
     <w:p>
@@ -851,7 +1128,7 @@
           <w:cs/>
         </w:rPr>
         <w:tab/>
-        <w:t xml:space="preserve">๒.๑ ปัจจุบันดำรงตำแหน่ง {{current_position}} รับเงินเดือน {{current_salary}} บาท</w:t>
+        <w:t>๒.๓ ได้รับแต่งตั้งให้ดำรงตำแหน่งผู้ช่วยศาสตราจารย์ (โดยวิธี{{assistant_method}}) ในสาขาวิชา{{assistant_department}}</w:t>
       </w:r>
     </w:p>
     <w:p>
@@ -871,7 +1148,7 @@
           <w:cs/>
         </w:rPr>
         <w:tab/>
-        <w:t xml:space="preserve">๒.๒ ได้รับแต่งตั้งให้ดำรงตำแหน่งอาจารย์ เมื่อ {{lecturer_appointment_date}}</w:t>
+        <w:t>เมื่อ {{assistant_appointment_date}}</w:t>
       </w:r>
     </w:p>
     <w:p>
@@ -891,7 +1168,7 @@
           <w:cs/>
         </w:rPr>
         <w:tab/>
-        <w:t xml:space="preserve">๒.๓ ได้รับแต่งตั้งให้ดำรงตำแหน่งผู้ช่วยศาสตราจารย์ (โดยวิธี{{assistant_method}}) ในสาขาวิชา{{assistant_department}}</w:t>
+        <w:t>๒.๔ ได้รับแต่งตั้งให้ดำรงตำแหน่งรองศาสตราจารย์ (โดยวิธี{{associate_method}}) ในสาขาวิชา{{associate_department}}</w:t>
       </w:r>
     </w:p>
     <w:p>
@@ -911,7 +1188,7 @@
           <w:cs/>
         </w:rPr>
         <w:tab/>
-        <w:t xml:space="preserve">เมื่อ {{assistant_appointment_date}}</w:t>
+        <w:t>เมื่อ {{associate_appointment_date}}</w:t>
       </w:r>
     </w:p>
     <w:p>
@@ -931,47 +1208,7 @@
           <w:cs/>
         </w:rPr>
         <w:tab/>
-        <w:t xml:space="preserve">๒.๔ ได้รับแต่งตั้งให้ดำรงตำแหน่งรองศาสตราจารย์ (โดยวิธี{{associate_method}}) ในสาขาวิชา{{associate_department}}</w:t>
-      </w:r>
-    </w:p>
-    <w:p>
-      <w:pPr>
-        <w:spacing w:after="0" w:line="240" w:lineRule="auto"/>
-        <w:rPr>
-          <w:rFonts w:ascii="TH Sarabun New" w:hAnsi="TH Sarabun New" w:cs="TH Sarabun New"/>
-          <w:sz w:val="32"/>
-          <w:szCs w:val="32"/>
-        </w:rPr>
-      </w:pPr>
-      <w:r>
-        <w:rPr>
-          <w:rFonts w:ascii="TH Sarabun New" w:eastAsiaTheme="minorHAnsi" w:hAnsi="TH Sarabun New" w:cs="TH Sarabun New"/>
-          <w:sz w:val="32"/>
-          <w:szCs w:val="32"/>
-          <w:cs/>
-        </w:rPr>
-        <w:tab/>
-        <w:t xml:space="preserve">เมื่อ {{associate_appointment_date}}</w:t>
-      </w:r>
-    </w:p>
-    <w:p>
-      <w:pPr>
-        <w:spacing w:after="0" w:line="240" w:lineRule="auto"/>
-        <w:rPr>
-          <w:rFonts w:ascii="TH Sarabun New" w:hAnsi="TH Sarabun New" w:cs="TH Sarabun New"/>
-          <w:sz w:val="32"/>
-          <w:szCs w:val="32"/>
-        </w:rPr>
-      </w:pPr>
-      <w:r>
-        <w:rPr>
-          <w:rFonts w:ascii="TH Sarabun New" w:eastAsiaTheme="minorHAnsi" w:hAnsi="TH Sarabun New" w:cs="TH Sarabun New"/>
-          <w:sz w:val="32"/>
-          <w:szCs w:val="32"/>
-          <w:cs/>
-        </w:rPr>
-        <w:tab/>
-        <w:t xml:space="preserve">(ในกรณีที่เคยบรรจุเข้ารับราชการในตำแหน่งอื่น หรือเคยดำรงตำแหน่งอาจารย์ประจำ / อาจารย์พิเศษในสังกัดอื่นให้ระบุตำแหน่งสังกัดและวัน เดือน ปี ที่ดำรงตำแหน่งนั้นด้วย)</w:t>
+        <w:t>(ในกรณีที่เคยบรรจุเข้ารับราชการในตำแหน่งอื่น หรือเคยดำรงตำแหน่งอาจารย์ประจำ / อาจารย์พิเศษในสังกัดอื่นให้ระบุตำแหน่งสังกัดและวัน เดือน ปี ที่ดำรงตำแหน่งนั้นด้วย)</w:t>
       </w:r>
     </w:p>
     <w:p>
@@ -991,7 +1228,7 @@
           <w:szCs w:val="32"/>
           <w:cs/>
         </w:rPr>
-        <w:t xml:space="preserve">อายุราชการ {{years}} ปี {{months}} เดือน</w:t>
+        <w:t>อายุราชการ {{years}} ปี {{months}} เดือน</w:t>
       </w:r>
     </w:p>
     <w:p>
@@ -1031,8 +1268,16 @@
           <w:cs/>
         </w:rPr>
         <w:tab/>
+      </w:r>
+      <w:r>
+        <w:rPr>
+          <w:rFonts w:ascii="TH Sarabun New" w:eastAsiaTheme="minorHAnsi" w:hAnsi="TH Sarabun New" w:cs="TH Sarabun New"/>
+          <w:sz w:val="32"/>
+          <w:szCs w:val="32"/>
+          <w:cs/>
+        </w:rPr>
         <w:tab/>
-        <w:t xml:space="preserve">๒.๕.{{other_position_no_1}} {{other_position_1}}</w:t>
+        <w:t>๒.๕.{{other_position_no_1}} {{other_position_1}}</w:t>
       </w:r>
     </w:p>
     <w:p>
@@ -1053,7 +1298,7 @@
           <w:cs/>
         </w:rPr>
         <w:tab/>
-        <w:t xml:space="preserve">๒.๖ การได้รับเชิญเป็นวิทยากรในที่ประชุมวิชาการระดับนานาชาติ และการได้รับการยกย่อง                      ระดับนานาชาติ อื่นๆ  (โปรดระบุข้อมูลย้อนหลัง ๕ ปี)</w:t>
+        <w:t>๒.๖ การได้รับเชิญเป็นวิทยากรในที่ประชุมวิชาการระดับนานาชาติ และการได้รับการยกย่อง                      ระดับนานาชาติ อื่นๆ  (โปรดระบุข้อมูลย้อนหลัง ๕ ปี)</w:t>
       </w:r>
     </w:p>
     <w:p>
@@ -1073,27 +1318,35 @@
           <w:cs/>
         </w:rPr>
         <w:tab/>
+      </w:r>
+      <w:r>
+        <w:rPr>
+          <w:rFonts w:ascii="TH Sarabun New" w:eastAsiaTheme="minorHAnsi" w:hAnsi="TH Sarabun New" w:cs="TH Sarabun New"/>
+          <w:sz w:val="32"/>
+          <w:szCs w:val="32"/>
+          <w:cs/>
+        </w:rPr>
         <w:tab/>
-        <w:t xml:space="preserve">๒.๖.{{international_speaker_last_5_years_no_1}} {{international_speaker_last_5_years_1}}</w:t>
-      </w:r>
-    </w:p>
-    <w:p>
-      <w:pPr>
-        <w:spacing w:after="0" w:line="240" w:lineRule="auto"/>
-        <w:rPr>
-          <w:rFonts w:ascii="TH Sarabun New" w:hAnsi="TH Sarabun New" w:cs="TH Sarabun New"/>
-          <w:sz w:val="32"/>
-          <w:szCs w:val="32"/>
-        </w:rPr>
-      </w:pPr>
-      <w:r>
-        <w:rPr>
-          <w:rFonts w:ascii="TH Sarabun New" w:eastAsiaTheme="minorHAnsi" w:hAnsi="TH Sarabun New" w:cs="TH Sarabun New"/>
-          <w:sz w:val="32"/>
-          <w:szCs w:val="32"/>
-          <w:cs/>
-        </w:rPr>
-        <w:t xml:space="preserve">๓. ภาระงานย้อนหลัง ๓ ปี (เป็นภาระงานที่ทำโดยความเห็นชอบจากเจ้าสังกัด)</w:t>
+        <w:t>๒.๖.{{international_speaker_last_5_years_no_1}} {{international_speaker_last_5_years_1}}</w:t>
+      </w:r>
+    </w:p>
+    <w:p>
+      <w:pPr>
+        <w:spacing w:after="0" w:line="240" w:lineRule="auto"/>
+        <w:rPr>
+          <w:rFonts w:ascii="TH Sarabun New" w:hAnsi="TH Sarabun New" w:cs="TH Sarabun New"/>
+          <w:sz w:val="32"/>
+          <w:szCs w:val="32"/>
+        </w:rPr>
+      </w:pPr>
+      <w:r>
+        <w:rPr>
+          <w:rFonts w:ascii="TH Sarabun New" w:eastAsiaTheme="minorHAnsi" w:hAnsi="TH Sarabun New" w:cs="TH Sarabun New"/>
+          <w:sz w:val="32"/>
+          <w:szCs w:val="32"/>
+          <w:cs/>
+        </w:rPr>
+        <w:t>๓. ภาระงานย้อนหลัง ๓ ปี (เป็นภาระงานที่ทำโดยความเห็นชอบจากเจ้าสังกัด)</w:t>
       </w:r>
     </w:p>
     <w:p>
@@ -1132,7 +1385,7 @@
           <w:left w:w="0" w:type="dxa"/>
           <w:right w:w="113" w:type="dxa"/>
         </w:tblCellMar>
-        <w:tblLook w:val="0000"/>
+        <w:tblLook w:val="0000" w:firstRow="0" w:lastRow="0" w:firstColumn="0" w:lastColumn="0" w:noHBand="0" w:noVBand="0"/>
       </w:tblPr>
       <w:tblGrid>
         <w:gridCol w:w="1500"/>
@@ -1148,7 +1401,6 @@
           <w:p>
             <w:pPr>
               <w:spacing w:after="0" w:line="240" w:lineRule="auto"/>
-              <w:jc w:val="left"/>
               <w:rPr>
                 <w:rFonts w:ascii="TH Sarabun New" w:eastAsiaTheme="minorHAnsi" w:hAnsi="TH Sarabun New" w:cs="TH Sarabun New"/>
                 <w:sz w:val="32"/>
@@ -1164,7 +1416,7 @@
                 <w:u w:val="single"/>
                 <w:cs/>
               </w:rPr>
-              <w:t xml:space="preserve">ระดับ</w:t>
+              <w:t>ระดับ</w:t>
             </w:r>
           </w:p>
         </w:tc>
@@ -1175,7 +1427,6 @@
           <w:p>
             <w:pPr>
               <w:spacing w:after="0" w:line="240" w:lineRule="auto"/>
-              <w:jc w:val="left"/>
               <w:rPr>
                 <w:rFonts w:ascii="TH Sarabun New" w:eastAsiaTheme="minorHAnsi" w:hAnsi="TH Sarabun New" w:cs="TH Sarabun New"/>
                 <w:sz w:val="32"/>
@@ -1191,7 +1442,7 @@
                 <w:u w:val="single"/>
                 <w:cs/>
               </w:rPr>
-              <w:t xml:space="preserve">รายวิชาที่สอน</w:t>
+              <w:t>รายวิชาที่สอน</w:t>
             </w:r>
           </w:p>
         </w:tc>
@@ -1202,7 +1453,6 @@
           <w:p>
             <w:pPr>
               <w:spacing w:after="0" w:line="240" w:lineRule="auto"/>
-              <w:jc w:val="left"/>
               <w:rPr>
                 <w:rFonts w:ascii="TH Sarabun New" w:eastAsiaTheme="minorHAnsi" w:hAnsi="TH Sarabun New" w:cs="TH Sarabun New"/>
                 <w:sz w:val="32"/>
@@ -1218,7 +1468,7 @@
                 <w:u w:val="single"/>
                 <w:cs/>
               </w:rPr>
-              <w:t xml:space="preserve">ช.ม./สัปดาห์</w:t>
+              <w:t>ช.ม./สัปดาห์</w:t>
             </w:r>
           </w:p>
         </w:tc>
@@ -1229,7 +1479,6 @@
           <w:p>
             <w:pPr>
               <w:spacing w:after="0" w:line="240" w:lineRule="auto"/>
-              <w:jc w:val="left"/>
               <w:rPr>
                 <w:rFonts w:ascii="TH Sarabun New" w:eastAsiaTheme="minorHAnsi" w:hAnsi="TH Sarabun New" w:cs="TH Sarabun New"/>
                 <w:sz w:val="32"/>
@@ -1245,7 +1494,7 @@
                 <w:u w:val="single"/>
                 <w:cs/>
               </w:rPr>
-              <w:t xml:space="preserve">เปิดสอนภาค/ปีการศึกษา</w:t>
+              <w:t>เปิดสอนภาค/ปีการศึกษา</w:t>
             </w:r>
           </w:p>
         </w:tc>
@@ -1258,7 +1507,6 @@
           <w:p>
             <w:pPr>
               <w:spacing w:after="0" w:line="240" w:lineRule="auto"/>
-              <w:jc w:val="left"/>
               <w:rPr>
                 <w:rFonts w:ascii="TH Sarabun New" w:eastAsiaTheme="minorHAnsi" w:hAnsi="TH Sarabun New" w:cs="TH Sarabun New"/>
                 <w:sz w:val="32"/>
@@ -1273,7 +1521,7 @@
                 <w:szCs w:val="32"/>
                 <w:cs/>
               </w:rPr>
-              <w:t xml:space="preserve">{{teaching_level_1}}</w:t>
+              <w:t>{{teaching_level_1}}</w:t>
             </w:r>
           </w:p>
         </w:tc>
@@ -1284,7 +1532,6 @@
           <w:p>
             <w:pPr>
               <w:spacing w:after="0" w:line="240" w:lineRule="auto"/>
-              <w:jc w:val="left"/>
               <w:rPr>
                 <w:rFonts w:ascii="TH Sarabun New" w:eastAsiaTheme="minorHAnsi" w:hAnsi="TH Sarabun New" w:cs="TH Sarabun New"/>
                 <w:sz w:val="32"/>
@@ -1299,7 +1546,7 @@
                 <w:szCs w:val="32"/>
                 <w:cs/>
               </w:rPr>
-              <w:t xml:space="preserve">{{teaching_subject_1}}</w:t>
+              <w:t>{{teaching_subject_1}}</w:t>
             </w:r>
           </w:p>
         </w:tc>
@@ -1310,7 +1557,6 @@
           <w:p>
             <w:pPr>
               <w:spacing w:after="0" w:line="240" w:lineRule="auto"/>
-              <w:jc w:val="left"/>
               <w:rPr>
                 <w:rFonts w:ascii="TH Sarabun New" w:eastAsiaTheme="minorHAnsi" w:hAnsi="TH Sarabun New" w:cs="TH Sarabun New"/>
                 <w:sz w:val="32"/>
@@ -1325,7 +1571,7 @@
                 <w:szCs w:val="32"/>
                 <w:cs/>
               </w:rPr>
-              <w:t xml:space="preserve">{{teaching_hours_per_week_1}}</w:t>
+              <w:t>{{teaching_hours_per_week_1}}</w:t>
             </w:r>
           </w:p>
         </w:tc>
@@ -1336,7 +1582,6 @@
           <w:p>
             <w:pPr>
               <w:spacing w:after="0" w:line="240" w:lineRule="auto"/>
-              <w:jc w:val="left"/>
               <w:rPr>
                 <w:rFonts w:ascii="TH Sarabun New" w:eastAsiaTheme="minorHAnsi" w:hAnsi="TH Sarabun New" w:cs="TH Sarabun New"/>
                 <w:sz w:val="32"/>
@@ -1351,7 +1596,7 @@
                 <w:szCs w:val="32"/>
                 <w:cs/>
               </w:rPr>
-              <w:t xml:space="preserve">{{teaching_semester_1}}</w:t>
+              <w:t>{{teaching_semester_1}}</w:t>
             </w:r>
           </w:p>
         </w:tc>
@@ -1373,7 +1618,6 @@
           <w:szCs w:val="32"/>
           <w:cs/>
         </w:rPr>
-        <w:lastRenderedPageBreak/>
         <w:t>๓.๒ งานวิจัย (โปรดระบุเรื่องที่ได้รับทุนวิจัยในฐานะหัวหน้าโครงการ (</w:t>
       </w:r>
       <w:r>
@@ -1409,7 +1653,7 @@
           <w:sz w:val="32"/>
           <w:szCs w:val="32"/>
         </w:rPr>
-        <w:t xml:space="preserve">{{reseach}}</w:t>
+        <w:t>{{reseach}}</w:t>
       </w:r>
     </w:p>
     <w:p>
@@ -1446,7 +1690,7 @@
           <w:sz w:val="32"/>
           <w:szCs w:val="32"/>
         </w:rPr>
-        <w:t xml:space="preserve">{{academic_service}}</w:t>
+        <w:t>{{academic_service}}</w:t>
       </w:r>
     </w:p>
     <w:p>
@@ -1483,7 +1727,7 @@
           <w:sz w:val="32"/>
           <w:szCs w:val="32"/>
         </w:rPr>
-        <w:t xml:space="preserve">{{administration}}</w:t>
+        <w:t>{{administration}}</w:t>
       </w:r>
     </w:p>
     <w:p>
@@ -1520,7 +1764,7 @@
           <w:sz w:val="32"/>
           <w:szCs w:val="32"/>
         </w:rPr>
-        <w:t xml:space="preserve">{{other}}</w:t>
+        <w:t>{{other}}</w:t>
       </w:r>
     </w:p>
     <w:p>
@@ -1608,7 +1852,7 @@
           <w:szCs w:val="32"/>
           <w:cs/>
         </w:rPr>
-        <w:t xml:space="preserve">๔.๑.๑.{{asst_research_working_no_1}} {{asst_research_working_1}}</w:t>
+        <w:t>๔.๑.๑.{{asst_research_working_no_1}} {{asst_research_working_1}}</w:t>
       </w:r>
     </w:p>
     <w:p>
@@ -1667,16 +1911,7 @@
           <w:szCs w:val="32"/>
           <w:cs/>
         </w:rPr>
-        <w:t xml:space="preserve">{{asst_not_used_research_1}}</w:t>
-      </w:r>
-      <w:r>
-        <w:rPr>
-          <w:rFonts w:ascii="TH Sarabun New" w:eastAsiaTheme="minorHAnsi" w:hAnsi="TH Sarabun New" w:cs="TH Sarabun New"/>
-          <w:sz w:val="32"/>
-          <w:szCs w:val="32"/>
-          <w:cs/>
-        </w:rPr>
-        <w:t xml:space="preserve">  ไม่เคยใช้</w:t>
+        <w:t>{{asst_not_used_research_1}}  ไม่เคยใช้</w:t>
       </w:r>
     </w:p>
     <w:p>
@@ -1696,16 +1931,7 @@
           <w:szCs w:val="32"/>
           <w:cs/>
         </w:rPr>
-        <w:t xml:space="preserve">{{asst_is_used_research_1}}</w:t>
-      </w:r>
-      <w:r>
-        <w:rPr>
-          <w:rFonts w:ascii="TH Sarabun New" w:eastAsiaTheme="minorHAnsi" w:hAnsi="TH Sarabun New" w:cs="TH Sarabun New"/>
-          <w:sz w:val="32"/>
-          <w:szCs w:val="32"/>
-          <w:cs/>
-        </w:rPr>
-        <w:t xml:space="preserve">  เคยใช้ (เมื่อปี พ.ศ. {{asst_used_research_year_1}} และผลการพิจารณาคุณภาพอยู่ในระดับ {{asst_used_research_level_1}} ตามเกณฑ์ที่มหาวิทยาลัยกำหนด)</w:t>
+        <w:t>{{asst_is_used_research_1}}  เคยใช้ (เมื่อปี พ.ศ. {{asst_used_research_year_1}} และผลการพิจารณาคุณภาพอยู่ในระดับ {{asst_used_research_level_1}} ตามเกณฑ์ที่มหาวิทยาลัยกำหนด)</w:t>
       </w:r>
     </w:p>
     <w:p>
@@ -1726,7 +1952,6 @@
           <w:szCs w:val="32"/>
           <w:cs/>
         </w:rPr>
-        <w:lastRenderedPageBreak/>
         <w:t>๔.๑.๒ ผลงานทางวิชาการในลักษณะอื่น (ผลงานวิชาการเพื่ออุตสาหกรรม/ผลงานวิชาการเพื่อพัฒนาการเรียนการสอนและการเรียนรู้/ ผลงานวิชาการเพื่อพัฒนานโยบายสาธารณะ/ กรณีศึกษา (</w:t>
       </w:r>
       <w:r>
@@ -1781,7 +2006,7 @@
           <w:szCs w:val="32"/>
           <w:cs/>
         </w:rPr>
-        <w:t xml:space="preserve">๔.๑.๒.{{asst_other_working_no_1}} {{asst_other_working_1}}</w:t>
+        <w:t>๔.๑.๒.{{asst_other_working_no_1}} {{asst_other_working_1}}</w:t>
       </w:r>
     </w:p>
     <w:p>
@@ -1821,16 +2046,7 @@
           <w:szCs w:val="32"/>
           <w:cs/>
         </w:rPr>
-        <w:t xml:space="preserve">{{asst_not_used_other_1}}</w:t>
-      </w:r>
-      <w:r>
-        <w:rPr>
-          <w:rFonts w:ascii="TH Sarabun New" w:eastAsiaTheme="minorHAnsi" w:hAnsi="TH Sarabun New" w:cs="TH Sarabun New"/>
-          <w:sz w:val="32"/>
-          <w:szCs w:val="32"/>
-          <w:cs/>
-        </w:rPr>
-        <w:t xml:space="preserve">  ไม่เคยใช้</w:t>
+        <w:t>{{asst_not_used_other_1}}  ไม่เคยใช้</w:t>
       </w:r>
     </w:p>
     <w:p>
@@ -1850,16 +2066,7 @@
           <w:szCs w:val="32"/>
           <w:cs/>
         </w:rPr>
-        <w:t xml:space="preserve">{{asst_is_used_other_1}}</w:t>
-      </w:r>
-      <w:r>
-        <w:rPr>
-          <w:rFonts w:ascii="TH Sarabun New" w:eastAsiaTheme="minorHAnsi" w:hAnsi="TH Sarabun New" w:cs="TH Sarabun New"/>
-          <w:sz w:val="32"/>
-          <w:szCs w:val="32"/>
-          <w:cs/>
-        </w:rPr>
-        <w:t xml:space="preserve">  เคยใช้ (เมื่อปี พ.ศ. {{asst_used_other_year_1}} และผลการพิจารณาคุณภาพอยู่ในระดับ {{asst_used_other_level_1}} ตามเกณฑ์ที่มหาวิทยาลัยกำหนด)</w:t>
+        <w:t>{{asst_is_used_other_1}}  เคยใช้ (เมื่อปี พ.ศ. {{asst_used_other_year_1}} และผลการพิจารณาคุณภาพอยู่ในระดับ {{asst_used_other_level_1}} ตามเกณฑ์ที่มหาวิทยาลัยกำหนด)</w:t>
       </w:r>
     </w:p>
     <w:p>
@@ -1899,7 +2106,7 @@
           <w:szCs w:val="32"/>
           <w:cs/>
         </w:rPr>
-        <w:t xml:space="preserve">๔.๑.๓.{{asst_book_working_no_1}} {{asst_book_working_1}}</w:t>
+        <w:t>๔.๑.๓.{{asst_book_working_no_1}} {{asst_book_working_1}}</w:t>
       </w:r>
     </w:p>
     <w:p>
@@ -1958,16 +2165,7 @@
           <w:szCs w:val="32"/>
           <w:cs/>
         </w:rPr>
-        <w:t xml:space="preserve">{{asst_not_used_book_1}}</w:t>
-      </w:r>
-      <w:r>
-        <w:rPr>
-          <w:rFonts w:ascii="TH Sarabun New" w:eastAsiaTheme="minorHAnsi" w:hAnsi="TH Sarabun New" w:cs="TH Sarabun New"/>
-          <w:sz w:val="32"/>
-          <w:szCs w:val="32"/>
-          <w:cs/>
-        </w:rPr>
-        <w:t xml:space="preserve">  ไม่เคยใช้</w:t>
+        <w:t>{{asst_not_used_book_1}}  ไม่เคยใช้</w:t>
       </w:r>
     </w:p>
     <w:p>
@@ -1987,16 +2185,7 @@
           <w:szCs w:val="32"/>
           <w:cs/>
         </w:rPr>
-        <w:t xml:space="preserve">{{asst_is_used_book_1}}</w:t>
-      </w:r>
-      <w:r>
-        <w:rPr>
-          <w:rFonts w:ascii="TH Sarabun New" w:eastAsiaTheme="minorHAnsi" w:hAnsi="TH Sarabun New" w:cs="TH Sarabun New"/>
-          <w:sz w:val="32"/>
-          <w:szCs w:val="32"/>
-          <w:cs/>
-        </w:rPr>
-        <w:t xml:space="preserve">  เคยใช้ (เมื่อปี พ.ศ. {{asst_used_book_year_1}} และผลการพิจารณาคุณภาพอยู่ในระดับ {{asst_used_book_level_1}} ตามเกณฑ์ที่มหาวิทยาลัยกำหนด)</w:t>
+        <w:t>{{asst_is_used_book_1}}  เคยใช้ (เมื่อปี พ.ศ. {{asst_used_book_year_1}} และผลการพิจารณาคุณภาพอยู่ในระดับ {{asst_used_book_level_1}} ตามเกณฑ์ที่มหาวิทยาลัยกำหนด)</w:t>
       </w:r>
     </w:p>
     <w:p>
@@ -2017,7 +2206,17 @@
           <w:szCs w:val="32"/>
           <w:cs/>
         </w:rPr>
-        <w:t xml:space="preserve">ผลงานทางวิชาการทุกประเภทให้เสนอโดยเขียนตามหลักของการเขียนเอกสารอ้างอิง                อันประกอบด้วยชื่อผู้แต่ง ปี พ.ศ. ชื่อเรื่อง แหล่งพิมพ์ จำนวนหน้าเป็นต้นและกรณีที่เผยแพร่ในวารสารทางวิชาการให้ระบุว่าอยู่ในฐานข้อมูลใดตามประกาศ ก.พ.อ. โดยระบุบทบาทหน้าที่ของผลงานแต่ละประเภทตามลักษณะการมีส่วนร่วมในผลงานทางวิชาการตามเอกสารแนบท้ายมหาวิทยาลัย พร้อมทั้งระบุ จำนวนครั้งที่               ถูกอ้างอิง (</w:t>
+        <w:t>ผลงานทางวิชาการทุกประเภทให้เสนอโดยเขียนตามหลักของการเขียนเอกสารอ้างอิง                อันประกอบด้วยชื่อผู้แต่ง ปี พ.ศ. ชื่อเรื่อง แหล่งพิมพ์ จำนวนหน้าเป็นต้นและกรณีที่เผยแพร่ในวารสารทางวิชาการ</w:t>
+      </w:r>
+      <w:r>
+        <w:rPr>
+          <w:rFonts w:ascii="TH Sarabun New" w:eastAsiaTheme="minorHAnsi" w:hAnsi="TH Sarabun New" w:cs="TH Sarabun New"/>
+          <w:sz w:val="32"/>
+          <w:szCs w:val="32"/>
+          <w:cs/>
+        </w:rPr>
+        <w:lastRenderedPageBreak/>
+        <w:t>ให้ระบุว่าอยู่ในฐานข้อมูลใดตามประกาศ ก.พ.อ. โดยระบุบทบาทหน้าที่ของผลงานแต่ละประเภทตามลักษณะการมีส่วนร่วมในผลงานทางวิชาการตามเอกสารแนบท้ายมหาวิทยาลัย พร้อมทั้งระบุ จำนวนครั้งที่               ถูกอ้างอิง (</w:t>
       </w:r>
       <w:r>
         <w:rPr>
@@ -2102,7 +2301,7 @@
           <w:szCs w:val="32"/>
           <w:cs/>
         </w:rPr>
-        <w:t xml:space="preserve">๔.๒.๑.{{assoc_research_working_no_1}} {{assoc_research_working_1}}</w:t>
+        <w:t>๔.๒.๑.{{assoc_research_working_no_1}} {{assoc_research_working_1}}</w:t>
       </w:r>
     </w:p>
     <w:p>
@@ -2145,16 +2344,7 @@
           <w:szCs w:val="32"/>
           <w:cs/>
         </w:rPr>
-        <w:t xml:space="preserve">{{assoc_not_used_research_1}}</w:t>
-      </w:r>
-      <w:r>
-        <w:rPr>
-          <w:rFonts w:ascii="TH Sarabun New" w:eastAsiaTheme="minorHAnsi" w:hAnsi="TH Sarabun New" w:cs="TH Sarabun New"/>
-          <w:sz w:val="32"/>
-          <w:szCs w:val="32"/>
-          <w:cs/>
-        </w:rPr>
-        <w:t xml:space="preserve">  ไม่เคยใช้</w:t>
+        <w:t>{{assoc_not_used_research_1}}  ไม่เคยใช้</w:t>
       </w:r>
     </w:p>
     <w:p>
@@ -2174,16 +2364,7 @@
           <w:szCs w:val="32"/>
           <w:cs/>
         </w:rPr>
-        <w:t xml:space="preserve">{{assoc_is_used_research_1}}</w:t>
-      </w:r>
-      <w:r>
-        <w:rPr>
-          <w:rFonts w:ascii="TH Sarabun New" w:eastAsiaTheme="minorHAnsi" w:hAnsi="TH Sarabun New" w:cs="TH Sarabun New"/>
-          <w:sz w:val="32"/>
-          <w:szCs w:val="32"/>
-          <w:cs/>
-        </w:rPr>
-        <w:t xml:space="preserve">  เคยใช้ (เมื่อปี พ.ศ. {{assoc_used_research_year_1}} และผลการพิจารณาคุณภาพอยู่ในระดับ {{assoc_used_research_level_1}} ตามเกณฑ์ที่มหาวิทยาลัยกำหนด)</w:t>
+        <w:t>{{assoc_is_used_research_1}}  เคยใช้ (เมื่อปี พ.ศ. {{assoc_used_research_year_1}} และผลการพิจารณาคุณภาพอยู่ในระดับ {{assoc_used_research_level_1}} ตามเกณฑ์ที่มหาวิทยาลัยกำหนด)</w:t>
       </w:r>
     </w:p>
     <w:p>
@@ -2258,9 +2439,16 @@
           <w:szCs w:val="32"/>
           <w:cs/>
         </w:rPr>
-        <w:t xml:space="preserve">๔.๒.๒.{{assoc_other_working_no_1}} {{assoc_other_working_1}}</w:t>
+        <w:t>๔.๒.๒.{{assoc_other_working_no_1}} {{assoc_other_working_1}}</w:t>
+      </w:r>
+      <w:r>
+        <w:rPr>
+          <w:rFonts w:ascii="TH Sarabun New" w:eastAsiaTheme="minorHAnsi" w:hAnsi="TH Sarabun New" w:cs="TH Sarabun New"/>
+          <w:sz w:val="32"/>
+          <w:szCs w:val="32"/>
+          <w:cs/>
+        </w:rPr>
         <w:tab/>
-        <w:t xml:space="preserve"/>
       </w:r>
     </w:p>
     <w:p>
@@ -2280,7 +2468,7 @@
           <w:szCs w:val="32"/>
           <w:cs/>
         </w:rPr>
-        <w:t xml:space="preserve">ผลงานทางวิชาการในลักษณะอื่นนี้เคยใช้สำหรับการพิจารณาขอกำหนดตำแหน่ง              ผู้ช่วยศาสตราจารย์และ/หรือตำแหน่งรองศาสตราจารย์มาแล้วหรือไม่</w:t>
+        <w:t>ผลงานทางวิชาการในลักษณะอื่นนี้เคยใช้สำหรับการพิจารณาขอกำหนดตำแหน่ง              ผู้ช่วยศาสตราจารย์และ/หรือตำแหน่งรองศาสตราจารย์มาแล้วหรือไม่</w:t>
       </w:r>
     </w:p>
     <w:p>
@@ -2300,16 +2488,7 @@
           <w:szCs w:val="32"/>
           <w:cs/>
         </w:rPr>
-        <w:t xml:space="preserve">{{assoc_not_used_other_1}}</w:t>
-      </w:r>
-      <w:r>
-        <w:rPr>
-          <w:rFonts w:ascii="TH Sarabun New" w:eastAsiaTheme="minorHAnsi" w:hAnsi="TH Sarabun New" w:cs="TH Sarabun New"/>
-          <w:sz w:val="32"/>
-          <w:szCs w:val="32"/>
-          <w:cs/>
-        </w:rPr>
-        <w:t xml:space="preserve">  ไม่เคยใช้</w:t>
+        <w:t>{{assoc_not_used_other_1}}  ไม่เคยใช้</w:t>
       </w:r>
     </w:p>
     <w:p>
@@ -2329,16 +2508,7 @@
           <w:szCs w:val="32"/>
           <w:cs/>
         </w:rPr>
-        <w:t xml:space="preserve">{{assoc_is_used_other_1}}</w:t>
-      </w:r>
-      <w:r>
-        <w:rPr>
-          <w:rFonts w:ascii="TH Sarabun New" w:eastAsiaTheme="minorHAnsi" w:hAnsi="TH Sarabun New" w:cs="TH Sarabun New"/>
-          <w:sz w:val="32"/>
-          <w:szCs w:val="32"/>
-          <w:cs/>
-        </w:rPr>
-        <w:t xml:space="preserve">  เคยใช้ (เมื่อปี พ.ศ. {{assoc_used_other_year_1}} และผลการพิจารณาคุณภาพอยู่ในระดับ {{assoc_used_other_level_1}} ตามเกณฑ์ที่มหาวิทยาลัยกำหนด)</w:t>
+        <w:t>{{assoc_is_used_other_1}}  เคยใช้ (เมื่อปี พ.ศ. {{assoc_used_other_year_1}} และผลการพิจารณาคุณภาพอยู่ในระดับ {{assoc_used_other_level_1}} ตามเกณฑ์ที่มหาวิทยาลัยกำหนด)</w:t>
       </w:r>
     </w:p>
     <w:p>
@@ -2358,11 +2528,34 @@
           <w:szCs w:val="32"/>
           <w:cs/>
         </w:rPr>
-        <w:lastRenderedPageBreak/>
         <w:t>๔.๒.๓</w:t>
+      </w:r>
+      <w:r>
+        <w:rPr>
+          <w:rFonts w:ascii="TH Sarabun New" w:eastAsiaTheme="minorHAnsi" w:hAnsi="TH Sarabun New" w:cs="TH Sarabun New"/>
+          <w:sz w:val="32"/>
+          <w:szCs w:val="32"/>
+          <w:cs/>
+        </w:rPr>
         <w:tab/>
-        <w:t xml:space="preserve">ตำรา หรือหนังสือ</w:t>
+        <w:t>ตำรา หรือหนังสือ</w:t>
+      </w:r>
+      <w:r>
+        <w:rPr>
+          <w:rFonts w:ascii="TH Sarabun New" w:eastAsiaTheme="minorHAnsi" w:hAnsi="TH Sarabun New" w:cs="TH Sarabun New"/>
+          <w:sz w:val="32"/>
+          <w:szCs w:val="32"/>
+          <w:cs/>
+        </w:rPr>
         <w:tab/>
+      </w:r>
+      <w:r>
+        <w:rPr>
+          <w:rFonts w:ascii="TH Sarabun New" w:eastAsiaTheme="minorHAnsi" w:hAnsi="TH Sarabun New" w:cs="TH Sarabun New"/>
+          <w:sz w:val="32"/>
+          <w:szCs w:val="32"/>
+          <w:cs/>
+        </w:rPr>
         <w:tab/>
       </w:r>
     </w:p>
@@ -2383,8 +2576,24 @@
           <w:cs/>
         </w:rPr>
         <w:tab/>
+      </w:r>
+      <w:r>
+        <w:rPr>
+          <w:rFonts w:ascii="TH Sarabun New" w:eastAsiaTheme="minorHAnsi" w:hAnsi="TH Sarabun New" w:cs="TH Sarabun New"/>
+          <w:sz w:val="32"/>
+          <w:szCs w:val="32"/>
+          <w:cs/>
+        </w:rPr>
         <w:tab/>
-        <w:t xml:space="preserve">๔.๒.๓.{{assoc_book_working_no_1}} {{assoc_book_working_1}}</w:t>
+        <w:t>๔.๒.๓.{{assoc_book_working_no_1}} {{assoc_book_working_1}}</w:t>
+      </w:r>
+      <w:r>
+        <w:rPr>
+          <w:rFonts w:ascii="TH Sarabun New" w:eastAsiaTheme="minorHAnsi" w:hAnsi="TH Sarabun New" w:cs="TH Sarabun New"/>
+          <w:sz w:val="32"/>
+          <w:szCs w:val="32"/>
+          <w:cs/>
+        </w:rPr>
         <w:tab/>
       </w:r>
     </w:p>
@@ -2405,7 +2614,23 @@
           <w:cs/>
         </w:rPr>
         <w:tab/>
+      </w:r>
+      <w:r>
+        <w:rPr>
+          <w:rFonts w:ascii="TH Sarabun New" w:eastAsiaTheme="minorHAnsi" w:hAnsi="TH Sarabun New" w:cs="TH Sarabun New"/>
+          <w:sz w:val="32"/>
+          <w:szCs w:val="32"/>
+          <w:cs/>
+        </w:rPr>
         <w:tab/>
+      </w:r>
+      <w:r>
+        <w:rPr>
+          <w:rFonts w:ascii="TH Sarabun New" w:eastAsiaTheme="minorHAnsi" w:hAnsi="TH Sarabun New" w:cs="TH Sarabun New"/>
+          <w:sz w:val="32"/>
+          <w:szCs w:val="32"/>
+          <w:cs/>
+        </w:rPr>
         <w:tab/>
         <w:t>ผลงานนี้เคยใช้สำหรับการพิจารณาขอกำหนดตำแหน่งผู้ช่วยศาสตราจารย์และ/</w:t>
       </w:r>
@@ -2446,16 +2671,7 @@
           <w:szCs w:val="32"/>
           <w:cs/>
         </w:rPr>
-        <w:t xml:space="preserve">{{assoc_not_used_book_1}}</w:t>
-      </w:r>
-      <w:r>
-        <w:rPr>
-          <w:rFonts w:ascii="TH Sarabun New" w:eastAsiaTheme="minorHAnsi" w:hAnsi="TH Sarabun New" w:cs="TH Sarabun New"/>
-          <w:sz w:val="32"/>
-          <w:szCs w:val="32"/>
-          <w:cs/>
-        </w:rPr>
-        <w:t xml:space="preserve">  ไม่เคยใช้</w:t>
+        <w:t>{{assoc_not_used_book_1}}  ไม่เคยใช้</w:t>
       </w:r>
     </w:p>
     <w:p>
@@ -2475,16 +2691,7 @@
           <w:szCs w:val="32"/>
           <w:cs/>
         </w:rPr>
-        <w:t xml:space="preserve">{{assoc_is_used_book_1}}</w:t>
-      </w:r>
-      <w:r>
-        <w:rPr>
-          <w:rFonts w:ascii="TH Sarabun New" w:eastAsiaTheme="minorHAnsi" w:hAnsi="TH Sarabun New" w:cs="TH Sarabun New"/>
-          <w:sz w:val="32"/>
-          <w:szCs w:val="32"/>
-          <w:cs/>
-        </w:rPr>
-        <w:t xml:space="preserve">  เคยใช้ (เมื่อปี พ.ศ. {{assoc_used_book_year_1}} และผลการพิจารณาคุณภาพอยู่ในระดับ {{assoc_used_book_level_1}} ตามเกณฑ์ที่มหาวิทยาลัยกำหนด)</w:t>
+        <w:t>{{assoc_is_used_book_1}}  เคยใช้ (เมื่อปี พ.ศ. {{assoc_used_book_year_1}} และผลการพิจารณาคุณภาพอยู่ในระดับ {{assoc_used_book_level_1}} ตามเกณฑ์ที่มหาวิทยาลัยกำหนด)</w:t>
       </w:r>
     </w:p>
     <w:p>
@@ -2505,7 +2712,8 @@
           <w:szCs w:val="32"/>
           <w:cs/>
         </w:rPr>
-        <w:t xml:space="preserve">ผลงานทางวิชาการทุกประเภท ให้เสนอโดยเขียนตามหลักของการเขียนเอกสารอ้างอิง อันประกอบด้วยชื่อผู้แต่งปี พ.ศ. ชื่อเรื่อง แหล่งพิมพ์ จำนวนหน้า เป็นต้น และกรณีที่เผยแพร่ในวารสารทางวิชาการให้ระบุว่าอยู่ในฐานข้อมูลใดตามประกาศ ก.พ.อ. โดยระบุบทบาทหน้าที่ของผลงานแต่ละประเภท ตามลักษณะการมีส่วนร่วมในผลงานทางวิชาการตามเอกสารแนบท้ายมหาวิทยาลัยพร้อมทั้งระบุจำนวนครั้งที่ถูกอ้างอิง (</w:t>
+        <w:lastRenderedPageBreak/>
+        <w:t>ผลงานทางวิชาการทุกประเภท ให้เสนอโดยเขียนตามหลักของการเขียนเอกสารอ้างอิง อันประกอบด้วยชื่อผู้แต่งปี พ.ศ. ชื่อเรื่อง แหล่งพิมพ์ จำนวนหน้า เป็นต้น และกรณีที่เผยแพร่ในวารสารทางวิชาการให้ระบุว่าอยู่ในฐานข้อมูลใดตามประกาศ ก.พ.อ. โดยระบุบทบาทหน้าที่ของผลงานแต่ละประเภท ตามลักษณะการมีส่วนร่วมในผลงานทางวิชาการตามเอกสารแนบท้ายมหาวิทยาลัยพร้อมทั้งระบุจำนวนครั้งที่ถูกอ้างอิง (</w:t>
       </w:r>
       <w:r>
         <w:rPr>
@@ -2589,7 +2797,7 @@
           <w:szCs w:val="32"/>
           <w:cs/>
         </w:rPr>
-        <w:t xml:space="preserve">๔.๓.๑.{{prof_research_working_no_1}} {{prof_research_working_1}}</w:t>
+        <w:t>๔.๓.๑.{{prof_research_working_no_1}} {{prof_research_working_1}}</w:t>
       </w:r>
     </w:p>
     <w:p>
@@ -2610,6 +2818,14 @@
           <w:cs/>
         </w:rPr>
         <w:tab/>
+      </w:r>
+      <w:r>
+        <w:rPr>
+          <w:rFonts w:ascii="TH Sarabun New" w:eastAsiaTheme="minorHAnsi" w:hAnsi="TH Sarabun New" w:cs="TH Sarabun New"/>
+          <w:sz w:val="32"/>
+          <w:szCs w:val="32"/>
+          <w:cs/>
+        </w:rPr>
         <w:tab/>
         <w:t>งานวิจัยนี้เคยใช้สำหรับการพิจารณาขอกำหนดตำแหน่งผู้ช่วยศาสตราจารย์ และ/หรือตำแหน่งรองศาสตราจารย์ และ/หรือตำแหน่งศาสตราจารย์มาแล้วหรือไม่</w:t>
       </w:r>
@@ -2631,16 +2847,7 @@
           <w:szCs w:val="32"/>
           <w:cs/>
         </w:rPr>
-        <w:t xml:space="preserve">{{prof_not_used_research_1}}</w:t>
-      </w:r>
-      <w:r>
-        <w:rPr>
-          <w:rFonts w:ascii="TH Sarabun New" w:eastAsiaTheme="minorHAnsi" w:hAnsi="TH Sarabun New" w:cs="TH Sarabun New"/>
-          <w:sz w:val="32"/>
-          <w:szCs w:val="32"/>
-          <w:cs/>
-        </w:rPr>
-        <w:t xml:space="preserve">  ไม่เคยใช้</w:t>
+        <w:t>{{prof_not_used_research_1}}  ไม่เคยใช้</w:t>
       </w:r>
     </w:p>
     <w:p>
@@ -2660,16 +2867,7 @@
           <w:szCs w:val="32"/>
           <w:cs/>
         </w:rPr>
-        <w:t xml:space="preserve">{{prof_is_used_research_1}}</w:t>
-      </w:r>
-      <w:r>
-        <w:rPr>
-          <w:rFonts w:ascii="TH Sarabun New" w:eastAsiaTheme="minorHAnsi" w:hAnsi="TH Sarabun New" w:cs="TH Sarabun New"/>
-          <w:sz w:val="32"/>
-          <w:szCs w:val="32"/>
-          <w:cs/>
-        </w:rPr>
-        <w:t xml:space="preserve">  เคยใช้ (เมื่อปี พ.ศ. {{prof_used_research_year_1}} และผลการพิจารณาคุณภาพอยู่ในระดับ {{prof_used_research_level_1}} ตามเกณฑ์ที่มหาวิทยาลัยกำหนด)</w:t>
+        <w:t>{{prof_is_used_research_1}}  เคยใช้ (เมื่อปี พ.ศ. {{prof_used_research_year_1}} และผลการพิจารณาคุณภาพอยู่ในระดับ {{prof_used_research_level_1}} ตามเกณฑ์ที่มหาวิทยาลัยกำหนด)</w:t>
       </w:r>
     </w:p>
     <w:p>
@@ -2690,7 +2888,7 @@
           <w:szCs w:val="32"/>
           <w:cs/>
         </w:rPr>
-        <w:t xml:space="preserve">๔.๓.๒ ผลงานทางวิชาการในลักษณะอื่น (ผลงานวิชาการเพื่ออุตสาหกรรม/ผลงานวิชาการเพื่อพัฒนาการเรียนการสอนและการเรียนรู้/ ผลงานวิชาการเพื่อพัฒนานโยบายสาธารณะ/ กรณีศึกษา (</w:t>
+        <w:t>๔.๓.๒ ผลงานทางวิชาการในลักษณะอื่น (ผลงานวิชาการเพื่ออุตสาหกรรม/ผลงานวิชาการเพื่อพัฒนาการเรียนการสอนและการเรียนรู้/ ผลงานวิชาการเพื่อพัฒนานโยบายสาธารณะ/ กรณีศึกษา (</w:t>
       </w:r>
       <w:r>
         <w:rPr>
@@ -2727,7 +2925,7 @@
           <w:szCs w:val="32"/>
           <w:cs/>
         </w:rPr>
-        <w:t xml:space="preserve">๔.๓.๒.{{prof_other_working_no_1}} {{prof_other_working_1}}</w:t>
+        <w:t>๔.๓.๒.{{prof_other_working_no_1}} {{prof_other_working_1}}</w:t>
       </w:r>
     </w:p>
     <w:p>
@@ -2749,8 +2947,16 @@
           <w:cs/>
         </w:rPr>
         <w:tab/>
+      </w:r>
+      <w:r>
+        <w:rPr>
+          <w:rFonts w:ascii="TH Sarabun New" w:eastAsiaTheme="minorHAnsi" w:hAnsi="TH Sarabun New" w:cs="TH Sarabun New"/>
+          <w:sz w:val="32"/>
+          <w:szCs w:val="32"/>
+          <w:cs/>
+        </w:rPr>
         <w:tab/>
-        <w:t xml:space="preserve">ผลงานทางวิชาการในลักษณะอื่นนี้ เคยใช้สำหรับการพิจารณาขอกำหนดตำแหน่ง               ผู้ช่วยศาสตราจารย์และ/หรือตำแหน่งรองศาสตราจารย์ และ/หรือตำแหน่งศาสตราจารย์มาแล้วหรือไม่</w:t>
+        <w:t>ผลงานทางวิชาการในลักษณะอื่นนี้ เคยใช้สำหรับการพิจารณาขอกำหนดตำแหน่ง               ผู้ช่วยศาสตราจารย์และ/หรือตำแหน่งรองศาสตราจารย์ และ/หรือตำแหน่งศาสตราจารย์มาแล้วหรือไม่</w:t>
       </w:r>
     </w:p>
     <w:p>
@@ -2770,16 +2976,7 @@
           <w:szCs w:val="32"/>
           <w:cs/>
         </w:rPr>
-        <w:t xml:space="preserve">{{prof_not_used_other_1}}</w:t>
-      </w:r>
-      <w:r>
-        <w:rPr>
-          <w:rFonts w:ascii="TH Sarabun New" w:eastAsiaTheme="minorHAnsi" w:hAnsi="TH Sarabun New" w:cs="TH Sarabun New"/>
-          <w:sz w:val="32"/>
-          <w:szCs w:val="32"/>
-          <w:cs/>
-        </w:rPr>
-        <w:t xml:space="preserve">  ไม่เคยใช้</w:t>
+        <w:t>{{prof_not_used_other_1}}  ไม่เคยใช้</w:t>
       </w:r>
     </w:p>
     <w:p>
@@ -2799,16 +2996,7 @@
           <w:szCs w:val="32"/>
           <w:cs/>
         </w:rPr>
-        <w:t xml:space="preserve">{{prof_is_used_other_1}}</w:t>
-      </w:r>
-      <w:r>
-        <w:rPr>
-          <w:rFonts w:ascii="TH Sarabun New" w:eastAsiaTheme="minorHAnsi" w:hAnsi="TH Sarabun New" w:cs="TH Sarabun New"/>
-          <w:sz w:val="32"/>
-          <w:szCs w:val="32"/>
-          <w:cs/>
-        </w:rPr>
-        <w:t xml:space="preserve">  เคยใช้ (เมื่อปี พ.ศ. {{prof_used_other_year_1}} และผลการพิจารณาคุณภาพอยู่ในระดับ {{prof_used_other_level_1}} ตามเกณฑ์ที่มหาวิทยาลัยกำหนด)</w:t>
+        <w:t>{{prof_is_used_other_1}}  เคยใช้ (เมื่อปี พ.ศ. {{prof_used_other_year_1}} และผลการพิจารณาคุณภาพอยู่ในระดับ {{prof_used_other_level_1}} ตามเกณฑ์ที่มหาวิทยาลัยกำหนด)</w:t>
       </w:r>
     </w:p>
     <w:p>
@@ -2848,7 +3036,7 @@
           <w:szCs w:val="32"/>
           <w:cs/>
         </w:rPr>
-        <w:t xml:space="preserve">๔.๓.๓.{{prof_book_working_no_1}} {{prof_book_working_1}}</w:t>
+        <w:t>๔.๓.๓.{{prof_book_working_no_1}} {{prof_book_working_1}}</w:t>
       </w:r>
     </w:p>
     <w:p>
@@ -2869,6 +3057,14 @@
           <w:cs/>
         </w:rPr>
         <w:tab/>
+      </w:r>
+      <w:r>
+        <w:rPr>
+          <w:rFonts w:ascii="TH Sarabun New" w:eastAsiaTheme="minorHAnsi" w:hAnsi="TH Sarabun New" w:cs="TH Sarabun New"/>
+          <w:sz w:val="32"/>
+          <w:szCs w:val="32"/>
+          <w:cs/>
+        </w:rPr>
         <w:tab/>
         <w:t>ผลงานนี้เคยใช้สำหรับการพิจารณาขอกำหนดตำแหน่งผู้ช่วยศาสตราจารย์และ/ หรือตำแหน่งรองศาสตราจารย์ และ/หรือตำแหน่งศาสตราจารย์มาแล้วหรือไม่</w:t>
       </w:r>
@@ -2890,16 +3086,7 @@
           <w:szCs w:val="32"/>
           <w:cs/>
         </w:rPr>
-        <w:t xml:space="preserve">{{prof_not_used_book_1}}</w:t>
-      </w:r>
-      <w:r>
-        <w:rPr>
-          <w:rFonts w:ascii="TH Sarabun New" w:eastAsiaTheme="minorHAnsi" w:hAnsi="TH Sarabun New" w:cs="TH Sarabun New"/>
-          <w:sz w:val="32"/>
-          <w:szCs w:val="32"/>
-          <w:cs/>
-        </w:rPr>
-        <w:t xml:space="preserve">  ไม่เคยใช้</w:t>
+        <w:t>{{prof_not_used_book_1}}  ไม่เคยใช้</w:t>
       </w:r>
     </w:p>
     <w:p>
@@ -2919,16 +3106,8 @@
           <w:szCs w:val="32"/>
           <w:cs/>
         </w:rPr>
-        <w:t xml:space="preserve">{{prof_is_used_book_1}}</w:t>
-      </w:r>
-      <w:r>
-        <w:rPr>
-          <w:rFonts w:ascii="TH Sarabun New" w:eastAsiaTheme="minorHAnsi" w:hAnsi="TH Sarabun New" w:cs="TH Sarabun New"/>
-          <w:sz w:val="32"/>
-          <w:szCs w:val="32"/>
-          <w:cs/>
-        </w:rPr>
-        <w:t xml:space="preserve">  เคยใช้ (เมื่อปี พ.ศ. {{prof_used_book_year_1}} และผลการพิจารณาคุณภาพอยู่ในระดับ {{prof_used_book_level_1}} ตามเกณฑ์ที่มหาวิทยาลัยกำหนด)</w:t>
+        <w:lastRenderedPageBreak/>
+        <w:t>{{prof_is_used_book_1}}  เคยใช้ (เมื่อปี พ.ศ. {{prof_used_book_year_1}} และผลการพิจารณาคุณภาพอยู่ในระดับ {{prof_used_book_level_1}} ตามเกณฑ์ที่มหาวิทยาลัยกำหนด)</w:t>
       </w:r>
     </w:p>
     <w:p>
@@ -2949,16 +3128,7 @@
           <w:cs/>
         </w:rPr>
         <w:tab/>
-        <w:t xml:space="preserve">ผลงานทางวิชาการทุกประเภท ให้เสนอโดยเขียนตามหลักของการเขียนเอกสารอ้างอิง อันประกอบด้วยชื่อผู้แต่ง ปี พ.ศ. ชื่อเรื่อง แหล่งพิมพ์ จำนวนหน้า เป็นต้น และกรณีที่เผยแพร่ในวารสารทางวิชาการให้ระบุว่าอยู่ในฐานข้อมูลใดตามประกาศ ก.พ.อ. โดยระบุบทบาทหน้าที่ของผลงานแต่ละประเภทตามลักษณะการมีส่วนร่วมในผลงานทางวิชาการ</w:t>
-      </w:r>
-      <w:r>
-        <w:rPr>
-          <w:rFonts w:ascii="TH Sarabun New" w:eastAsiaTheme="minorHAnsi" w:hAnsi="TH Sarabun New" w:cs="TH Sarabun New"/>
-          <w:sz w:val="32"/>
-          <w:szCs w:val="32"/>
-          <w:cs/>
-        </w:rPr>
-        <w:t>ตามเอกสารแนบท้ายมหาวิทยาลัย</w:t>
+        <w:t>ผลงานทางวิชาการทุกประเภท ให้เสนอโดยเขียนตามหลักของการเขียนเอกสารอ้างอิง อันประกอบด้วยชื่อผู้แต่ง ปี พ.ศ. ชื่อเรื่อง แหล่งพิมพ์ จำนวนหน้า เป็นต้น และกรณีที่เผยแพร่ในวารสารทางวิชาการให้ระบุว่าอยู่ในฐานข้อมูลใดตามประกาศ ก.พ.อ. โดยระบุบทบาทหน้าที่ของผลงานแต่ละประเภทตามลักษณะการมีส่วนร่วมในผลงานทางวิชาการตามเอกสารแนบท้ายมหาวิทยาลัย</w:t>
       </w:r>
       <w:r>
         <w:rPr>
@@ -2975,7 +3145,7 @@
           <w:szCs w:val="32"/>
           <w:cs/>
         </w:rPr>
-        <w:t xml:space="preserve">พร้อมทั้งระบุจำนวนครั้งที่ถูกอ้างอิง (</w:t>
+        <w:t>พร้อมทั้งระบุจำนวนครั้งที่ถูกอ้างอิง (</w:t>
       </w:r>
       <w:r>
         <w:rPr>
@@ -3112,7 +3282,7 @@
           <w:szCs w:val="32"/>
           <w:cs/>
         </w:rPr>
-        <w:t xml:space="preserve">ตำแหน่ง{{current_position}}</w:t>
+        <w:t>ตำแหน่ง{{current_position}}</w:t>
       </w:r>
     </w:p>
     <w:p>
@@ -3239,7 +3409,7 @@
           <w:szCs w:val="32"/>
           <w:cs/>
         </w:rPr>
-        <w:t xml:space="preserve">แบบประเมินแต่งตั้งให้ดำรงตำแหน่ง {{target_position}}</w:t>
+        <w:t>แบบประเมินแต่งตั้งให้ดำรงตำแหน่ง {{target_position}}</w:t>
       </w:r>
     </w:p>
     <w:p>
@@ -3319,7 +3489,7 @@
           <w:szCs w:val="32"/>
           <w:cs/>
         </w:rPr>
-        <w:t xml:space="preserve">ของ {{title}}{{applicant_name}}</w:t>
+        <w:t>ของ {{title}}{{applicant_name}}</w:t>
       </w:r>
     </w:p>
     <w:p>
@@ -3339,7 +3509,7 @@
           <w:szCs w:val="32"/>
           <w:cs/>
         </w:rPr>
-        <w:t xml:space="preserve">สังกัดภาค /สาขาวิชา {{department}}</w:t>
+        <w:t>สังกัดภาค /สาขาวิชา {{department}}</w:t>
       </w:r>
     </w:p>
     <w:p>
@@ -3359,7 +3529,7 @@
           <w:szCs w:val="32"/>
           <w:cs/>
         </w:rPr>
-        <w:t xml:space="preserve">คณะ {{faculty}} มหาวิทยาลัย{{university}}</w:t>
+        <w:t>คณะ {{faculty}} มหาวิทยาลัย{{university}}</w:t>
       </w:r>
     </w:p>
     <w:p>
@@ -3410,7 +3580,7 @@
           <w:szCs w:val="32"/>
           <w:cs/>
         </w:rPr>
-        <w:t xml:space="preserve">ได้ตรวจสอบคุณสมบัติเฉพาะสำหรับตำแหน่ง {{target_position}} แล้วเห็นว่า {{title}}{{applicant_name}}</w:t>
+        <w:t>ได้ตรวจสอบคุณสมบัติเฉพาะสำหรับตำแหน่ง {{target_position}} แล้วเห็นว่า {{title}}{{applicant_name}}</w:t>
       </w:r>
     </w:p>
     <w:p>
@@ -3430,7 +3600,7 @@
           <w:szCs w:val="32"/>
           <w:cs/>
         </w:rPr>
-        <w:t xml:space="preserve">เป็นผู้มีคุณสมบัติ {{qualification_status}} ตามหลักเกณฑ์ที่ มหาวิทยาลัยกำหนด</w:t>
+        <w:t>เป็นผู้มีคุณสมบัติ {{qualification_status}} ตามหลักเกณฑ์ที่ มหาวิทยาลัยกำหนด</w:t>
       </w:r>
     </w:p>
     <w:p>
@@ -3480,7 +3650,7 @@
           <w:szCs w:val="32"/>
           <w:cs/>
         </w:rPr>
-        <w:t xml:space="preserve">({{department_head_name}})</w:t>
+        <w:t>({{department_head_name}})</w:t>
       </w:r>
     </w:p>
     <w:p>
@@ -3520,7 +3690,7 @@
           <w:szCs w:val="32"/>
           <w:cs/>
         </w:rPr>
-        <w:t xml:space="preserve">วันที่ {{head_sign_date}}</w:t>
+        <w:t>วันที่ {{head_sign_date}}</w:t>
       </w:r>
     </w:p>
     <w:p>
@@ -3579,7 +3749,7 @@
           <w:szCs w:val="32"/>
           <w:cs/>
         </w:rPr>
-        <w:t xml:space="preserve">ได้พิจารณาแล้วเห็นว่า {{title}}{{applicant_name}}</w:t>
+        <w:t>ได้พิจารณาแล้วเห็นว่า {{title}}{{applicant_name}}</w:t>
       </w:r>
     </w:p>
     <w:p>
@@ -3599,7 +3769,7 @@
           <w:szCs w:val="32"/>
           <w:cs/>
         </w:rPr>
-        <w:t xml:space="preserve">เป็นผู้มีคุณสมบัติ {{dean_qualification_status}} ที่จะได้รับการแต่งตั้งให้ดำรงตำแหน่ง {{target_position}}</w:t>
+        <w:t>เป็นผู้มีคุณสมบัติ {{dean_qualification_status}} ที่จะได้รับการแต่งตั้งให้ดำรงตำแหน่ง {{target_position}}</w:t>
       </w:r>
     </w:p>
     <w:p>
@@ -3660,7 +3830,7 @@
           <w:szCs w:val="32"/>
           <w:cs/>
         </w:rPr>
-        <w:t xml:space="preserve">({{dean_name}})</w:t>
+        <w:t>({{dean_name}})</w:t>
       </w:r>
     </w:p>
     <w:p>
@@ -3700,7 +3870,7 @@
           <w:szCs w:val="32"/>
           <w:cs/>
         </w:rPr>
-        <w:t xml:space="preserve">วันที่ {{dean_sign_date}}</w:t>
+        <w:t>วันที่ {{dean_sign_date}}</w:t>
       </w:r>
     </w:p>
     <w:p>
@@ -3733,7 +3903,6 @@
           <w:szCs w:val="32"/>
           <w:cs/>
         </w:rPr>
-        <w:lastRenderedPageBreak/>
         <w:t>ส่วนที่</w:t>
       </w:r>
       <w:r>
@@ -3788,7 +3957,8 @@
           <w:szCs w:val="32"/>
           <w:cs/>
         </w:rPr>
-        <w:t xml:space="preserve">คณะอนุกรรมการเพื่อประเมินผลการสอน ในการประชุมครั้งที่ {{s3_meeting_no}} เมื่อวันที่ {{s3_meeting_date}} ซึ่งได้รับมอบอำนาจจากคณะกรรมการพิจารณาตำแหน่งทางวิชาการ {{s3_university}} ได้ประเมินผลการสอนรหัสวิชา {{s3_course_code}} รายวิชา {{s3_course_name}} ของ {{title}}{{applicant_name}} แล้วเห็นว่า บุคคลดังกล่าวเป็นผู้มีความ{{s3_level}} ในการสอนมีคุณภาพ{{s3_quality}}ในหลักเกณฑ์และวิธีการตามที่มหาวิทยาลัยกำหนด</w:t>
+        <w:lastRenderedPageBreak/>
+        <w:t>คณะอนุกรรมการเพื่อประเมินผลการสอน ในการประชุมครั้งที่ {{s3_meeting_no}} เมื่อวันที่ {{s3_meeting_date}} ซึ่งได้รับมอบอำนาจจากคณะกรรมการพิจารณาตำแหน่งทางวิชาการ {{s3_university}} ได้ประเมินผลการสอนรหัสวิชา {{s3_course_code}} รายวิชา {{s3_course_name}} ของ {{title}}{{applicant_name}} แล้วเห็นว่า บุคคลดังกล่าวเป็นผู้มีความ{{s3_level}} ในการสอนมีคุณภาพ{{s3_quality}}ในหลักเกณฑ์และวิธีการตามที่มหาวิทยาลัยกำหนด</w:t>
       </w:r>
     </w:p>
     <w:p>
@@ -3916,7 +4086,7 @@
           <w:szCs w:val="32"/>
           <w:cs/>
         </w:rPr>
-        <w:t xml:space="preserve">วันที่ {{s3_sign_date}}</w:t>
+        <w:t>วันที่ {{s3_sign_date}}</w:t>
       </w:r>
     </w:p>
     <w:p>
@@ -4760,27 +4930,7 @@
           <w:szCs w:val="32"/>
           <w:cs/>
         </w:rPr>
-        <w:t xml:space="preserve">ให้เสนอโดยเขียนตามหลักของการเขียนเอกสารอ้างอิง อันประกอบด้วยชื่อผู้แต่ง ปี พ.ศ. ชื่อเรื่อง แหล่งพิมพ์ จำนวนหน้า เป็นต้น และกรณีที่เผยแพร่ในวารสารทางวิชาการให้ระบุว่าอยู่ในฐานข้อมูลใดตามประกาศ </w:t>
-      </w:r>
-      <w:proofErr w:type="spellStart"/>
-      <w:r>
-        <w:rPr>
-          <w:rFonts w:ascii="TH Sarabun New" w:eastAsiaTheme="minorHAnsi" w:hAnsi="TH Sarabun New" w:cs="TH Sarabun New"/>
-          <w:sz w:val="32"/>
-          <w:szCs w:val="32"/>
-          <w:cs/>
-        </w:rPr>
-        <w:t>ก.พ.อ</w:t>
-      </w:r>
-      <w:proofErr w:type="spellEnd"/>
-      <w:r>
-        <w:rPr>
-          <w:rFonts w:ascii="TH Sarabun New" w:eastAsiaTheme="minorHAnsi" w:hAnsi="TH Sarabun New" w:cs="TH Sarabun New"/>
-          <w:sz w:val="32"/>
-          <w:szCs w:val="32"/>
-          <w:cs/>
-        </w:rPr>
-        <w:t>. พร้อมทั้งระบุบทบาทหน้าที่ของผลงานแต่ละประเภท ตามลักษณะการมีส่วนร่วมในผลงานทางวิชาการตาม</w:t>
+        <w:t>ให้เสนอโดยเขียนตามหลักของการเขียนเอกสารอ้างอิง อันประกอบด้วยชื่อผู้แต่ง ปี พ.ศ. ชื่อเรื่อง แหล่งพิมพ์ จำนวนหน้า เป็นต้น และกรณีที่เผยแพร่ในวารสารทางวิชาการให้ระบุว่าอยู่ในฐานข้อมูลใดตามประกาศ ก.พ.อ. พร้อมทั้งระบุบทบาทหน้าที่ของผลงานแต่ละประเภท ตามลักษณะการมีส่วนร่วมในผลงานทางวิชาการตาม</w:t>
       </w:r>
       <w:r>
         <w:rPr>

</xml_diff>

<commit_message>
Require fresh chair signature in P2 doc 1
Updates position document 1 workflow so part 3 (teaching evaluation) is signed again by the committee chair in the current envelope instead of reusing phase 1 signature/date data. Adjusts signature slot/field ownership, rendering behavior, and resolver fallbacks to keep only chair name sourced from linked evaluation data. Also refines signature stamping on lines with trailing role text, maps department-head acting-position lines, treats Scopus hidden ID fields as optional, and improves required-field label targeting for hidden paired inputs.
</commit_message>
<xml_diff>
--- a/HRCP-KKU-Academic/src/main/resources/templates/docx/Phase2/p2doc_1.docx
+++ b/HRCP-KKU-Academic/src/main/resources/templates/docx/Phase2/p2doc_1.docx
@@ -1653,7 +1653,25 @@
           <w:sz w:val="32"/>
           <w:szCs w:val="32"/>
         </w:rPr>
-        <w:t>{{reseach}}</w:t>
+        <w:t>{{</w:t>
+      </w:r>
+      <w:proofErr w:type="spellStart"/>
+      <w:r>
+        <w:rPr>
+          <w:rFonts w:ascii="TH Sarabun New" w:hAnsi="TH Sarabun New" w:cs="TH Sarabun New"/>
+          <w:sz w:val="32"/>
+          <w:szCs w:val="32"/>
+        </w:rPr>
+        <w:t>reseach</w:t>
+      </w:r>
+      <w:proofErr w:type="spellEnd"/>
+      <w:r>
+        <w:rPr>
+          <w:rFonts w:ascii="TH Sarabun New" w:hAnsi="TH Sarabun New" w:cs="TH Sarabun New"/>
+          <w:sz w:val="32"/>
+          <w:szCs w:val="32"/>
+        </w:rPr>
+        <w:t>}}</w:t>
       </w:r>
     </w:p>
     <w:p>
@@ -1690,7 +1708,25 @@
           <w:sz w:val="32"/>
           <w:szCs w:val="32"/>
         </w:rPr>
-        <w:t>{{academic_service}}</w:t>
+        <w:t>{{</w:t>
+      </w:r>
+      <w:proofErr w:type="spellStart"/>
+      <w:r>
+        <w:rPr>
+          <w:rFonts w:ascii="TH Sarabun New" w:hAnsi="TH Sarabun New" w:cs="TH Sarabun New"/>
+          <w:sz w:val="32"/>
+          <w:szCs w:val="32"/>
+        </w:rPr>
+        <w:t>academic_service</w:t>
+      </w:r>
+      <w:proofErr w:type="spellEnd"/>
+      <w:r>
+        <w:rPr>
+          <w:rFonts w:ascii="TH Sarabun New" w:hAnsi="TH Sarabun New" w:cs="TH Sarabun New"/>
+          <w:sz w:val="32"/>
+          <w:szCs w:val="32"/>
+        </w:rPr>
+        <w:t>}}</w:t>
       </w:r>
     </w:p>
     <w:p>
@@ -3229,6 +3265,7 @@
       <w:pPr>
         <w:spacing w:after="0" w:line="240" w:lineRule="auto"/>
         <w:ind w:left="2160" w:firstLine="720"/>
+        <w:jc w:val="center"/>
         <w:rPr>
           <w:rFonts w:ascii="TH Sarabun New" w:hAnsi="TH Sarabun New" w:cs="TH Sarabun New"/>
           <w:sz w:val="32"/>
@@ -3249,26 +3286,28 @@
       <w:pPr>
         <w:spacing w:after="0" w:line="240" w:lineRule="auto"/>
         <w:ind w:left="1440" w:firstLine="720"/>
-        <w:rPr>
-          <w:rFonts w:ascii="TH Sarabun New" w:hAnsi="TH Sarabun New" w:cs="TH Sarabun New"/>
-          <w:sz w:val="32"/>
-          <w:szCs w:val="32"/>
-        </w:rPr>
-      </w:pPr>
-      <w:r>
-        <w:rPr>
-          <w:rFonts w:ascii="TH Sarabun New" w:eastAsiaTheme="minorHAnsi" w:hAnsi="TH Sarabun New" w:cs="TH Sarabun New"/>
-          <w:sz w:val="32"/>
-          <w:szCs w:val="32"/>
-          <w:cs/>
-        </w:rPr>
-        <w:t xml:space="preserve">                 ({{title}}{{applicant_name}})</w:t>
-      </w:r>
-    </w:p>
-    <w:p>
-      <w:pPr>
-        <w:spacing w:after="0" w:line="240" w:lineRule="auto"/>
-        <w:ind w:left="2160" w:firstLine="720"/>
+        <w:jc w:val="center"/>
+        <w:rPr>
+          <w:rFonts w:ascii="TH Sarabun New" w:hAnsi="TH Sarabun New" w:cs="TH Sarabun New"/>
+          <w:sz w:val="32"/>
+          <w:szCs w:val="32"/>
+        </w:rPr>
+      </w:pPr>
+      <w:r>
+        <w:rPr>
+          <w:rFonts w:ascii="TH Sarabun New" w:eastAsiaTheme="minorHAnsi" w:hAnsi="TH Sarabun New" w:cs="TH Sarabun New"/>
+          <w:sz w:val="32"/>
+          <w:szCs w:val="32"/>
+          <w:cs/>
+        </w:rPr>
+        <w:t>({{title}}{{applicant_name}})</w:t>
+      </w:r>
+    </w:p>
+    <w:p>
+      <w:pPr>
+        <w:spacing w:after="0" w:line="240" w:lineRule="auto"/>
+        <w:ind w:left="1440" w:firstLine="720"/>
+        <w:jc w:val="center"/>
         <w:rPr>
           <w:rFonts w:ascii="TH Sarabun New" w:hAnsi="TH Sarabun New" w:cs="TH Sarabun New"/>
           <w:sz w:val="32"/>
@@ -3288,21 +3327,22 @@
     <w:p>
       <w:pPr>
         <w:spacing w:after="0" w:line="240" w:lineRule="auto"/>
-        <w:ind w:left="2160" w:firstLine="720"/>
-        <w:rPr>
-          <w:rFonts w:ascii="TH Sarabun New" w:eastAsiaTheme="minorHAnsi" w:hAnsi="TH Sarabun New" w:cs="TH Sarabun New"/>
-          <w:sz w:val="32"/>
-          <w:szCs w:val="32"/>
-        </w:rPr>
-      </w:pPr>
-      <w:r>
-        <w:rPr>
-          <w:rFonts w:ascii="TH Sarabun New" w:eastAsiaTheme="minorHAnsi" w:hAnsi="TH Sarabun New" w:cs="TH Sarabun New"/>
-          <w:sz w:val="32"/>
-          <w:szCs w:val="32"/>
-          <w:cs/>
-        </w:rPr>
-        <w:t xml:space="preserve">     วันที่ {{sign_date}}</w:t>
+        <w:ind w:left="1440" w:firstLine="720"/>
+        <w:jc w:val="center"/>
+        <w:rPr>
+          <w:rFonts w:ascii="TH Sarabun New" w:hAnsi="TH Sarabun New" w:cs="TH Sarabun New"/>
+          <w:sz w:val="32"/>
+          <w:szCs w:val="32"/>
+        </w:rPr>
+      </w:pPr>
+      <w:r>
+        <w:rPr>
+          <w:rFonts w:ascii="TH Sarabun New" w:eastAsiaTheme="minorHAnsi" w:hAnsi="TH Sarabun New" w:cs="TH Sarabun New"/>
+          <w:sz w:val="32"/>
+          <w:szCs w:val="32"/>
+          <w:cs/>
+        </w:rPr>
+        <w:t>วันที่ {{sign_date}}</w:t>
       </w:r>
     </w:p>
     <w:p>
@@ -3670,7 +3710,7 @@
           <w:szCs w:val="32"/>
           <w:cs/>
         </w:rPr>
-        <w:t>ตำแหน่ง..ผู้บังคับบัญชาระดับหัวหน้าภาควิชาหรือเทียบเท่า..</w:t>
+        <w:t>ตำแหน่ง {{head_position_line}}</w:t>
       </w:r>
     </w:p>
     <w:p>
@@ -3850,7 +3890,7 @@
           <w:szCs w:val="32"/>
           <w:cs/>
         </w:rPr>
-        <w:t xml:space="preserve">ตำแหน่ง {{dean_position_line}}</w:t>
+        <w:t>ตำแหน่ง {{dean_position_line}}</w:t>
       </w:r>
     </w:p>
     <w:p>
@@ -3885,13 +3925,13 @@
     </w:p>
     <w:p>
       <w:pPr>
-        <w:spacing w:after="0" w:line="240" w:lineRule="auto"/>
-        <w:rPr>
-          <w:rFonts w:ascii="TH Sarabun New" w:hAnsi="TH Sarabun New" w:cs="TH Sarabun New"/>
+        <w:rPr>
+          <w:rFonts w:ascii="TH Sarabun New" w:eastAsiaTheme="minorHAnsi" w:hAnsi="TH Sarabun New" w:cs="TH Sarabun New"/>
           <w:b/>
           <w:bCs/>
           <w:sz w:val="32"/>
           <w:szCs w:val="32"/>
+          <w:cs/>
         </w:rPr>
       </w:pPr>
       <w:r>
@@ -3903,19 +3943,20 @@
           <w:szCs w:val="32"/>
           <w:cs/>
         </w:rPr>
-        <w:t>ส่วนที่</w:t>
-      </w:r>
-      <w:r>
-        <w:rPr>
-          <w:rFonts w:ascii="TH Sarabun New" w:eastAsiaTheme="minorHAnsi" w:hAnsi="TH Sarabun New" w:cs="TH Sarabun New"/>
+        <w:br w:type="page"/>
+      </w:r>
+    </w:p>
+    <w:p>
+      <w:pPr>
+        <w:spacing w:after="0" w:line="240" w:lineRule="auto"/>
+        <w:rPr>
+          <w:rFonts w:ascii="TH Sarabun New" w:hAnsi="TH Sarabun New" w:cs="TH Sarabun New"/>
           <w:b/>
           <w:bCs/>
           <w:sz w:val="32"/>
           <w:szCs w:val="32"/>
-          <w:cs/>
-        </w:rPr>
-        <w:t xml:space="preserve"> </w:t>
-      </w:r>
+        </w:rPr>
+      </w:pPr>
       <w:r>
         <w:rPr>
           <w:rFonts w:ascii="TH Sarabun New" w:eastAsiaTheme="minorHAnsi" w:hAnsi="TH Sarabun New" w:cs="TH Sarabun New"/>
@@ -3925,7 +3966,8 @@
           <w:szCs w:val="32"/>
           <w:cs/>
         </w:rPr>
-        <w:t>๓</w:t>
+        <w:lastRenderedPageBreak/>
+        <w:t>ส่วนที่</w:t>
       </w:r>
       <w:r>
         <w:rPr>
@@ -3936,6 +3978,28 @@
           <w:szCs w:val="32"/>
           <w:cs/>
         </w:rPr>
+        <w:t xml:space="preserve"> </w:t>
+      </w:r>
+      <w:r>
+        <w:rPr>
+          <w:rFonts w:ascii="TH Sarabun New" w:eastAsiaTheme="minorHAnsi" w:hAnsi="TH Sarabun New" w:cs="TH Sarabun New"/>
+          <w:b/>
+          <w:bCs/>
+          <w:sz w:val="32"/>
+          <w:szCs w:val="32"/>
+          <w:cs/>
+        </w:rPr>
+        <w:t>๓</w:t>
+      </w:r>
+      <w:r>
+        <w:rPr>
+          <w:rFonts w:ascii="TH Sarabun New" w:eastAsiaTheme="minorHAnsi" w:hAnsi="TH Sarabun New" w:cs="TH Sarabun New"/>
+          <w:b/>
+          <w:bCs/>
+          <w:sz w:val="32"/>
+          <w:szCs w:val="32"/>
+          <w:cs/>
+        </w:rPr>
         <w:tab/>
         <w:t xml:space="preserve"> แบบประเมินผลการสอน</w:t>
       </w:r>
@@ -3957,7 +4021,15 @@
           <w:szCs w:val="32"/>
           <w:cs/>
         </w:rPr>
-        <w:lastRenderedPageBreak/>
+        <w:tab/>
+      </w:r>
+      <w:r>
+        <w:rPr>
+          <w:rFonts w:ascii="TH Sarabun New" w:eastAsiaTheme="minorHAnsi" w:hAnsi="TH Sarabun New" w:cs="TH Sarabun New"/>
+          <w:sz w:val="32"/>
+          <w:szCs w:val="32"/>
+          <w:cs/>
+        </w:rPr>
         <w:t>คณะอนุกรรมการเพื่อประเมินผลการสอน ในการประชุมครั้งที่ {{s3_meeting_no}} เมื่อวันที่ {{s3_meeting_date}} ซึ่งได้รับมอบอำนาจจากคณะกรรมการพิจารณาตำแหน่งทางวิชาการ {{s3_university}} ได้ประเมินผลการสอนรหัสวิชา {{s3_course_code}} รายวิชา {{s3_course_name}} ของ {{title}}{{applicant_name}} แล้วเห็นว่า บุคคลดังกล่าวเป็นผู้มีความ{{s3_level}} ในการสอนมีคุณภาพ{{s3_quality}}ในหลักเกณฑ์และวิธีการตามที่มหาวิทยาลัยกำหนด</w:t>
       </w:r>
     </w:p>

</xml_diff>